<commit_message>
fixing(reportApp):- fixing the summary filtering issue by year,quater,sector,division  based on the users RBAC
</commit_message>
<xml_diff>
--- a/backend/media/documents/2018_year_ኢትዮጵያ_አርቴፊሻል_ኢንተለጀንስ_ኢንስቲትዩት_report.docx
+++ b/backend/media/documents/2018_year_ኢትዮጵያ_አርቴፊሻል_ኢንተለጀንስ_ኢንስቲትዩት_report.docx
@@ -9,7 +9,7 @@
       <w:r>
         <w:drawing>
           <wp:inline xmlns:a="http://schemas.openxmlformats.org/drawingml/2006/main" xmlns:pic="http://schemas.openxmlformats.org/drawingml/2006/picture">
-            <wp:extent cx="1828800" cy="2438400"/>
+            <wp:extent cx="1828800" cy="1129792"/>
             <wp:docPr id="1" name="Picture 1"/>
             <wp:cNvGraphicFramePr>
               <a:graphicFrameLocks noChangeAspect="1"/>
@@ -18,7 +18,7 @@
               <a:graphicData uri="http://schemas.openxmlformats.org/drawingml/2006/picture">
                 <pic:pic>
                   <pic:nvPicPr>
-                    <pic:cNvPr id="0" name="b9a1242ebddb4c3804a6e4fd7396317b0c585057_lyYtGwa.png"/>
+                    <pic:cNvPr id="0" name="download.jpeg"/>
                     <pic:cNvPicPr/>
                   </pic:nvPicPr>
                   <pic:blipFill>
@@ -30,7 +30,7 @@
                   <pic:spPr>
                     <a:xfrm>
                       <a:off x="0" y="0"/>
-                      <a:ext cx="1828800" cy="2438400"/>
+                      <a:ext cx="1828800" cy="1129792"/>
                     </a:xfrm>
                     <a:prstGeom prst="rect"/>
                   </pic:spPr>
@@ -52,7 +52,26 @@
           <w:b/>
           <w:sz w:val="28"/>
         </w:rPr>
-        <w:t>ኢትዮጵያ አርቴፊሻል ኢንተለጀንስ ኢንስቲትዩት የ 2018 በጀት ዓመት ዓመታዊ የልማት ዕቅድ አፈፃፀም ሪፖርት</w:t>
+        <w:t>ኢትዮጵያ አርቴፊሻል ኢንተለጀንስ ኢንስቲትዩት  የ 2018 በጀት ዓመት ዓመታዊ አፈፃፀም ሪፖርት</w:t>
+      </w:r>
+    </w:p>
+    <w:p>
+      <w:r>
+        <w:br w:type="page"/>
+      </w:r>
+    </w:p>
+    <w:p>
+      <w:pPr>
+        <w:spacing w:lineRule="auto" w:line="276" w:after="240" w:before="0"/>
+        <w:jc w:val="left"/>
+      </w:pPr>
+      <w:r>
+        <w:rPr>
+          <w:rFonts w:ascii="Ebrima" w:hAnsi="Ebrima" w:eastAsia="Ebrima" w:cs="Ebrima"/>
+          <w:b/>
+          <w:sz w:val="28"/>
+        </w:rPr>
+        <w:t>የስራ አፈፃፀም መግለጫዎች</w:t>
       </w:r>
     </w:p>
     <w:p>
@@ -65,7 +84,7 @@
         <w:jc w:val="center"/>
       </w:pPr>
       <w:r>
-        <w:t xml:space="preserve"> የ 2018 በጀት ዓመት   የ አ ር ቴ ፊ ሻ ል   ኢ ን ተ ል ጀ ን ስ   ኢ ን ስ ቲ ት ዩ ት  የዋና ዋና ግቦች አፈጻጸም </w:t>
+        <w:t>የ 2018 በጀት ዓመት ዓመታዊ የ ኢትዮጵያ አርቴፊሻል ኢንተለጀንስ ኢንስቲትዩት  የስራ አፈፃፀም</w:t>
       </w:r>
     </w:p>
     <w:tbl>
@@ -99,7 +118,7 @@
                 <w:b/>
                 <w:color w:val="FFBC14"/>
               </w:rPr>
-              <w:t xml:space="preserve">ተ.ቁ </w:t>
+              <w:t>ተ.ቁ</w:t>
             </w:r>
           </w:p>
         </w:tc>
@@ -117,7 +136,7 @@
                 <w:b/>
                 <w:color w:val="FFBC14"/>
               </w:rPr>
-              <w:t xml:space="preserve">ስትራቴጂክ ግቦች፣ ዋና ዋና ተግባራት እና ዝርዝር ቁልፍ የአፈፃፀም አመልካቾች </w:t>
+              <w:t>ስትራተጂክ ፍጣች፣ ስራ ስራ ተግባራት እና ውጤት ሑለት የአፈፃፀም አመልካቶች</w:t>
             </w:r>
           </w:p>
         </w:tc>
@@ -135,13 +154,15 @@
                 <w:b/>
                 <w:color w:val="FFBC14"/>
               </w:rPr>
-              <w:t>መለክያ</w:t>
-            </w:r>
-          </w:p>
-        </w:tc>
-        <w:tc>
-          <w:tcPr>
-            <w:tcW w:type="dxa" w:w="1234"/>
+              <w:t>መለኪያ</w:t>
+            </w:r>
+          </w:p>
+        </w:tc>
+        <w:tc>
+          <w:tcPr>
+            <w:tcW w:type="dxa" w:w="1234"/>
+            <w:vMerge w:val="restart"/>
+            <w:shd w:fill="110d7c"/>
             <w:shd w:fill="110d7c"/>
           </w:tcPr>
           <w:p>
@@ -151,7 +172,7 @@
                 <w:b/>
                 <w:color w:val="FFBC14"/>
               </w:rPr>
-              <w:t xml:space="preserve">እስከ 2017 አፈጻጸም መነሻ </w:t>
+              <w:t>እስከ 2017 አፈፃፀም መንሻ</w:t>
             </w:r>
           </w:p>
         </w:tc>
@@ -170,7 +191,7 @@
                 <w:b/>
                 <w:color w:val="FFBC14"/>
               </w:rPr>
-              <w:t xml:space="preserve"> የ 2018 በጀት ዓመት   የዋና ዋና ግቦች አፈጻጸም </w:t>
+              <w:t>የ 2018 በጀት ዓመት ዓመታዊ የስራ  አፈፃፀም</w:t>
             </w:r>
           </w:p>
         </w:tc>
@@ -200,7 +221,7 @@
         <w:tc>
           <w:tcPr>
             <w:tcW w:type="dxa" w:w="1234"/>
-            <w:shd w:fill="110d7c"/>
+            <w:vMerge/>
           </w:tcPr>
           <w:p/>
         </w:tc>
@@ -216,7 +237,7 @@
                 <w:b/>
                 <w:color w:val="FFBC14"/>
               </w:rPr>
-              <w:t xml:space="preserve">ግብ </w:t>
+              <w:t>ፈፅብ</w:t>
             </w:r>
           </w:p>
         </w:tc>
@@ -232,7 +253,7 @@
                 <w:b/>
                 <w:color w:val="FFBC14"/>
               </w:rPr>
-              <w:t>አፈጻጸም</w:t>
+              <w:t>አፈፃፀም</w:t>
             </w:r>
           </w:p>
         </w:tc>
@@ -248,7 +269,7 @@
                 <w:b/>
                 <w:color w:val="FFBC14"/>
               </w:rPr>
-              <w:t>አፈጻጸም በመቶኛ</w:t>
+              <w:t>አፈፃፀም በመቶኛ</w:t>
             </w:r>
           </w:p>
         </w:tc>
@@ -327,7 +348,7 @@
               <w:rPr>
                 <w:rFonts w:ascii="Ebrima" w:hAnsi="Ebrima"/>
               </w:rPr>
-              <w:t>1.1.4</w:t>
+              <w:t>1.1.1</w:t>
             </w:r>
           </w:p>
         </w:tc>
@@ -366,33 +387,33 @@
               <w:rPr>
                 <w:rFonts w:ascii="Ebrima" w:hAnsi="Ebrima"/>
               </w:rPr>
-              <w:t xml:space="preserve">6.0 </w:t>
-            </w:r>
-          </w:p>
-        </w:tc>
-        <w:tc>
-          <w:tcPr>
-            <w:tcW w:type="dxa" w:w="1234"/>
-          </w:tcPr>
-          <w:p>
-            <w:r>
-              <w:rPr>
-                <w:rFonts w:ascii="Ebrima" w:hAnsi="Ebrima"/>
-              </w:rPr>
-              <w:t xml:space="preserve">1.0 </w:t>
-            </w:r>
-          </w:p>
-        </w:tc>
-        <w:tc>
-          <w:tcPr>
-            <w:tcW w:type="dxa" w:w="1234"/>
-          </w:tcPr>
-          <w:p>
-            <w:r>
-              <w:rPr>
-                <w:rFonts w:ascii="Ebrima" w:hAnsi="Ebrima"/>
-              </w:rPr>
-              <w:t xml:space="preserve">7.0 </w:t>
+              <w:t>6.0</w:t>
+            </w:r>
+          </w:p>
+        </w:tc>
+        <w:tc>
+          <w:tcPr>
+            <w:tcW w:type="dxa" w:w="1234"/>
+          </w:tcPr>
+          <w:p>
+            <w:r>
+              <w:rPr>
+                <w:rFonts w:ascii="Ebrima" w:hAnsi="Ebrima"/>
+              </w:rPr>
+              <w:t>1.0</w:t>
+            </w:r>
+          </w:p>
+        </w:tc>
+        <w:tc>
+          <w:tcPr>
+            <w:tcW w:type="dxa" w:w="1234"/>
+          </w:tcPr>
+          <w:p>
+            <w:r>
+              <w:rPr>
+                <w:rFonts w:ascii="Ebrima" w:hAnsi="Ebrima"/>
+              </w:rPr>
+              <w:t>7.0</w:t>
             </w:r>
           </w:p>
         </w:tc>
@@ -420,7 +441,7 @@
               <w:rPr>
                 <w:rFonts w:ascii="Ebrima" w:hAnsi="Ebrima"/>
               </w:rPr>
-              <w:t>1.1.4</w:t>
+              <w:t>1.1.2</w:t>
             </w:r>
           </w:p>
         </w:tc>
@@ -459,33 +480,33 @@
               <w:rPr>
                 <w:rFonts w:ascii="Ebrima" w:hAnsi="Ebrima"/>
               </w:rPr>
-              <w:t xml:space="preserve">46.0 </w:t>
-            </w:r>
-          </w:p>
-        </w:tc>
-        <w:tc>
-          <w:tcPr>
-            <w:tcW w:type="dxa" w:w="1234"/>
-          </w:tcPr>
-          <w:p>
-            <w:r>
-              <w:rPr>
-                <w:rFonts w:ascii="Ebrima" w:hAnsi="Ebrima"/>
-              </w:rPr>
-              <w:t xml:space="preserve">10.0 </w:t>
-            </w:r>
-          </w:p>
-        </w:tc>
-        <w:tc>
-          <w:tcPr>
-            <w:tcW w:type="dxa" w:w="1234"/>
-          </w:tcPr>
-          <w:p>
-            <w:r>
-              <w:rPr>
-                <w:rFonts w:ascii="Ebrima" w:hAnsi="Ebrima"/>
-              </w:rPr>
-              <w:t xml:space="preserve">22.0 </w:t>
+              <w:t>46.0</w:t>
+            </w:r>
+          </w:p>
+        </w:tc>
+        <w:tc>
+          <w:tcPr>
+            <w:tcW w:type="dxa" w:w="1234"/>
+          </w:tcPr>
+          <w:p>
+            <w:r>
+              <w:rPr>
+                <w:rFonts w:ascii="Ebrima" w:hAnsi="Ebrima"/>
+              </w:rPr>
+              <w:t>10.0</w:t>
+            </w:r>
+          </w:p>
+        </w:tc>
+        <w:tc>
+          <w:tcPr>
+            <w:tcW w:type="dxa" w:w="1234"/>
+          </w:tcPr>
+          <w:p>
+            <w:r>
+              <w:rPr>
+                <w:rFonts w:ascii="Ebrima" w:hAnsi="Ebrima"/>
+              </w:rPr>
+              <w:t>22.0</w:t>
             </w:r>
           </w:p>
         </w:tc>
@@ -513,7 +534,7 @@
               <w:rPr>
                 <w:rFonts w:ascii="Ebrima" w:hAnsi="Ebrima"/>
               </w:rPr>
-              <w:t>1.1.4</w:t>
+              <w:t>1.1.3</w:t>
             </w:r>
           </w:p>
         </w:tc>
@@ -552,33 +573,33 @@
               <w:rPr>
                 <w:rFonts w:ascii="Ebrima" w:hAnsi="Ebrima"/>
               </w:rPr>
-              <w:t xml:space="preserve">46.0 </w:t>
-            </w:r>
-          </w:p>
-        </w:tc>
-        <w:tc>
-          <w:tcPr>
-            <w:tcW w:type="dxa" w:w="1234"/>
-          </w:tcPr>
-          <w:p>
-            <w:r>
-              <w:rPr>
-                <w:rFonts w:ascii="Ebrima" w:hAnsi="Ebrima"/>
-              </w:rPr>
-              <w:t xml:space="preserve">10.0 </w:t>
-            </w:r>
-          </w:p>
-        </w:tc>
-        <w:tc>
-          <w:tcPr>
-            <w:tcW w:type="dxa" w:w="1234"/>
-          </w:tcPr>
-          <w:p>
-            <w:r>
-              <w:rPr>
-                <w:rFonts w:ascii="Ebrima" w:hAnsi="Ebrima"/>
-              </w:rPr>
-              <w:t xml:space="preserve">0.0 </w:t>
+              <w:t>46.0</w:t>
+            </w:r>
+          </w:p>
+        </w:tc>
+        <w:tc>
+          <w:tcPr>
+            <w:tcW w:type="dxa" w:w="1234"/>
+          </w:tcPr>
+          <w:p>
+            <w:r>
+              <w:rPr>
+                <w:rFonts w:ascii="Ebrima" w:hAnsi="Ebrima"/>
+              </w:rPr>
+              <w:t>10.0</w:t>
+            </w:r>
+          </w:p>
+        </w:tc>
+        <w:tc>
+          <w:tcPr>
+            <w:tcW w:type="dxa" w:w="1234"/>
+          </w:tcPr>
+          <w:p>
+            <w:r>
+              <w:rPr>
+                <w:rFonts w:ascii="Ebrima" w:hAnsi="Ebrima"/>
+              </w:rPr>
+              <w:t>0.0</w:t>
             </w:r>
           </w:p>
         </w:tc>
@@ -645,33 +666,33 @@
               <w:rPr>
                 <w:rFonts w:ascii="Ebrima" w:hAnsi="Ebrima"/>
               </w:rPr>
-              <w:t xml:space="preserve">46.0 </w:t>
-            </w:r>
-          </w:p>
-        </w:tc>
-        <w:tc>
-          <w:tcPr>
-            <w:tcW w:type="dxa" w:w="1234"/>
-          </w:tcPr>
-          <w:p>
-            <w:r>
-              <w:rPr>
-                <w:rFonts w:ascii="Ebrima" w:hAnsi="Ebrima"/>
-              </w:rPr>
-              <w:t xml:space="preserve">10.0 </w:t>
-            </w:r>
-          </w:p>
-        </w:tc>
-        <w:tc>
-          <w:tcPr>
-            <w:tcW w:type="dxa" w:w="1234"/>
-          </w:tcPr>
-          <w:p>
-            <w:r>
-              <w:rPr>
-                <w:rFonts w:ascii="Ebrima" w:hAnsi="Ebrima"/>
-              </w:rPr>
-              <w:t xml:space="preserve">0.0 </w:t>
+              <w:t>46.0</w:t>
+            </w:r>
+          </w:p>
+        </w:tc>
+        <w:tc>
+          <w:tcPr>
+            <w:tcW w:type="dxa" w:w="1234"/>
+          </w:tcPr>
+          <w:p>
+            <w:r>
+              <w:rPr>
+                <w:rFonts w:ascii="Ebrima" w:hAnsi="Ebrima"/>
+              </w:rPr>
+              <w:t>10.0</w:t>
+            </w:r>
+          </w:p>
+        </w:tc>
+        <w:tc>
+          <w:tcPr>
+            <w:tcW w:type="dxa" w:w="1234"/>
+          </w:tcPr>
+          <w:p>
+            <w:r>
+              <w:rPr>
+                <w:rFonts w:ascii="Ebrima" w:hAnsi="Ebrima"/>
+              </w:rPr>
+              <w:t>0.0</w:t>
             </w:r>
           </w:p>
         </w:tc>
@@ -699,7 +720,7 @@
               <w:rPr>
                 <w:rFonts w:ascii="Ebrima" w:hAnsi="Ebrima"/>
               </w:rPr>
-              <w:t>1.1.4</w:t>
+              <w:t>1.1.5</w:t>
             </w:r>
           </w:p>
         </w:tc>
@@ -792,7 +813,7 @@
               <w:rPr>
                 <w:rFonts w:ascii="Ebrima" w:hAnsi="Ebrima"/>
               </w:rPr>
-              <w:t>1.1.4</w:t>
+              <w:t>1.1.6</w:t>
             </w:r>
           </w:p>
         </w:tc>
@@ -831,33 +852,33 @@
               <w:rPr>
                 <w:rFonts w:ascii="Ebrima" w:hAnsi="Ebrima"/>
               </w:rPr>
-              <w:t xml:space="preserve">14.0 </w:t>
-            </w:r>
-          </w:p>
-        </w:tc>
-        <w:tc>
-          <w:tcPr>
-            <w:tcW w:type="dxa" w:w="1234"/>
-          </w:tcPr>
-          <w:p>
-            <w:r>
-              <w:rPr>
-                <w:rFonts w:ascii="Ebrima" w:hAnsi="Ebrima"/>
-              </w:rPr>
-              <w:t xml:space="preserve">8.0 </w:t>
-            </w:r>
-          </w:p>
-        </w:tc>
-        <w:tc>
-          <w:tcPr>
-            <w:tcW w:type="dxa" w:w="1234"/>
-          </w:tcPr>
-          <w:p>
-            <w:r>
-              <w:rPr>
-                <w:rFonts w:ascii="Ebrima" w:hAnsi="Ebrima"/>
-              </w:rPr>
-              <w:t xml:space="preserve">0.0 </w:t>
+              <w:t>14.0</w:t>
+            </w:r>
+          </w:p>
+        </w:tc>
+        <w:tc>
+          <w:tcPr>
+            <w:tcW w:type="dxa" w:w="1234"/>
+          </w:tcPr>
+          <w:p>
+            <w:r>
+              <w:rPr>
+                <w:rFonts w:ascii="Ebrima" w:hAnsi="Ebrima"/>
+              </w:rPr>
+              <w:t>8.0</w:t>
+            </w:r>
+          </w:p>
+        </w:tc>
+        <w:tc>
+          <w:tcPr>
+            <w:tcW w:type="dxa" w:w="1234"/>
+          </w:tcPr>
+          <w:p>
+            <w:r>
+              <w:rPr>
+                <w:rFonts w:ascii="Ebrima" w:hAnsi="Ebrima"/>
+              </w:rPr>
+              <w:t>0.0</w:t>
             </w:r>
           </w:p>
         </w:tc>
@@ -885,7 +906,7 @@
               <w:rPr>
                 <w:rFonts w:ascii="Ebrima" w:hAnsi="Ebrima"/>
               </w:rPr>
-              <w:t>1.1.4</w:t>
+              <w:t>1.1.7</w:t>
             </w:r>
           </w:p>
         </w:tc>
@@ -924,33 +945,33 @@
               <w:rPr>
                 <w:rFonts w:ascii="Ebrima" w:hAnsi="Ebrima"/>
               </w:rPr>
-              <w:t xml:space="preserve">2.0 </w:t>
-            </w:r>
-          </w:p>
-        </w:tc>
-        <w:tc>
-          <w:tcPr>
-            <w:tcW w:type="dxa" w:w="1234"/>
-          </w:tcPr>
-          <w:p>
-            <w:r>
-              <w:rPr>
-                <w:rFonts w:ascii="Ebrima" w:hAnsi="Ebrima"/>
-              </w:rPr>
-              <w:t xml:space="preserve">4.0 </w:t>
-            </w:r>
-          </w:p>
-        </w:tc>
-        <w:tc>
-          <w:tcPr>
-            <w:tcW w:type="dxa" w:w="1234"/>
-          </w:tcPr>
-          <w:p>
-            <w:r>
-              <w:rPr>
-                <w:rFonts w:ascii="Ebrima" w:hAnsi="Ebrima"/>
-              </w:rPr>
-              <w:t xml:space="preserve">0.0 </w:t>
+              <w:t>2.0</w:t>
+            </w:r>
+          </w:p>
+        </w:tc>
+        <w:tc>
+          <w:tcPr>
+            <w:tcW w:type="dxa" w:w="1234"/>
+          </w:tcPr>
+          <w:p>
+            <w:r>
+              <w:rPr>
+                <w:rFonts w:ascii="Ebrima" w:hAnsi="Ebrima"/>
+              </w:rPr>
+              <w:t>4.0</w:t>
+            </w:r>
+          </w:p>
+        </w:tc>
+        <w:tc>
+          <w:tcPr>
+            <w:tcW w:type="dxa" w:w="1234"/>
+          </w:tcPr>
+          <w:p>
+            <w:r>
+              <w:rPr>
+                <w:rFonts w:ascii="Ebrima" w:hAnsi="Ebrima"/>
+              </w:rPr>
+              <w:t>0.0</w:t>
             </w:r>
           </w:p>
         </w:tc>
@@ -1009,7 +1030,7 @@
               <w:rPr>
                 <w:rFonts w:ascii="Ebrima" w:hAnsi="Ebrima"/>
               </w:rPr>
-              <w:t>1.2.4</w:t>
+              <w:t>1.2.1</w:t>
             </w:r>
           </w:p>
         </w:tc>
@@ -1048,33 +1069,33 @@
               <w:rPr>
                 <w:rFonts w:ascii="Ebrima" w:hAnsi="Ebrima"/>
               </w:rPr>
-              <w:t xml:space="preserve">4.0 </w:t>
-            </w:r>
-          </w:p>
-        </w:tc>
-        <w:tc>
-          <w:tcPr>
-            <w:tcW w:type="dxa" w:w="1234"/>
-          </w:tcPr>
-          <w:p>
-            <w:r>
-              <w:rPr>
-                <w:rFonts w:ascii="Ebrima" w:hAnsi="Ebrima"/>
-              </w:rPr>
-              <w:t xml:space="preserve">4.0 </w:t>
-            </w:r>
-          </w:p>
-        </w:tc>
-        <w:tc>
-          <w:tcPr>
-            <w:tcW w:type="dxa" w:w="1234"/>
-          </w:tcPr>
-          <w:p>
-            <w:r>
-              <w:rPr>
-                <w:rFonts w:ascii="Ebrima" w:hAnsi="Ebrima"/>
-              </w:rPr>
-              <w:t xml:space="preserve">0.0 </w:t>
+              <w:t>4.0</w:t>
+            </w:r>
+          </w:p>
+        </w:tc>
+        <w:tc>
+          <w:tcPr>
+            <w:tcW w:type="dxa" w:w="1234"/>
+          </w:tcPr>
+          <w:p>
+            <w:r>
+              <w:rPr>
+                <w:rFonts w:ascii="Ebrima" w:hAnsi="Ebrima"/>
+              </w:rPr>
+              <w:t>4.0</w:t>
+            </w:r>
+          </w:p>
+        </w:tc>
+        <w:tc>
+          <w:tcPr>
+            <w:tcW w:type="dxa" w:w="1234"/>
+          </w:tcPr>
+          <w:p>
+            <w:r>
+              <w:rPr>
+                <w:rFonts w:ascii="Ebrima" w:hAnsi="Ebrima"/>
+              </w:rPr>
+              <w:t>0.0</w:t>
             </w:r>
           </w:p>
         </w:tc>
@@ -1102,7 +1123,7 @@
               <w:rPr>
                 <w:rFonts w:ascii="Ebrima" w:hAnsi="Ebrima"/>
               </w:rPr>
-              <w:t>1.2.4</w:t>
+              <w:t>1.2.2</w:t>
             </w:r>
           </w:p>
         </w:tc>
@@ -1141,33 +1162,33 @@
               <w:rPr>
                 <w:rFonts w:ascii="Ebrima" w:hAnsi="Ebrima"/>
               </w:rPr>
-              <w:t xml:space="preserve">4.0 </w:t>
-            </w:r>
-          </w:p>
-        </w:tc>
-        <w:tc>
-          <w:tcPr>
-            <w:tcW w:type="dxa" w:w="1234"/>
-          </w:tcPr>
-          <w:p>
-            <w:r>
-              <w:rPr>
-                <w:rFonts w:ascii="Ebrima" w:hAnsi="Ebrima"/>
-              </w:rPr>
-              <w:t xml:space="preserve">4.0 </w:t>
-            </w:r>
-          </w:p>
-        </w:tc>
-        <w:tc>
-          <w:tcPr>
-            <w:tcW w:type="dxa" w:w="1234"/>
-          </w:tcPr>
-          <w:p>
-            <w:r>
-              <w:rPr>
-                <w:rFonts w:ascii="Ebrima" w:hAnsi="Ebrima"/>
-              </w:rPr>
-              <w:t xml:space="preserve">0.0 </w:t>
+              <w:t>4.0</w:t>
+            </w:r>
+          </w:p>
+        </w:tc>
+        <w:tc>
+          <w:tcPr>
+            <w:tcW w:type="dxa" w:w="1234"/>
+          </w:tcPr>
+          <w:p>
+            <w:r>
+              <w:rPr>
+                <w:rFonts w:ascii="Ebrima" w:hAnsi="Ebrima"/>
+              </w:rPr>
+              <w:t>4.0</w:t>
+            </w:r>
+          </w:p>
+        </w:tc>
+        <w:tc>
+          <w:tcPr>
+            <w:tcW w:type="dxa" w:w="1234"/>
+          </w:tcPr>
+          <w:p>
+            <w:r>
+              <w:rPr>
+                <w:rFonts w:ascii="Ebrima" w:hAnsi="Ebrima"/>
+              </w:rPr>
+              <w:t>0.0</w:t>
             </w:r>
           </w:p>
         </w:tc>
@@ -1226,7 +1247,7 @@
               <w:rPr>
                 <w:rFonts w:ascii="Ebrima" w:hAnsi="Ebrima"/>
               </w:rPr>
-              <w:t>1.3.4</w:t>
+              <w:t>1.3.1</w:t>
             </w:r>
           </w:p>
         </w:tc>
@@ -1265,33 +1286,33 @@
               <w:rPr>
                 <w:rFonts w:ascii="Ebrima" w:hAnsi="Ebrima"/>
               </w:rPr>
-              <w:t xml:space="preserve">0.0 </w:t>
-            </w:r>
-          </w:p>
-        </w:tc>
-        <w:tc>
-          <w:tcPr>
-            <w:tcW w:type="dxa" w:w="1234"/>
-          </w:tcPr>
-          <w:p>
-            <w:r>
-              <w:rPr>
-                <w:rFonts w:ascii="Ebrima" w:hAnsi="Ebrima"/>
-              </w:rPr>
-              <w:t xml:space="preserve">1.0 </w:t>
-            </w:r>
-          </w:p>
-        </w:tc>
-        <w:tc>
-          <w:tcPr>
-            <w:tcW w:type="dxa" w:w="1234"/>
-          </w:tcPr>
-          <w:p>
-            <w:r>
-              <w:rPr>
-                <w:rFonts w:ascii="Ebrima" w:hAnsi="Ebrima"/>
-              </w:rPr>
-              <w:t xml:space="preserve">0.0 </w:t>
+              <w:t>0.0</w:t>
+            </w:r>
+          </w:p>
+        </w:tc>
+        <w:tc>
+          <w:tcPr>
+            <w:tcW w:type="dxa" w:w="1234"/>
+          </w:tcPr>
+          <w:p>
+            <w:r>
+              <w:rPr>
+                <w:rFonts w:ascii="Ebrima" w:hAnsi="Ebrima"/>
+              </w:rPr>
+              <w:t>1.0</w:t>
+            </w:r>
+          </w:p>
+        </w:tc>
+        <w:tc>
+          <w:tcPr>
+            <w:tcW w:type="dxa" w:w="1234"/>
+          </w:tcPr>
+          <w:p>
+            <w:r>
+              <w:rPr>
+                <w:rFonts w:ascii="Ebrima" w:hAnsi="Ebrima"/>
+              </w:rPr>
+              <w:t>0.0</w:t>
             </w:r>
           </w:p>
         </w:tc>
@@ -1319,7 +1340,7 @@
               <w:rPr>
                 <w:rFonts w:ascii="Ebrima" w:hAnsi="Ebrima"/>
               </w:rPr>
-              <w:t>1.3.4</w:t>
+              <w:t>1.3.2</w:t>
             </w:r>
           </w:p>
         </w:tc>
@@ -1358,33 +1379,33 @@
               <w:rPr>
                 <w:rFonts w:ascii="Ebrima" w:hAnsi="Ebrima"/>
               </w:rPr>
-              <w:t xml:space="preserve">0.0 </w:t>
-            </w:r>
-          </w:p>
-        </w:tc>
-        <w:tc>
-          <w:tcPr>
-            <w:tcW w:type="dxa" w:w="1234"/>
-          </w:tcPr>
-          <w:p>
-            <w:r>
-              <w:rPr>
-                <w:rFonts w:ascii="Ebrima" w:hAnsi="Ebrima"/>
-              </w:rPr>
-              <w:t xml:space="preserve">1.0 </w:t>
-            </w:r>
-          </w:p>
-        </w:tc>
-        <w:tc>
-          <w:tcPr>
-            <w:tcW w:type="dxa" w:w="1234"/>
-          </w:tcPr>
-          <w:p>
-            <w:r>
-              <w:rPr>
-                <w:rFonts w:ascii="Ebrima" w:hAnsi="Ebrima"/>
-              </w:rPr>
-              <w:t xml:space="preserve">0.0 </w:t>
+              <w:t>0.0</w:t>
+            </w:r>
+          </w:p>
+        </w:tc>
+        <w:tc>
+          <w:tcPr>
+            <w:tcW w:type="dxa" w:w="1234"/>
+          </w:tcPr>
+          <w:p>
+            <w:r>
+              <w:rPr>
+                <w:rFonts w:ascii="Ebrima" w:hAnsi="Ebrima"/>
+              </w:rPr>
+              <w:t>1.0</w:t>
+            </w:r>
+          </w:p>
+        </w:tc>
+        <w:tc>
+          <w:tcPr>
+            <w:tcW w:type="dxa" w:w="1234"/>
+          </w:tcPr>
+          <w:p>
+            <w:r>
+              <w:rPr>
+                <w:rFonts w:ascii="Ebrima" w:hAnsi="Ebrima"/>
+              </w:rPr>
+              <w:t>0.0</w:t>
             </w:r>
           </w:p>
         </w:tc>
@@ -1412,7 +1433,7 @@
               <w:rPr>
                 <w:rFonts w:ascii="Ebrima" w:hAnsi="Ebrima"/>
               </w:rPr>
-              <w:t>1.3.4</w:t>
+              <w:t>1.3.3</w:t>
             </w:r>
           </w:p>
         </w:tc>
@@ -1451,33 +1472,33 @@
               <w:rPr>
                 <w:rFonts w:ascii="Ebrima" w:hAnsi="Ebrima"/>
               </w:rPr>
-              <w:t xml:space="preserve">0.0 </w:t>
-            </w:r>
-          </w:p>
-        </w:tc>
-        <w:tc>
-          <w:tcPr>
-            <w:tcW w:type="dxa" w:w="1234"/>
-          </w:tcPr>
-          <w:p>
-            <w:r>
-              <w:rPr>
-                <w:rFonts w:ascii="Ebrima" w:hAnsi="Ebrima"/>
-              </w:rPr>
-              <w:t xml:space="preserve">1.0 </w:t>
-            </w:r>
-          </w:p>
-        </w:tc>
-        <w:tc>
-          <w:tcPr>
-            <w:tcW w:type="dxa" w:w="1234"/>
-          </w:tcPr>
-          <w:p>
-            <w:r>
-              <w:rPr>
-                <w:rFonts w:ascii="Ebrima" w:hAnsi="Ebrima"/>
-              </w:rPr>
-              <w:t xml:space="preserve">0.0 </w:t>
+              <w:t>0.0</w:t>
+            </w:r>
+          </w:p>
+        </w:tc>
+        <w:tc>
+          <w:tcPr>
+            <w:tcW w:type="dxa" w:w="1234"/>
+          </w:tcPr>
+          <w:p>
+            <w:r>
+              <w:rPr>
+                <w:rFonts w:ascii="Ebrima" w:hAnsi="Ebrima"/>
+              </w:rPr>
+              <w:t>1.0</w:t>
+            </w:r>
+          </w:p>
+        </w:tc>
+        <w:tc>
+          <w:tcPr>
+            <w:tcW w:type="dxa" w:w="1234"/>
+          </w:tcPr>
+          <w:p>
+            <w:r>
+              <w:rPr>
+                <w:rFonts w:ascii="Ebrima" w:hAnsi="Ebrima"/>
+              </w:rPr>
+              <w:t>0.0</w:t>
             </w:r>
           </w:p>
         </w:tc>
@@ -1544,33 +1565,33 @@
               <w:rPr>
                 <w:rFonts w:ascii="Ebrima" w:hAnsi="Ebrima"/>
               </w:rPr>
-              <w:t xml:space="preserve">0.0 </w:t>
-            </w:r>
-          </w:p>
-        </w:tc>
-        <w:tc>
-          <w:tcPr>
-            <w:tcW w:type="dxa" w:w="1234"/>
-          </w:tcPr>
-          <w:p>
-            <w:r>
-              <w:rPr>
-                <w:rFonts w:ascii="Ebrima" w:hAnsi="Ebrima"/>
-              </w:rPr>
-              <w:t xml:space="preserve">1.0 </w:t>
-            </w:r>
-          </w:p>
-        </w:tc>
-        <w:tc>
-          <w:tcPr>
-            <w:tcW w:type="dxa" w:w="1234"/>
-          </w:tcPr>
-          <w:p>
-            <w:r>
-              <w:rPr>
-                <w:rFonts w:ascii="Ebrima" w:hAnsi="Ebrima"/>
-              </w:rPr>
-              <w:t xml:space="preserve">0.0 </w:t>
+              <w:t>0.0</w:t>
+            </w:r>
+          </w:p>
+        </w:tc>
+        <w:tc>
+          <w:tcPr>
+            <w:tcW w:type="dxa" w:w="1234"/>
+          </w:tcPr>
+          <w:p>
+            <w:r>
+              <w:rPr>
+                <w:rFonts w:ascii="Ebrima" w:hAnsi="Ebrima"/>
+              </w:rPr>
+              <w:t>1.0</w:t>
+            </w:r>
+          </w:p>
+        </w:tc>
+        <w:tc>
+          <w:tcPr>
+            <w:tcW w:type="dxa" w:w="1234"/>
+          </w:tcPr>
+          <w:p>
+            <w:r>
+              <w:rPr>
+                <w:rFonts w:ascii="Ebrima" w:hAnsi="Ebrima"/>
+              </w:rPr>
+              <w:t>0.0</w:t>
             </w:r>
           </w:p>
         </w:tc>
@@ -1629,7 +1650,7 @@
               <w:rPr>
                 <w:rFonts w:ascii="Ebrima" w:hAnsi="Ebrima"/>
               </w:rPr>
-              <w:t>1.4.4</w:t>
+              <w:t>1.4.1</w:t>
             </w:r>
           </w:p>
         </w:tc>
@@ -1668,33 +1689,33 @@
               <w:rPr>
                 <w:rFonts w:ascii="Ebrima" w:hAnsi="Ebrima"/>
               </w:rPr>
-              <w:t xml:space="preserve">8.0 </w:t>
-            </w:r>
-          </w:p>
-        </w:tc>
-        <w:tc>
-          <w:tcPr>
-            <w:tcW w:type="dxa" w:w="1234"/>
-          </w:tcPr>
-          <w:p>
-            <w:r>
-              <w:rPr>
-                <w:rFonts w:ascii="Ebrima" w:hAnsi="Ebrima"/>
-              </w:rPr>
-              <w:t xml:space="preserve">6.0 </w:t>
-            </w:r>
-          </w:p>
-        </w:tc>
-        <w:tc>
-          <w:tcPr>
-            <w:tcW w:type="dxa" w:w="1234"/>
-          </w:tcPr>
-          <w:p>
-            <w:r>
-              <w:rPr>
-                <w:rFonts w:ascii="Ebrima" w:hAnsi="Ebrima"/>
-              </w:rPr>
-              <w:t xml:space="preserve">0.0 </w:t>
+              <w:t>8.0</w:t>
+            </w:r>
+          </w:p>
+        </w:tc>
+        <w:tc>
+          <w:tcPr>
+            <w:tcW w:type="dxa" w:w="1234"/>
+          </w:tcPr>
+          <w:p>
+            <w:r>
+              <w:rPr>
+                <w:rFonts w:ascii="Ebrima" w:hAnsi="Ebrima"/>
+              </w:rPr>
+              <w:t>6.0</w:t>
+            </w:r>
+          </w:p>
+        </w:tc>
+        <w:tc>
+          <w:tcPr>
+            <w:tcW w:type="dxa" w:w="1234"/>
+          </w:tcPr>
+          <w:p>
+            <w:r>
+              <w:rPr>
+                <w:rFonts w:ascii="Ebrima" w:hAnsi="Ebrima"/>
+              </w:rPr>
+              <w:t>0.0</w:t>
             </w:r>
           </w:p>
         </w:tc>
@@ -1722,7 +1743,7 @@
               <w:rPr>
                 <w:rFonts w:ascii="Ebrima" w:hAnsi="Ebrima"/>
               </w:rPr>
-              <w:t>1.4.4</w:t>
+              <w:t>1.4.2</w:t>
             </w:r>
           </w:p>
         </w:tc>
@@ -1761,33 +1782,33 @@
               <w:rPr>
                 <w:rFonts w:ascii="Ebrima" w:hAnsi="Ebrima"/>
               </w:rPr>
-              <w:t xml:space="preserve">7600.0 </w:t>
-            </w:r>
-          </w:p>
-        </w:tc>
-        <w:tc>
-          <w:tcPr>
-            <w:tcW w:type="dxa" w:w="1234"/>
-          </w:tcPr>
-          <w:p>
-            <w:r>
-              <w:rPr>
-                <w:rFonts w:ascii="Ebrima" w:hAnsi="Ebrima"/>
-              </w:rPr>
-              <w:t xml:space="preserve">6200.0 </w:t>
-            </w:r>
-          </w:p>
-        </w:tc>
-        <w:tc>
-          <w:tcPr>
-            <w:tcW w:type="dxa" w:w="1234"/>
-          </w:tcPr>
-          <w:p>
-            <w:r>
-              <w:rPr>
-                <w:rFonts w:ascii="Ebrima" w:hAnsi="Ebrima"/>
-              </w:rPr>
-              <w:t xml:space="preserve">0.0 </w:t>
+              <w:t>7600.0</w:t>
+            </w:r>
+          </w:p>
+        </w:tc>
+        <w:tc>
+          <w:tcPr>
+            <w:tcW w:type="dxa" w:w="1234"/>
+          </w:tcPr>
+          <w:p>
+            <w:r>
+              <w:rPr>
+                <w:rFonts w:ascii="Ebrima" w:hAnsi="Ebrima"/>
+              </w:rPr>
+              <w:t>6200.0</w:t>
+            </w:r>
+          </w:p>
+        </w:tc>
+        <w:tc>
+          <w:tcPr>
+            <w:tcW w:type="dxa" w:w="1234"/>
+          </w:tcPr>
+          <w:p>
+            <w:r>
+              <w:rPr>
+                <w:rFonts w:ascii="Ebrima" w:hAnsi="Ebrima"/>
+              </w:rPr>
+              <w:t>0.0</w:t>
             </w:r>
           </w:p>
         </w:tc>
@@ -1815,7 +1836,7 @@
               <w:rPr>
                 <w:rFonts w:ascii="Ebrima" w:hAnsi="Ebrima"/>
               </w:rPr>
-              <w:t>1.4.4</w:t>
+              <w:t>1.4.3</w:t>
             </w:r>
           </w:p>
         </w:tc>
@@ -1854,33 +1875,33 @@
               <w:rPr>
                 <w:rFonts w:ascii="Ebrima" w:hAnsi="Ebrima"/>
               </w:rPr>
-              <w:t xml:space="preserve">4.0 </w:t>
-            </w:r>
-          </w:p>
-        </w:tc>
-        <w:tc>
-          <w:tcPr>
-            <w:tcW w:type="dxa" w:w="1234"/>
-          </w:tcPr>
-          <w:p>
-            <w:r>
-              <w:rPr>
-                <w:rFonts w:ascii="Ebrima" w:hAnsi="Ebrima"/>
-              </w:rPr>
-              <w:t xml:space="preserve">6.0 </w:t>
-            </w:r>
-          </w:p>
-        </w:tc>
-        <w:tc>
-          <w:tcPr>
-            <w:tcW w:type="dxa" w:w="1234"/>
-          </w:tcPr>
-          <w:p>
-            <w:r>
-              <w:rPr>
-                <w:rFonts w:ascii="Ebrima" w:hAnsi="Ebrima"/>
-              </w:rPr>
-              <w:t xml:space="preserve">0.0 </w:t>
+              <w:t>4.0</w:t>
+            </w:r>
+          </w:p>
+        </w:tc>
+        <w:tc>
+          <w:tcPr>
+            <w:tcW w:type="dxa" w:w="1234"/>
+          </w:tcPr>
+          <w:p>
+            <w:r>
+              <w:rPr>
+                <w:rFonts w:ascii="Ebrima" w:hAnsi="Ebrima"/>
+              </w:rPr>
+              <w:t>6.0</w:t>
+            </w:r>
+          </w:p>
+        </w:tc>
+        <w:tc>
+          <w:tcPr>
+            <w:tcW w:type="dxa" w:w="1234"/>
+          </w:tcPr>
+          <w:p>
+            <w:r>
+              <w:rPr>
+                <w:rFonts w:ascii="Ebrima" w:hAnsi="Ebrima"/>
+              </w:rPr>
+              <w:t>0.0</w:t>
             </w:r>
           </w:p>
         </w:tc>
@@ -1947,33 +1968,33 @@
               <w:rPr>
                 <w:rFonts w:ascii="Ebrima" w:hAnsi="Ebrima"/>
               </w:rPr>
-              <w:t xml:space="preserve">4.0 </w:t>
-            </w:r>
-          </w:p>
-        </w:tc>
-        <w:tc>
-          <w:tcPr>
-            <w:tcW w:type="dxa" w:w="1234"/>
-          </w:tcPr>
-          <w:p>
-            <w:r>
-              <w:rPr>
-                <w:rFonts w:ascii="Ebrima" w:hAnsi="Ebrima"/>
-              </w:rPr>
-              <w:t xml:space="preserve">2.0 </w:t>
-            </w:r>
-          </w:p>
-        </w:tc>
-        <w:tc>
-          <w:tcPr>
-            <w:tcW w:type="dxa" w:w="1234"/>
-          </w:tcPr>
-          <w:p>
-            <w:r>
-              <w:rPr>
-                <w:rFonts w:ascii="Ebrima" w:hAnsi="Ebrima"/>
-              </w:rPr>
-              <w:t xml:space="preserve">0.0 </w:t>
+              <w:t>4.0</w:t>
+            </w:r>
+          </w:p>
+        </w:tc>
+        <w:tc>
+          <w:tcPr>
+            <w:tcW w:type="dxa" w:w="1234"/>
+          </w:tcPr>
+          <w:p>
+            <w:r>
+              <w:rPr>
+                <w:rFonts w:ascii="Ebrima" w:hAnsi="Ebrima"/>
+              </w:rPr>
+              <w:t>2.0</w:t>
+            </w:r>
+          </w:p>
+        </w:tc>
+        <w:tc>
+          <w:tcPr>
+            <w:tcW w:type="dxa" w:w="1234"/>
+          </w:tcPr>
+          <w:p>
+            <w:r>
+              <w:rPr>
+                <w:rFonts w:ascii="Ebrima" w:hAnsi="Ebrima"/>
+              </w:rPr>
+              <w:t>0.0</w:t>
             </w:r>
           </w:p>
         </w:tc>
@@ -2032,7 +2053,7 @@
               <w:rPr>
                 <w:rFonts w:ascii="Ebrima" w:hAnsi="Ebrima"/>
               </w:rPr>
-              <w:t>1.5.4</w:t>
+              <w:t>1.5.1</w:t>
             </w:r>
           </w:p>
         </w:tc>
@@ -2071,33 +2092,33 @@
               <w:rPr>
                 <w:rFonts w:ascii="Ebrima" w:hAnsi="Ebrima"/>
               </w:rPr>
-              <w:t xml:space="preserve">85.0 </w:t>
-            </w:r>
-          </w:p>
-        </w:tc>
-        <w:tc>
-          <w:tcPr>
-            <w:tcW w:type="dxa" w:w="1234"/>
-          </w:tcPr>
-          <w:p>
-            <w:r>
-              <w:rPr>
-                <w:rFonts w:ascii="Ebrima" w:hAnsi="Ebrima"/>
-              </w:rPr>
-              <w:t xml:space="preserve">70.0 </w:t>
-            </w:r>
-          </w:p>
-        </w:tc>
-        <w:tc>
-          <w:tcPr>
-            <w:tcW w:type="dxa" w:w="1234"/>
-          </w:tcPr>
-          <w:p>
-            <w:r>
-              <w:rPr>
-                <w:rFonts w:ascii="Ebrima" w:hAnsi="Ebrima"/>
-              </w:rPr>
-              <w:t xml:space="preserve">0.0 </w:t>
+              <w:t>85.0</w:t>
+            </w:r>
+          </w:p>
+        </w:tc>
+        <w:tc>
+          <w:tcPr>
+            <w:tcW w:type="dxa" w:w="1234"/>
+          </w:tcPr>
+          <w:p>
+            <w:r>
+              <w:rPr>
+                <w:rFonts w:ascii="Ebrima" w:hAnsi="Ebrima"/>
+              </w:rPr>
+              <w:t>70.0</w:t>
+            </w:r>
+          </w:p>
+        </w:tc>
+        <w:tc>
+          <w:tcPr>
+            <w:tcW w:type="dxa" w:w="1234"/>
+          </w:tcPr>
+          <w:p>
+            <w:r>
+              <w:rPr>
+                <w:rFonts w:ascii="Ebrima" w:hAnsi="Ebrima"/>
+              </w:rPr>
+              <w:t>0.0</w:t>
             </w:r>
           </w:p>
         </w:tc>
@@ -2125,7 +2146,7 @@
               <w:rPr>
                 <w:rFonts w:ascii="Ebrima" w:hAnsi="Ebrima"/>
               </w:rPr>
-              <w:t>1.5.4</w:t>
+              <w:t>1.5.2</w:t>
             </w:r>
           </w:p>
         </w:tc>
@@ -2164,33 +2185,33 @@
               <w:rPr>
                 <w:rFonts w:ascii="Ebrima" w:hAnsi="Ebrima"/>
               </w:rPr>
-              <w:t xml:space="preserve">7.0 </w:t>
-            </w:r>
-          </w:p>
-        </w:tc>
-        <w:tc>
-          <w:tcPr>
-            <w:tcW w:type="dxa" w:w="1234"/>
-          </w:tcPr>
-          <w:p>
-            <w:r>
-              <w:rPr>
-                <w:rFonts w:ascii="Ebrima" w:hAnsi="Ebrima"/>
-              </w:rPr>
-              <w:t xml:space="preserve">5.0 </w:t>
-            </w:r>
-          </w:p>
-        </w:tc>
-        <w:tc>
-          <w:tcPr>
-            <w:tcW w:type="dxa" w:w="1234"/>
-          </w:tcPr>
-          <w:p>
-            <w:r>
-              <w:rPr>
-                <w:rFonts w:ascii="Ebrima" w:hAnsi="Ebrima"/>
-              </w:rPr>
-              <w:t xml:space="preserve">0.0 </w:t>
+              <w:t>7.0</w:t>
+            </w:r>
+          </w:p>
+        </w:tc>
+        <w:tc>
+          <w:tcPr>
+            <w:tcW w:type="dxa" w:w="1234"/>
+          </w:tcPr>
+          <w:p>
+            <w:r>
+              <w:rPr>
+                <w:rFonts w:ascii="Ebrima" w:hAnsi="Ebrima"/>
+              </w:rPr>
+              <w:t>5.0</w:t>
+            </w:r>
+          </w:p>
+        </w:tc>
+        <w:tc>
+          <w:tcPr>
+            <w:tcW w:type="dxa" w:w="1234"/>
+          </w:tcPr>
+          <w:p>
+            <w:r>
+              <w:rPr>
+                <w:rFonts w:ascii="Ebrima" w:hAnsi="Ebrima"/>
+              </w:rPr>
+              <w:t>0.0</w:t>
             </w:r>
           </w:p>
         </w:tc>
@@ -2218,7 +2239,7 @@
               <w:rPr>
                 <w:rFonts w:ascii="Ebrima" w:hAnsi="Ebrima"/>
               </w:rPr>
-              <w:t>1.5.4</w:t>
+              <w:t>1.5.3</w:t>
             </w:r>
           </w:p>
         </w:tc>
@@ -2257,33 +2278,33 @@
               <w:rPr>
                 <w:rFonts w:ascii="Ebrima" w:hAnsi="Ebrima"/>
               </w:rPr>
-              <w:t xml:space="preserve">31.0 </w:t>
-            </w:r>
-          </w:p>
-        </w:tc>
-        <w:tc>
-          <w:tcPr>
-            <w:tcW w:type="dxa" w:w="1234"/>
-          </w:tcPr>
-          <w:p>
-            <w:r>
-              <w:rPr>
-                <w:rFonts w:ascii="Ebrima" w:hAnsi="Ebrima"/>
-              </w:rPr>
-              <w:t xml:space="preserve">30.0 </w:t>
-            </w:r>
-          </w:p>
-        </w:tc>
-        <w:tc>
-          <w:tcPr>
-            <w:tcW w:type="dxa" w:w="1234"/>
-          </w:tcPr>
-          <w:p>
-            <w:r>
-              <w:rPr>
-                <w:rFonts w:ascii="Ebrima" w:hAnsi="Ebrima"/>
-              </w:rPr>
-              <w:t xml:space="preserve">0.0 </w:t>
+              <w:t>31.0</w:t>
+            </w:r>
+          </w:p>
+        </w:tc>
+        <w:tc>
+          <w:tcPr>
+            <w:tcW w:type="dxa" w:w="1234"/>
+          </w:tcPr>
+          <w:p>
+            <w:r>
+              <w:rPr>
+                <w:rFonts w:ascii="Ebrima" w:hAnsi="Ebrima"/>
+              </w:rPr>
+              <w:t>30.0</w:t>
+            </w:r>
+          </w:p>
+        </w:tc>
+        <w:tc>
+          <w:tcPr>
+            <w:tcW w:type="dxa" w:w="1234"/>
+          </w:tcPr>
+          <w:p>
+            <w:r>
+              <w:rPr>
+                <w:rFonts w:ascii="Ebrima" w:hAnsi="Ebrima"/>
+              </w:rPr>
+              <w:t>0.0</w:t>
             </w:r>
           </w:p>
         </w:tc>
@@ -2350,33 +2371,33 @@
               <w:rPr>
                 <w:rFonts w:ascii="Ebrima" w:hAnsi="Ebrima"/>
               </w:rPr>
-              <w:t xml:space="preserve">0.0 </w:t>
-            </w:r>
-          </w:p>
-        </w:tc>
-        <w:tc>
-          <w:tcPr>
-            <w:tcW w:type="dxa" w:w="1234"/>
-          </w:tcPr>
-          <w:p>
-            <w:r>
-              <w:rPr>
-                <w:rFonts w:ascii="Ebrima" w:hAnsi="Ebrima"/>
-              </w:rPr>
-              <w:t xml:space="preserve">1.0 </w:t>
-            </w:r>
-          </w:p>
-        </w:tc>
-        <w:tc>
-          <w:tcPr>
-            <w:tcW w:type="dxa" w:w="1234"/>
-          </w:tcPr>
-          <w:p>
-            <w:r>
-              <w:rPr>
-                <w:rFonts w:ascii="Ebrima" w:hAnsi="Ebrima"/>
-              </w:rPr>
-              <w:t xml:space="preserve">0.0 </w:t>
+              <w:t>0.0</w:t>
+            </w:r>
+          </w:p>
+        </w:tc>
+        <w:tc>
+          <w:tcPr>
+            <w:tcW w:type="dxa" w:w="1234"/>
+          </w:tcPr>
+          <w:p>
+            <w:r>
+              <w:rPr>
+                <w:rFonts w:ascii="Ebrima" w:hAnsi="Ebrima"/>
+              </w:rPr>
+              <w:t>1.0</w:t>
+            </w:r>
+          </w:p>
+        </w:tc>
+        <w:tc>
+          <w:tcPr>
+            <w:tcW w:type="dxa" w:w="1234"/>
+          </w:tcPr>
+          <w:p>
+            <w:r>
+              <w:rPr>
+                <w:rFonts w:ascii="Ebrima" w:hAnsi="Ebrima"/>
+              </w:rPr>
+              <w:t>0.0</w:t>
             </w:r>
           </w:p>
         </w:tc>
@@ -2435,7 +2456,7 @@
               <w:rPr>
                 <w:rFonts w:ascii="Ebrima" w:hAnsi="Ebrima"/>
               </w:rPr>
-              <w:t>1.6.4</w:t>
+              <w:t>1.6.1</w:t>
             </w:r>
           </w:p>
         </w:tc>
@@ -2474,33 +2495,33 @@
               <w:rPr>
                 <w:rFonts w:ascii="Ebrima" w:hAnsi="Ebrima"/>
               </w:rPr>
-              <w:t xml:space="preserve">12.0 </w:t>
-            </w:r>
-          </w:p>
-        </w:tc>
-        <w:tc>
-          <w:tcPr>
-            <w:tcW w:type="dxa" w:w="1234"/>
-          </w:tcPr>
-          <w:p>
-            <w:r>
-              <w:rPr>
-                <w:rFonts w:ascii="Ebrima" w:hAnsi="Ebrima"/>
-              </w:rPr>
-              <w:t xml:space="preserve">5.0 </w:t>
-            </w:r>
-          </w:p>
-        </w:tc>
-        <w:tc>
-          <w:tcPr>
-            <w:tcW w:type="dxa" w:w="1234"/>
-          </w:tcPr>
-          <w:p>
-            <w:r>
-              <w:rPr>
-                <w:rFonts w:ascii="Ebrima" w:hAnsi="Ebrima"/>
-              </w:rPr>
-              <w:t xml:space="preserve">0.0 </w:t>
+              <w:t>12.0</w:t>
+            </w:r>
+          </w:p>
+        </w:tc>
+        <w:tc>
+          <w:tcPr>
+            <w:tcW w:type="dxa" w:w="1234"/>
+          </w:tcPr>
+          <w:p>
+            <w:r>
+              <w:rPr>
+                <w:rFonts w:ascii="Ebrima" w:hAnsi="Ebrima"/>
+              </w:rPr>
+              <w:t>5.0</w:t>
+            </w:r>
+          </w:p>
+        </w:tc>
+        <w:tc>
+          <w:tcPr>
+            <w:tcW w:type="dxa" w:w="1234"/>
+          </w:tcPr>
+          <w:p>
+            <w:r>
+              <w:rPr>
+                <w:rFonts w:ascii="Ebrima" w:hAnsi="Ebrima"/>
+              </w:rPr>
+              <w:t>0.0</w:t>
             </w:r>
           </w:p>
         </w:tc>
@@ -2528,7 +2549,7 @@
               <w:rPr>
                 <w:rFonts w:ascii="Ebrima" w:hAnsi="Ebrima"/>
               </w:rPr>
-              <w:t>1.6.4</w:t>
+              <w:t>1.6.2</w:t>
             </w:r>
           </w:p>
         </w:tc>
@@ -2567,33 +2588,33 @@
               <w:rPr>
                 <w:rFonts w:ascii="Ebrima" w:hAnsi="Ebrima"/>
               </w:rPr>
-              <w:t xml:space="preserve">0.0 </w:t>
-            </w:r>
-          </w:p>
-        </w:tc>
-        <w:tc>
-          <w:tcPr>
-            <w:tcW w:type="dxa" w:w="1234"/>
-          </w:tcPr>
-          <w:p>
-            <w:r>
-              <w:rPr>
-                <w:rFonts w:ascii="Ebrima" w:hAnsi="Ebrima"/>
-              </w:rPr>
-              <w:t xml:space="preserve">5.0 </w:t>
-            </w:r>
-          </w:p>
-        </w:tc>
-        <w:tc>
-          <w:tcPr>
-            <w:tcW w:type="dxa" w:w="1234"/>
-          </w:tcPr>
-          <w:p>
-            <w:r>
-              <w:rPr>
-                <w:rFonts w:ascii="Ebrima" w:hAnsi="Ebrima"/>
-              </w:rPr>
-              <w:t xml:space="preserve">0.0 </w:t>
+              <w:t>0.0</w:t>
+            </w:r>
+          </w:p>
+        </w:tc>
+        <w:tc>
+          <w:tcPr>
+            <w:tcW w:type="dxa" w:w="1234"/>
+          </w:tcPr>
+          <w:p>
+            <w:r>
+              <w:rPr>
+                <w:rFonts w:ascii="Ebrima" w:hAnsi="Ebrima"/>
+              </w:rPr>
+              <w:t>5.0</w:t>
+            </w:r>
+          </w:p>
+        </w:tc>
+        <w:tc>
+          <w:tcPr>
+            <w:tcW w:type="dxa" w:w="1234"/>
+          </w:tcPr>
+          <w:p>
+            <w:r>
+              <w:rPr>
+                <w:rFonts w:ascii="Ebrima" w:hAnsi="Ebrima"/>
+              </w:rPr>
+              <w:t>0.0</w:t>
             </w:r>
           </w:p>
         </w:tc>
@@ -2621,7 +2642,7 @@
               <w:rPr>
                 <w:rFonts w:ascii="Ebrima" w:hAnsi="Ebrima"/>
               </w:rPr>
-              <w:t>1.6.4</w:t>
+              <w:t>1.6.3</w:t>
             </w:r>
           </w:p>
         </w:tc>
@@ -2753,33 +2774,33 @@
               <w:rPr>
                 <w:rFonts w:ascii="Ebrima" w:hAnsi="Ebrima"/>
               </w:rPr>
-              <w:t xml:space="preserve">211.0 </w:t>
-            </w:r>
-          </w:p>
-        </w:tc>
-        <w:tc>
-          <w:tcPr>
-            <w:tcW w:type="dxa" w:w="1234"/>
-          </w:tcPr>
-          <w:p>
-            <w:r>
-              <w:rPr>
-                <w:rFonts w:ascii="Ebrima" w:hAnsi="Ebrima"/>
-              </w:rPr>
-              <w:t xml:space="preserve">300.0 </w:t>
-            </w:r>
-          </w:p>
-        </w:tc>
-        <w:tc>
-          <w:tcPr>
-            <w:tcW w:type="dxa" w:w="1234"/>
-          </w:tcPr>
-          <w:p>
-            <w:r>
-              <w:rPr>
-                <w:rFonts w:ascii="Ebrima" w:hAnsi="Ebrima"/>
-              </w:rPr>
-              <w:t xml:space="preserve">0.0 </w:t>
+              <w:t>211.0</w:t>
+            </w:r>
+          </w:p>
+        </w:tc>
+        <w:tc>
+          <w:tcPr>
+            <w:tcW w:type="dxa" w:w="1234"/>
+          </w:tcPr>
+          <w:p>
+            <w:r>
+              <w:rPr>
+                <w:rFonts w:ascii="Ebrima" w:hAnsi="Ebrima"/>
+              </w:rPr>
+              <w:t>300.0</w:t>
+            </w:r>
+          </w:p>
+        </w:tc>
+        <w:tc>
+          <w:tcPr>
+            <w:tcW w:type="dxa" w:w="1234"/>
+          </w:tcPr>
+          <w:p>
+            <w:r>
+              <w:rPr>
+                <w:rFonts w:ascii="Ebrima" w:hAnsi="Ebrima"/>
+              </w:rPr>
+              <w:t>0.0</w:t>
             </w:r>
           </w:p>
         </w:tc>
@@ -2871,7 +2892,7 @@
               <w:rPr>
                 <w:rFonts w:ascii="Ebrima" w:hAnsi="Ebrima"/>
               </w:rPr>
-              <w:t>2.1.4</w:t>
+              <w:t>2.1.1</w:t>
             </w:r>
           </w:p>
         </w:tc>
@@ -2910,33 +2931,33 @@
               <w:rPr>
                 <w:rFonts w:ascii="Ebrima" w:hAnsi="Ebrima"/>
               </w:rPr>
-              <w:t xml:space="preserve">9.0 </w:t>
-            </w:r>
-          </w:p>
-        </w:tc>
-        <w:tc>
-          <w:tcPr>
-            <w:tcW w:type="dxa" w:w="1234"/>
-          </w:tcPr>
-          <w:p>
-            <w:r>
-              <w:rPr>
-                <w:rFonts w:ascii="Ebrima" w:hAnsi="Ebrima"/>
-              </w:rPr>
-              <w:t xml:space="preserve">11.0 </w:t>
-            </w:r>
-          </w:p>
-        </w:tc>
-        <w:tc>
-          <w:tcPr>
-            <w:tcW w:type="dxa" w:w="1234"/>
-          </w:tcPr>
-          <w:p>
-            <w:r>
-              <w:rPr>
-                <w:rFonts w:ascii="Ebrima" w:hAnsi="Ebrima"/>
-              </w:rPr>
-              <w:t xml:space="preserve">4.0 </w:t>
+              <w:t>9.0</w:t>
+            </w:r>
+          </w:p>
+        </w:tc>
+        <w:tc>
+          <w:tcPr>
+            <w:tcW w:type="dxa" w:w="1234"/>
+          </w:tcPr>
+          <w:p>
+            <w:r>
+              <w:rPr>
+                <w:rFonts w:ascii="Ebrima" w:hAnsi="Ebrima"/>
+              </w:rPr>
+              <w:t>11.0</w:t>
+            </w:r>
+          </w:p>
+        </w:tc>
+        <w:tc>
+          <w:tcPr>
+            <w:tcW w:type="dxa" w:w="1234"/>
+          </w:tcPr>
+          <w:p>
+            <w:r>
+              <w:rPr>
+                <w:rFonts w:ascii="Ebrima" w:hAnsi="Ebrima"/>
+              </w:rPr>
+              <w:t>4.0</w:t>
             </w:r>
           </w:p>
         </w:tc>
@@ -2964,7 +2985,7 @@
               <w:rPr>
                 <w:rFonts w:ascii="Ebrima" w:hAnsi="Ebrima"/>
               </w:rPr>
-              <w:t>2.1.4</w:t>
+              <w:t>2.1.2</w:t>
             </w:r>
           </w:p>
         </w:tc>
@@ -3057,7 +3078,7 @@
               <w:rPr>
                 <w:rFonts w:ascii="Ebrima" w:hAnsi="Ebrima"/>
               </w:rPr>
-              <w:t>2.1.4</w:t>
+              <w:t>2.1.3</w:t>
             </w:r>
           </w:p>
         </w:tc>
@@ -3096,33 +3117,33 @@
               <w:rPr>
                 <w:rFonts w:ascii="Ebrima" w:hAnsi="Ebrima"/>
               </w:rPr>
-              <w:t xml:space="preserve">0.0 </w:t>
-            </w:r>
-          </w:p>
-        </w:tc>
-        <w:tc>
-          <w:tcPr>
-            <w:tcW w:type="dxa" w:w="1234"/>
-          </w:tcPr>
-          <w:p>
-            <w:r>
-              <w:rPr>
-                <w:rFonts w:ascii="Ebrima" w:hAnsi="Ebrima"/>
-              </w:rPr>
-              <w:t xml:space="preserve">1.0 </w:t>
-            </w:r>
-          </w:p>
-        </w:tc>
-        <w:tc>
-          <w:tcPr>
-            <w:tcW w:type="dxa" w:w="1234"/>
-          </w:tcPr>
-          <w:p>
-            <w:r>
-              <w:rPr>
-                <w:rFonts w:ascii="Ebrima" w:hAnsi="Ebrima"/>
-              </w:rPr>
-              <w:t xml:space="preserve">0.0 </w:t>
+              <w:t>0.0</w:t>
+            </w:r>
+          </w:p>
+        </w:tc>
+        <w:tc>
+          <w:tcPr>
+            <w:tcW w:type="dxa" w:w="1234"/>
+          </w:tcPr>
+          <w:p>
+            <w:r>
+              <w:rPr>
+                <w:rFonts w:ascii="Ebrima" w:hAnsi="Ebrima"/>
+              </w:rPr>
+              <w:t>1.0</w:t>
+            </w:r>
+          </w:p>
+        </w:tc>
+        <w:tc>
+          <w:tcPr>
+            <w:tcW w:type="dxa" w:w="1234"/>
+          </w:tcPr>
+          <w:p>
+            <w:r>
+              <w:rPr>
+                <w:rFonts w:ascii="Ebrima" w:hAnsi="Ebrima"/>
+              </w:rPr>
+              <w:t>0.0</w:t>
             </w:r>
           </w:p>
         </w:tc>
@@ -3181,7 +3202,7 @@
               <w:rPr>
                 <w:rFonts w:ascii="Ebrima" w:hAnsi="Ebrima"/>
               </w:rPr>
-              <w:t>2.2.4</w:t>
+              <w:t>2.2.1</w:t>
             </w:r>
           </w:p>
         </w:tc>
@@ -3274,7 +3295,7 @@
               <w:rPr>
                 <w:rFonts w:ascii="Ebrima" w:hAnsi="Ebrima"/>
               </w:rPr>
-              <w:t>2.2.4</w:t>
+              <w:t>2.2.2</w:t>
             </w:r>
           </w:p>
         </w:tc>
@@ -3367,7 +3388,7 @@
               <w:rPr>
                 <w:rFonts w:ascii="Ebrima" w:hAnsi="Ebrima"/>
               </w:rPr>
-              <w:t>2.2.4</w:t>
+              <w:t>2.2.3</w:t>
             </w:r>
           </w:p>
         </w:tc>
@@ -3553,7 +3574,7 @@
               <w:rPr>
                 <w:rFonts w:ascii="Ebrima" w:hAnsi="Ebrima"/>
               </w:rPr>
-              <w:t>2.2.4</w:t>
+              <w:t>2.2.5</w:t>
             </w:r>
           </w:p>
         </w:tc>
@@ -3646,7 +3667,7 @@
               <w:rPr>
                 <w:rFonts w:ascii="Ebrima" w:hAnsi="Ebrima"/>
               </w:rPr>
-              <w:t>2.2.4</w:t>
+              <w:t>2.2.6</w:t>
             </w:r>
           </w:p>
         </w:tc>
@@ -3770,7 +3791,7 @@
               <w:rPr>
                 <w:rFonts w:ascii="Ebrima" w:hAnsi="Ebrima"/>
               </w:rPr>
-              <w:t>2.3.4</w:t>
+              <w:t>2.3.1</w:t>
             </w:r>
           </w:p>
         </w:tc>
@@ -3863,7 +3884,7 @@
               <w:rPr>
                 <w:rFonts w:ascii="Ebrima" w:hAnsi="Ebrima"/>
               </w:rPr>
-              <w:t>2.3.4</w:t>
+              <w:t>2.3.2</w:t>
             </w:r>
           </w:p>
         </w:tc>
@@ -3902,33 +3923,33 @@
               <w:rPr>
                 <w:rFonts w:ascii="Ebrima" w:hAnsi="Ebrima"/>
               </w:rPr>
-              <w:t xml:space="preserve">1.0 </w:t>
-            </w:r>
-          </w:p>
-        </w:tc>
-        <w:tc>
-          <w:tcPr>
-            <w:tcW w:type="dxa" w:w="1234"/>
-          </w:tcPr>
-          <w:p>
-            <w:r>
-              <w:rPr>
-                <w:rFonts w:ascii="Ebrima" w:hAnsi="Ebrima"/>
-              </w:rPr>
-              <w:t xml:space="preserve">1.0 </w:t>
-            </w:r>
-          </w:p>
-        </w:tc>
-        <w:tc>
-          <w:tcPr>
-            <w:tcW w:type="dxa" w:w="1234"/>
-          </w:tcPr>
-          <w:p>
-            <w:r>
-              <w:rPr>
-                <w:rFonts w:ascii="Ebrima" w:hAnsi="Ebrima"/>
-              </w:rPr>
-              <w:t xml:space="preserve">0.0 </w:t>
+              <w:t>1.0</w:t>
+            </w:r>
+          </w:p>
+        </w:tc>
+        <w:tc>
+          <w:tcPr>
+            <w:tcW w:type="dxa" w:w="1234"/>
+          </w:tcPr>
+          <w:p>
+            <w:r>
+              <w:rPr>
+                <w:rFonts w:ascii="Ebrima" w:hAnsi="Ebrima"/>
+              </w:rPr>
+              <w:t>1.0</w:t>
+            </w:r>
+          </w:p>
+        </w:tc>
+        <w:tc>
+          <w:tcPr>
+            <w:tcW w:type="dxa" w:w="1234"/>
+          </w:tcPr>
+          <w:p>
+            <w:r>
+              <w:rPr>
+                <w:rFonts w:ascii="Ebrima" w:hAnsi="Ebrima"/>
+              </w:rPr>
+              <w:t>0.0</w:t>
             </w:r>
           </w:p>
         </w:tc>
@@ -3956,7 +3977,7 @@
               <w:rPr>
                 <w:rFonts w:ascii="Ebrima" w:hAnsi="Ebrima"/>
               </w:rPr>
-              <w:t>2.3.4</w:t>
+              <w:t>2.3.3</w:t>
             </w:r>
           </w:p>
         </w:tc>
@@ -4088,33 +4109,33 @@
               <w:rPr>
                 <w:rFonts w:ascii="Ebrima" w:hAnsi="Ebrima"/>
               </w:rPr>
-              <w:t xml:space="preserve">85.0 </w:t>
-            </w:r>
-          </w:p>
-        </w:tc>
-        <w:tc>
-          <w:tcPr>
-            <w:tcW w:type="dxa" w:w="1234"/>
-          </w:tcPr>
-          <w:p>
-            <w:r>
-              <w:rPr>
-                <w:rFonts w:ascii="Ebrima" w:hAnsi="Ebrima"/>
-              </w:rPr>
-              <w:t xml:space="preserve">40.0 </w:t>
-            </w:r>
-          </w:p>
-        </w:tc>
-        <w:tc>
-          <w:tcPr>
-            <w:tcW w:type="dxa" w:w="1234"/>
-          </w:tcPr>
-          <w:p>
-            <w:r>
-              <w:rPr>
-                <w:rFonts w:ascii="Ebrima" w:hAnsi="Ebrima"/>
-              </w:rPr>
-              <w:t xml:space="preserve">0.0 </w:t>
+              <w:t>85.0</w:t>
+            </w:r>
+          </w:p>
+        </w:tc>
+        <w:tc>
+          <w:tcPr>
+            <w:tcW w:type="dxa" w:w="1234"/>
+          </w:tcPr>
+          <w:p>
+            <w:r>
+              <w:rPr>
+                <w:rFonts w:ascii="Ebrima" w:hAnsi="Ebrima"/>
+              </w:rPr>
+              <w:t>40.0</w:t>
+            </w:r>
+          </w:p>
+        </w:tc>
+        <w:tc>
+          <w:tcPr>
+            <w:tcW w:type="dxa" w:w="1234"/>
+          </w:tcPr>
+          <w:p>
+            <w:r>
+              <w:rPr>
+                <w:rFonts w:ascii="Ebrima" w:hAnsi="Ebrima"/>
+              </w:rPr>
+              <w:t>0.0</w:t>
             </w:r>
           </w:p>
         </w:tc>
@@ -4173,7 +4194,7 @@
               <w:rPr>
                 <w:rFonts w:ascii="Ebrima" w:hAnsi="Ebrima"/>
               </w:rPr>
-              <w:t>2.4.4</w:t>
+              <w:t>2.4.1</w:t>
             </w:r>
           </w:p>
         </w:tc>
@@ -4266,7 +4287,7 @@
               <w:rPr>
                 <w:rFonts w:ascii="Ebrima" w:hAnsi="Ebrima"/>
               </w:rPr>
-              <w:t>2.4.4</w:t>
+              <w:t>2.4.2</w:t>
             </w:r>
           </w:p>
         </w:tc>
@@ -4359,7 +4380,7 @@
               <w:rPr>
                 <w:rFonts w:ascii="Ebrima" w:hAnsi="Ebrima"/>
               </w:rPr>
-              <w:t>2.4.4</w:t>
+              <w:t>2.4.3</w:t>
             </w:r>
           </w:p>
         </w:tc>
@@ -4576,7 +4597,7 @@
               <w:rPr>
                 <w:rFonts w:ascii="Ebrima" w:hAnsi="Ebrima"/>
               </w:rPr>
-              <w:t>2.5.4</w:t>
+              <w:t>2.5.1</w:t>
             </w:r>
           </w:p>
         </w:tc>
@@ -4669,7 +4690,7 @@
               <w:rPr>
                 <w:rFonts w:ascii="Ebrima" w:hAnsi="Ebrima"/>
               </w:rPr>
-              <w:t>2.5.4</w:t>
+              <w:t>2.5.2</w:t>
             </w:r>
           </w:p>
         </w:tc>
@@ -4762,7 +4783,7 @@
               <w:rPr>
                 <w:rFonts w:ascii="Ebrima" w:hAnsi="Ebrima"/>
               </w:rPr>
-              <w:t>2.5.4</w:t>
+              <w:t>2.5.3</w:t>
             </w:r>
           </w:p>
         </w:tc>
@@ -4886,7 +4907,7 @@
               <w:rPr>
                 <w:rFonts w:ascii="Ebrima" w:hAnsi="Ebrima"/>
               </w:rPr>
-              <w:t>2.6.4</w:t>
+              <w:t>2.6.1</w:t>
             </w:r>
           </w:p>
         </w:tc>
@@ -4979,7 +5000,7 @@
               <w:rPr>
                 <w:rFonts w:ascii="Ebrima" w:hAnsi="Ebrima"/>
               </w:rPr>
-              <w:t>2.6.4</w:t>
+              <w:t>2.6.2</w:t>
             </w:r>
           </w:p>
         </w:tc>
@@ -5018,33 +5039,33 @@
               <w:rPr>
                 <w:rFonts w:ascii="Ebrima" w:hAnsi="Ebrima"/>
               </w:rPr>
-              <w:t xml:space="preserve">4.0 </w:t>
-            </w:r>
-          </w:p>
-        </w:tc>
-        <w:tc>
-          <w:tcPr>
-            <w:tcW w:type="dxa" w:w="1234"/>
-          </w:tcPr>
-          <w:p>
-            <w:r>
-              <w:rPr>
-                <w:rFonts w:ascii="Ebrima" w:hAnsi="Ebrima"/>
-              </w:rPr>
-              <w:t xml:space="preserve">4.0 </w:t>
-            </w:r>
-          </w:p>
-        </w:tc>
-        <w:tc>
-          <w:tcPr>
-            <w:tcW w:type="dxa" w:w="1234"/>
-          </w:tcPr>
-          <w:p>
-            <w:r>
-              <w:rPr>
-                <w:rFonts w:ascii="Ebrima" w:hAnsi="Ebrima"/>
-              </w:rPr>
-              <w:t xml:space="preserve">0.0 </w:t>
+              <w:t>4.0</w:t>
+            </w:r>
+          </w:p>
+        </w:tc>
+        <w:tc>
+          <w:tcPr>
+            <w:tcW w:type="dxa" w:w="1234"/>
+          </w:tcPr>
+          <w:p>
+            <w:r>
+              <w:rPr>
+                <w:rFonts w:ascii="Ebrima" w:hAnsi="Ebrima"/>
+              </w:rPr>
+              <w:t>4.0</w:t>
+            </w:r>
+          </w:p>
+        </w:tc>
+        <w:tc>
+          <w:tcPr>
+            <w:tcW w:type="dxa" w:w="1234"/>
+          </w:tcPr>
+          <w:p>
+            <w:r>
+              <w:rPr>
+                <w:rFonts w:ascii="Ebrima" w:hAnsi="Ebrima"/>
+              </w:rPr>
+              <w:t>0.0</w:t>
             </w:r>
           </w:p>
         </w:tc>
@@ -5072,7 +5093,7 @@
               <w:rPr>
                 <w:rFonts w:ascii="Ebrima" w:hAnsi="Ebrima"/>
               </w:rPr>
-              <w:t>2.6.4</w:t>
+              <w:t>2.6.3</w:t>
             </w:r>
           </w:p>
         </w:tc>
@@ -5196,7 +5217,7 @@
               <w:rPr>
                 <w:rFonts w:ascii="Ebrima" w:hAnsi="Ebrima"/>
               </w:rPr>
-              <w:t>2.7.4</w:t>
+              <w:t>2.7.1</w:t>
             </w:r>
           </w:p>
         </w:tc>
@@ -5235,33 +5256,33 @@
               <w:rPr>
                 <w:rFonts w:ascii="Ebrima" w:hAnsi="Ebrima"/>
               </w:rPr>
-              <w:t xml:space="preserve">60.0 </w:t>
-            </w:r>
-          </w:p>
-        </w:tc>
-        <w:tc>
-          <w:tcPr>
-            <w:tcW w:type="dxa" w:w="1234"/>
-          </w:tcPr>
-          <w:p>
-            <w:r>
-              <w:rPr>
-                <w:rFonts w:ascii="Ebrima" w:hAnsi="Ebrima"/>
-              </w:rPr>
-              <w:t xml:space="preserve">65.0 </w:t>
-            </w:r>
-          </w:p>
-        </w:tc>
-        <w:tc>
-          <w:tcPr>
-            <w:tcW w:type="dxa" w:w="1234"/>
-          </w:tcPr>
-          <w:p>
-            <w:r>
-              <w:rPr>
-                <w:rFonts w:ascii="Ebrima" w:hAnsi="Ebrima"/>
-              </w:rPr>
-              <w:t xml:space="preserve">0.0 </w:t>
+              <w:t>60.0</w:t>
+            </w:r>
+          </w:p>
+        </w:tc>
+        <w:tc>
+          <w:tcPr>
+            <w:tcW w:type="dxa" w:w="1234"/>
+          </w:tcPr>
+          <w:p>
+            <w:r>
+              <w:rPr>
+                <w:rFonts w:ascii="Ebrima" w:hAnsi="Ebrima"/>
+              </w:rPr>
+              <w:t>65.0</w:t>
+            </w:r>
+          </w:p>
+        </w:tc>
+        <w:tc>
+          <w:tcPr>
+            <w:tcW w:type="dxa" w:w="1234"/>
+          </w:tcPr>
+          <w:p>
+            <w:r>
+              <w:rPr>
+                <w:rFonts w:ascii="Ebrima" w:hAnsi="Ebrima"/>
+              </w:rPr>
+              <w:t>0.0</w:t>
             </w:r>
           </w:p>
         </w:tc>
@@ -5289,7 +5310,7 @@
               <w:rPr>
                 <w:rFonts w:ascii="Ebrima" w:hAnsi="Ebrima"/>
               </w:rPr>
-              <w:t>2.7.4</w:t>
+              <w:t>2.7.2</w:t>
             </w:r>
           </w:p>
         </w:tc>
@@ -5328,33 +5349,33 @@
               <w:rPr>
                 <w:rFonts w:ascii="Ebrima" w:hAnsi="Ebrima"/>
               </w:rPr>
-              <w:t xml:space="preserve">200.0 </w:t>
-            </w:r>
-          </w:p>
-        </w:tc>
-        <w:tc>
-          <w:tcPr>
-            <w:tcW w:type="dxa" w:w="1234"/>
-          </w:tcPr>
-          <w:p>
-            <w:r>
-              <w:rPr>
-                <w:rFonts w:ascii="Ebrima" w:hAnsi="Ebrima"/>
-              </w:rPr>
-              <w:t xml:space="preserve">208.0 </w:t>
-            </w:r>
-          </w:p>
-        </w:tc>
-        <w:tc>
-          <w:tcPr>
-            <w:tcW w:type="dxa" w:w="1234"/>
-          </w:tcPr>
-          <w:p>
-            <w:r>
-              <w:rPr>
-                <w:rFonts w:ascii="Ebrima" w:hAnsi="Ebrima"/>
-              </w:rPr>
-              <w:t xml:space="preserve">0.0 </w:t>
+              <w:t>200.0</w:t>
+            </w:r>
+          </w:p>
+        </w:tc>
+        <w:tc>
+          <w:tcPr>
+            <w:tcW w:type="dxa" w:w="1234"/>
+          </w:tcPr>
+          <w:p>
+            <w:r>
+              <w:rPr>
+                <w:rFonts w:ascii="Ebrima" w:hAnsi="Ebrima"/>
+              </w:rPr>
+              <w:t>208.0</w:t>
+            </w:r>
+          </w:p>
+        </w:tc>
+        <w:tc>
+          <w:tcPr>
+            <w:tcW w:type="dxa" w:w="1234"/>
+          </w:tcPr>
+          <w:p>
+            <w:r>
+              <w:rPr>
+                <w:rFonts w:ascii="Ebrima" w:hAnsi="Ebrima"/>
+              </w:rPr>
+              <w:t>0.0</w:t>
             </w:r>
           </w:p>
         </w:tc>
@@ -5382,7 +5403,7 @@
               <w:rPr>
                 <w:rFonts w:ascii="Ebrima" w:hAnsi="Ebrima"/>
               </w:rPr>
-              <w:t>2.7.4</w:t>
+              <w:t>2.7.3</w:t>
             </w:r>
           </w:p>
         </w:tc>
@@ -5421,33 +5442,33 @@
               <w:rPr>
                 <w:rFonts w:ascii="Ebrima" w:hAnsi="Ebrima"/>
               </w:rPr>
-              <w:t xml:space="preserve">40.0 </w:t>
-            </w:r>
-          </w:p>
-        </w:tc>
-        <w:tc>
-          <w:tcPr>
-            <w:tcW w:type="dxa" w:w="1234"/>
-          </w:tcPr>
-          <w:p>
-            <w:r>
-              <w:rPr>
-                <w:rFonts w:ascii="Ebrima" w:hAnsi="Ebrima"/>
-              </w:rPr>
-              <w:t xml:space="preserve">50.0 </w:t>
-            </w:r>
-          </w:p>
-        </w:tc>
-        <w:tc>
-          <w:tcPr>
-            <w:tcW w:type="dxa" w:w="1234"/>
-          </w:tcPr>
-          <w:p>
-            <w:r>
-              <w:rPr>
-                <w:rFonts w:ascii="Ebrima" w:hAnsi="Ebrima"/>
-              </w:rPr>
-              <w:t xml:space="preserve">0.0 </w:t>
+              <w:t>40.0</w:t>
+            </w:r>
+          </w:p>
+        </w:tc>
+        <w:tc>
+          <w:tcPr>
+            <w:tcW w:type="dxa" w:w="1234"/>
+          </w:tcPr>
+          <w:p>
+            <w:r>
+              <w:rPr>
+                <w:rFonts w:ascii="Ebrima" w:hAnsi="Ebrima"/>
+              </w:rPr>
+              <w:t>50.0</w:t>
+            </w:r>
+          </w:p>
+        </w:tc>
+        <w:tc>
+          <w:tcPr>
+            <w:tcW w:type="dxa" w:w="1234"/>
+          </w:tcPr>
+          <w:p>
+            <w:r>
+              <w:rPr>
+                <w:rFonts w:ascii="Ebrima" w:hAnsi="Ebrima"/>
+              </w:rPr>
+              <w:t>0.0</w:t>
             </w:r>
           </w:p>
         </w:tc>
@@ -5514,33 +5535,33 @@
               <w:rPr>
                 <w:rFonts w:ascii="Ebrima" w:hAnsi="Ebrima"/>
               </w:rPr>
-              <w:t xml:space="preserve">25.0 </w:t>
-            </w:r>
-          </w:p>
-        </w:tc>
-        <w:tc>
-          <w:tcPr>
-            <w:tcW w:type="dxa" w:w="1234"/>
-          </w:tcPr>
-          <w:p>
-            <w:r>
-              <w:rPr>
-                <w:rFonts w:ascii="Ebrima" w:hAnsi="Ebrima"/>
-              </w:rPr>
-              <w:t xml:space="preserve">25.0 </w:t>
-            </w:r>
-          </w:p>
-        </w:tc>
-        <w:tc>
-          <w:tcPr>
-            <w:tcW w:type="dxa" w:w="1234"/>
-          </w:tcPr>
-          <w:p>
-            <w:r>
-              <w:rPr>
-                <w:rFonts w:ascii="Ebrima" w:hAnsi="Ebrima"/>
-              </w:rPr>
-              <w:t xml:space="preserve">0.0 </w:t>
+              <w:t>25.0</w:t>
+            </w:r>
+          </w:p>
+        </w:tc>
+        <w:tc>
+          <w:tcPr>
+            <w:tcW w:type="dxa" w:w="1234"/>
+          </w:tcPr>
+          <w:p>
+            <w:r>
+              <w:rPr>
+                <w:rFonts w:ascii="Ebrima" w:hAnsi="Ebrima"/>
+              </w:rPr>
+              <w:t>25.0</w:t>
+            </w:r>
+          </w:p>
+        </w:tc>
+        <w:tc>
+          <w:tcPr>
+            <w:tcW w:type="dxa" w:w="1234"/>
+          </w:tcPr>
+          <w:p>
+            <w:r>
+              <w:rPr>
+                <w:rFonts w:ascii="Ebrima" w:hAnsi="Ebrima"/>
+              </w:rPr>
+              <w:t>0.0</w:t>
             </w:r>
           </w:p>
         </w:tc>
@@ -5599,7 +5620,7 @@
               <w:rPr>
                 <w:rFonts w:ascii="Ebrima" w:hAnsi="Ebrima"/>
               </w:rPr>
-              <w:t>2.8.4</w:t>
+              <w:t>2.8.1</w:t>
             </w:r>
           </w:p>
         </w:tc>
@@ -5638,33 +5659,33 @@
               <w:rPr>
                 <w:rFonts w:ascii="Ebrima" w:hAnsi="Ebrima"/>
               </w:rPr>
-              <w:t xml:space="preserve">6000.0 </w:t>
-            </w:r>
-          </w:p>
-        </w:tc>
-        <w:tc>
-          <w:tcPr>
-            <w:tcW w:type="dxa" w:w="1234"/>
-          </w:tcPr>
-          <w:p>
-            <w:r>
-              <w:rPr>
-                <w:rFonts w:ascii="Ebrima" w:hAnsi="Ebrima"/>
-              </w:rPr>
-              <w:t xml:space="preserve">6000.0 </w:t>
-            </w:r>
-          </w:p>
-        </w:tc>
-        <w:tc>
-          <w:tcPr>
-            <w:tcW w:type="dxa" w:w="1234"/>
-          </w:tcPr>
-          <w:p>
-            <w:r>
-              <w:rPr>
-                <w:rFonts w:ascii="Ebrima" w:hAnsi="Ebrima"/>
-              </w:rPr>
-              <w:t xml:space="preserve">0.0 </w:t>
+              <w:t>6000.0</w:t>
+            </w:r>
+          </w:p>
+        </w:tc>
+        <w:tc>
+          <w:tcPr>
+            <w:tcW w:type="dxa" w:w="1234"/>
+          </w:tcPr>
+          <w:p>
+            <w:r>
+              <w:rPr>
+                <w:rFonts w:ascii="Ebrima" w:hAnsi="Ebrima"/>
+              </w:rPr>
+              <w:t>6000.0</w:t>
+            </w:r>
+          </w:p>
+        </w:tc>
+        <w:tc>
+          <w:tcPr>
+            <w:tcW w:type="dxa" w:w="1234"/>
+          </w:tcPr>
+          <w:p>
+            <w:r>
+              <w:rPr>
+                <w:rFonts w:ascii="Ebrima" w:hAnsi="Ebrima"/>
+              </w:rPr>
+              <w:t>0.0</w:t>
             </w:r>
           </w:p>
         </w:tc>
@@ -5692,7 +5713,7 @@
               <w:rPr>
                 <w:rFonts w:ascii="Ebrima" w:hAnsi="Ebrima"/>
               </w:rPr>
-              <w:t>2.8.4</w:t>
+              <w:t>2.8.2</w:t>
             </w:r>
           </w:p>
         </w:tc>
@@ -5731,33 +5752,33 @@
               <w:rPr>
                 <w:rFonts w:ascii="Ebrima" w:hAnsi="Ebrima"/>
               </w:rPr>
-              <w:t xml:space="preserve">10.0 </w:t>
-            </w:r>
-          </w:p>
-        </w:tc>
-        <w:tc>
-          <w:tcPr>
-            <w:tcW w:type="dxa" w:w="1234"/>
-          </w:tcPr>
-          <w:p>
-            <w:r>
-              <w:rPr>
-                <w:rFonts w:ascii="Ebrima" w:hAnsi="Ebrima"/>
-              </w:rPr>
-              <w:t xml:space="preserve">10.0 </w:t>
-            </w:r>
-          </w:p>
-        </w:tc>
-        <w:tc>
-          <w:tcPr>
-            <w:tcW w:type="dxa" w:w="1234"/>
-          </w:tcPr>
-          <w:p>
-            <w:r>
-              <w:rPr>
-                <w:rFonts w:ascii="Ebrima" w:hAnsi="Ebrima"/>
-              </w:rPr>
-              <w:t xml:space="preserve">0.0 </w:t>
+              <w:t>10.0</w:t>
+            </w:r>
+          </w:p>
+        </w:tc>
+        <w:tc>
+          <w:tcPr>
+            <w:tcW w:type="dxa" w:w="1234"/>
+          </w:tcPr>
+          <w:p>
+            <w:r>
+              <w:rPr>
+                <w:rFonts w:ascii="Ebrima" w:hAnsi="Ebrima"/>
+              </w:rPr>
+              <w:t>10.0</w:t>
+            </w:r>
+          </w:p>
+        </w:tc>
+        <w:tc>
+          <w:tcPr>
+            <w:tcW w:type="dxa" w:w="1234"/>
+          </w:tcPr>
+          <w:p>
+            <w:r>
+              <w:rPr>
+                <w:rFonts w:ascii="Ebrima" w:hAnsi="Ebrima"/>
+              </w:rPr>
+              <w:t>0.0</w:t>
             </w:r>
           </w:p>
         </w:tc>
@@ -5785,7 +5806,7 @@
               <w:rPr>
                 <w:rFonts w:ascii="Ebrima" w:hAnsi="Ebrima"/>
               </w:rPr>
-              <w:t>2.8.4</w:t>
+              <w:t>2.8.3</w:t>
             </w:r>
           </w:p>
         </w:tc>
@@ -5917,33 +5938,33 @@
               <w:rPr>
                 <w:rFonts w:ascii="Ebrima" w:hAnsi="Ebrima"/>
               </w:rPr>
-              <w:t xml:space="preserve">62.0 </w:t>
-            </w:r>
-          </w:p>
-        </w:tc>
-        <w:tc>
-          <w:tcPr>
-            <w:tcW w:type="dxa" w:w="1234"/>
-          </w:tcPr>
-          <w:p>
-            <w:r>
-              <w:rPr>
-                <w:rFonts w:ascii="Ebrima" w:hAnsi="Ebrima"/>
-              </w:rPr>
-              <w:t xml:space="preserve">100.0 </w:t>
-            </w:r>
-          </w:p>
-        </w:tc>
-        <w:tc>
-          <w:tcPr>
-            <w:tcW w:type="dxa" w:w="1234"/>
-          </w:tcPr>
-          <w:p>
-            <w:r>
-              <w:rPr>
-                <w:rFonts w:ascii="Ebrima" w:hAnsi="Ebrima"/>
-              </w:rPr>
-              <w:t xml:space="preserve">0.0 </w:t>
+              <w:t>62.0</w:t>
+            </w:r>
+          </w:p>
+        </w:tc>
+        <w:tc>
+          <w:tcPr>
+            <w:tcW w:type="dxa" w:w="1234"/>
+          </w:tcPr>
+          <w:p>
+            <w:r>
+              <w:rPr>
+                <w:rFonts w:ascii="Ebrima" w:hAnsi="Ebrima"/>
+              </w:rPr>
+              <w:t>100.0</w:t>
+            </w:r>
+          </w:p>
+        </w:tc>
+        <w:tc>
+          <w:tcPr>
+            <w:tcW w:type="dxa" w:w="1234"/>
+          </w:tcPr>
+          <w:p>
+            <w:r>
+              <w:rPr>
+                <w:rFonts w:ascii="Ebrima" w:hAnsi="Ebrima"/>
+              </w:rPr>
+              <w:t>0.0</w:t>
             </w:r>
           </w:p>
         </w:tc>
@@ -5971,7 +5992,7 @@
               <w:rPr>
                 <w:rFonts w:ascii="Ebrima" w:hAnsi="Ebrima"/>
               </w:rPr>
-              <w:t>2.8.4</w:t>
+              <w:t>2.8.5</w:t>
             </w:r>
           </w:p>
         </w:tc>
@@ -6064,7 +6085,7 @@
               <w:rPr>
                 <w:rFonts w:ascii="Ebrima" w:hAnsi="Ebrima"/>
               </w:rPr>
-              <w:t>2.8.4</w:t>
+              <w:t>2.8.6</w:t>
             </w:r>
           </w:p>
         </w:tc>
@@ -6103,33 +6124,33 @@
               <w:rPr>
                 <w:rFonts w:ascii="Ebrima" w:hAnsi="Ebrima"/>
               </w:rPr>
-              <w:t xml:space="preserve">1286.0 </w:t>
-            </w:r>
-          </w:p>
-        </w:tc>
-        <w:tc>
-          <w:tcPr>
-            <w:tcW w:type="dxa" w:w="1234"/>
-          </w:tcPr>
-          <w:p>
-            <w:r>
-              <w:rPr>
-                <w:rFonts w:ascii="Ebrima" w:hAnsi="Ebrima"/>
-              </w:rPr>
-              <w:t xml:space="preserve">1600.0 </w:t>
-            </w:r>
-          </w:p>
-        </w:tc>
-        <w:tc>
-          <w:tcPr>
-            <w:tcW w:type="dxa" w:w="1234"/>
-          </w:tcPr>
-          <w:p>
-            <w:r>
-              <w:rPr>
-                <w:rFonts w:ascii="Ebrima" w:hAnsi="Ebrima"/>
-              </w:rPr>
-              <w:t xml:space="preserve">0.0 </w:t>
+              <w:t>1286.0</w:t>
+            </w:r>
+          </w:p>
+        </w:tc>
+        <w:tc>
+          <w:tcPr>
+            <w:tcW w:type="dxa" w:w="1234"/>
+          </w:tcPr>
+          <w:p>
+            <w:r>
+              <w:rPr>
+                <w:rFonts w:ascii="Ebrima" w:hAnsi="Ebrima"/>
+              </w:rPr>
+              <w:t>1600.0</w:t>
+            </w:r>
+          </w:p>
+        </w:tc>
+        <w:tc>
+          <w:tcPr>
+            <w:tcW w:type="dxa" w:w="1234"/>
+          </w:tcPr>
+          <w:p>
+            <w:r>
+              <w:rPr>
+                <w:rFonts w:ascii="Ebrima" w:hAnsi="Ebrima"/>
+              </w:rPr>
+              <w:t>0.0</w:t>
             </w:r>
           </w:p>
         </w:tc>
@@ -6157,7 +6178,7 @@
               <w:rPr>
                 <w:rFonts w:ascii="Ebrima" w:hAnsi="Ebrima"/>
               </w:rPr>
-              <w:t>2.8.4</w:t>
+              <w:t>2.8.7</w:t>
             </w:r>
           </w:p>
         </w:tc>
@@ -6250,7 +6271,7 @@
               <w:rPr>
                 <w:rFonts w:ascii="Ebrima" w:hAnsi="Ebrima"/>
               </w:rPr>
-              <w:t>2.8.4</w:t>
+              <w:t>2.8.8</w:t>
             </w:r>
           </w:p>
         </w:tc>
@@ -6289,33 +6310,33 @@
               <w:rPr>
                 <w:rFonts w:ascii="Ebrima" w:hAnsi="Ebrima"/>
               </w:rPr>
-              <w:t xml:space="preserve">100.0 </w:t>
-            </w:r>
-          </w:p>
-        </w:tc>
-        <w:tc>
-          <w:tcPr>
-            <w:tcW w:type="dxa" w:w="1234"/>
-          </w:tcPr>
-          <w:p>
-            <w:r>
-              <w:rPr>
-                <w:rFonts w:ascii="Ebrima" w:hAnsi="Ebrima"/>
-              </w:rPr>
-              <w:t xml:space="preserve">100.0 </w:t>
-            </w:r>
-          </w:p>
-        </w:tc>
-        <w:tc>
-          <w:tcPr>
-            <w:tcW w:type="dxa" w:w="1234"/>
-          </w:tcPr>
-          <w:p>
-            <w:r>
-              <w:rPr>
-                <w:rFonts w:ascii="Ebrima" w:hAnsi="Ebrima"/>
-              </w:rPr>
-              <w:t xml:space="preserve">0.0 </w:t>
+              <w:t>100.0</w:t>
+            </w:r>
+          </w:p>
+        </w:tc>
+        <w:tc>
+          <w:tcPr>
+            <w:tcW w:type="dxa" w:w="1234"/>
+          </w:tcPr>
+          <w:p>
+            <w:r>
+              <w:rPr>
+                <w:rFonts w:ascii="Ebrima" w:hAnsi="Ebrima"/>
+              </w:rPr>
+              <w:t>100.0</w:t>
+            </w:r>
+          </w:p>
+        </w:tc>
+        <w:tc>
+          <w:tcPr>
+            <w:tcW w:type="dxa" w:w="1234"/>
+          </w:tcPr>
+          <w:p>
+            <w:r>
+              <w:rPr>
+                <w:rFonts w:ascii="Ebrima" w:hAnsi="Ebrima"/>
+              </w:rPr>
+              <w:t>0.0</w:t>
             </w:r>
           </w:p>
         </w:tc>
@@ -6343,7 +6364,7 @@
               <w:rPr>
                 <w:rFonts w:ascii="Ebrima" w:hAnsi="Ebrima"/>
               </w:rPr>
-              <w:t>2.8.4</w:t>
+              <w:t>2.8.9</w:t>
             </w:r>
           </w:p>
         </w:tc>
@@ -6436,7 +6457,7 @@
               <w:rPr>
                 <w:rFonts w:ascii="Ebrima" w:hAnsi="Ebrima"/>
               </w:rPr>
-              <w:t>2.8.4</w:t>
+              <w:t>2.8.10</w:t>
             </w:r>
           </w:p>
         </w:tc>
@@ -6593,7 +6614,7 @@
               <w:rPr>
                 <w:rFonts w:ascii="Ebrima" w:hAnsi="Ebrima"/>
               </w:rPr>
-              <w:t>3.1.4</w:t>
+              <w:t>3.1.1</w:t>
             </w:r>
           </w:p>
         </w:tc>
@@ -6686,7 +6707,7 @@
               <w:rPr>
                 <w:rFonts w:ascii="Ebrima" w:hAnsi="Ebrima"/>
               </w:rPr>
-              <w:t>3.1.4</w:t>
+              <w:t>3.1.2</w:t>
             </w:r>
           </w:p>
         </w:tc>
@@ -6725,33 +6746,33 @@
               <w:rPr>
                 <w:rFonts w:ascii="Ebrima" w:hAnsi="Ebrima"/>
               </w:rPr>
-              <w:t xml:space="preserve">25500.0 </w:t>
-            </w:r>
-          </w:p>
-        </w:tc>
-        <w:tc>
-          <w:tcPr>
-            <w:tcW w:type="dxa" w:w="1234"/>
-          </w:tcPr>
-          <w:p>
-            <w:r>
-              <w:rPr>
-                <w:rFonts w:ascii="Ebrima" w:hAnsi="Ebrima"/>
-              </w:rPr>
-              <w:t xml:space="preserve">25500.0 </w:t>
-            </w:r>
-          </w:p>
-        </w:tc>
-        <w:tc>
-          <w:tcPr>
-            <w:tcW w:type="dxa" w:w="1234"/>
-          </w:tcPr>
-          <w:p>
-            <w:r>
-              <w:rPr>
-                <w:rFonts w:ascii="Ebrima" w:hAnsi="Ebrima"/>
-              </w:rPr>
-              <w:t xml:space="preserve">0.0 </w:t>
+              <w:t>25500.0</w:t>
+            </w:r>
+          </w:p>
+        </w:tc>
+        <w:tc>
+          <w:tcPr>
+            <w:tcW w:type="dxa" w:w="1234"/>
+          </w:tcPr>
+          <w:p>
+            <w:r>
+              <w:rPr>
+                <w:rFonts w:ascii="Ebrima" w:hAnsi="Ebrima"/>
+              </w:rPr>
+              <w:t>25500.0</w:t>
+            </w:r>
+          </w:p>
+        </w:tc>
+        <w:tc>
+          <w:tcPr>
+            <w:tcW w:type="dxa" w:w="1234"/>
+          </w:tcPr>
+          <w:p>
+            <w:r>
+              <w:rPr>
+                <w:rFonts w:ascii="Ebrima" w:hAnsi="Ebrima"/>
+              </w:rPr>
+              <w:t>0.0</w:t>
             </w:r>
           </w:p>
         </w:tc>
@@ -6779,7 +6800,7 @@
               <w:rPr>
                 <w:rFonts w:ascii="Ebrima" w:hAnsi="Ebrima"/>
               </w:rPr>
-              <w:t>3.1.4</w:t>
+              <w:t>3.1.3</w:t>
             </w:r>
           </w:p>
         </w:tc>
@@ -6818,33 +6839,33 @@
               <w:rPr>
                 <w:rFonts w:ascii="Ebrima" w:hAnsi="Ebrima"/>
               </w:rPr>
-              <w:t xml:space="preserve">48000.0 </w:t>
-            </w:r>
-          </w:p>
-        </w:tc>
-        <w:tc>
-          <w:tcPr>
-            <w:tcW w:type="dxa" w:w="1234"/>
-          </w:tcPr>
-          <w:p>
-            <w:r>
-              <w:rPr>
-                <w:rFonts w:ascii="Ebrima" w:hAnsi="Ebrima"/>
-              </w:rPr>
-              <w:t xml:space="preserve">70000.0 </w:t>
-            </w:r>
-          </w:p>
-        </w:tc>
-        <w:tc>
-          <w:tcPr>
-            <w:tcW w:type="dxa" w:w="1234"/>
-          </w:tcPr>
-          <w:p>
-            <w:r>
-              <w:rPr>
-                <w:rFonts w:ascii="Ebrima" w:hAnsi="Ebrima"/>
-              </w:rPr>
-              <w:t xml:space="preserve">0.0 </w:t>
+              <w:t>48000.0</w:t>
+            </w:r>
+          </w:p>
+        </w:tc>
+        <w:tc>
+          <w:tcPr>
+            <w:tcW w:type="dxa" w:w="1234"/>
+          </w:tcPr>
+          <w:p>
+            <w:r>
+              <w:rPr>
+                <w:rFonts w:ascii="Ebrima" w:hAnsi="Ebrima"/>
+              </w:rPr>
+              <w:t>70000.0</w:t>
+            </w:r>
+          </w:p>
+        </w:tc>
+        <w:tc>
+          <w:tcPr>
+            <w:tcW w:type="dxa" w:w="1234"/>
+          </w:tcPr>
+          <w:p>
+            <w:r>
+              <w:rPr>
+                <w:rFonts w:ascii="Ebrima" w:hAnsi="Ebrima"/>
+              </w:rPr>
+              <w:t>0.0</w:t>
             </w:r>
           </w:p>
         </w:tc>
@@ -6911,33 +6932,33 @@
               <w:rPr>
                 <w:rFonts w:ascii="Ebrima" w:hAnsi="Ebrima"/>
               </w:rPr>
-              <w:t xml:space="preserve">5000.0 </w:t>
-            </w:r>
-          </w:p>
-        </w:tc>
-        <w:tc>
-          <w:tcPr>
-            <w:tcW w:type="dxa" w:w="1234"/>
-          </w:tcPr>
-          <w:p>
-            <w:r>
-              <w:rPr>
-                <w:rFonts w:ascii="Ebrima" w:hAnsi="Ebrima"/>
-              </w:rPr>
-              <w:t xml:space="preserve">5000.0 </w:t>
-            </w:r>
-          </w:p>
-        </w:tc>
-        <w:tc>
-          <w:tcPr>
-            <w:tcW w:type="dxa" w:w="1234"/>
-          </w:tcPr>
-          <w:p>
-            <w:r>
-              <w:rPr>
-                <w:rFonts w:ascii="Ebrima" w:hAnsi="Ebrima"/>
-              </w:rPr>
-              <w:t xml:space="preserve">0.0 </w:t>
+              <w:t>5000.0</w:t>
+            </w:r>
+          </w:p>
+        </w:tc>
+        <w:tc>
+          <w:tcPr>
+            <w:tcW w:type="dxa" w:w="1234"/>
+          </w:tcPr>
+          <w:p>
+            <w:r>
+              <w:rPr>
+                <w:rFonts w:ascii="Ebrima" w:hAnsi="Ebrima"/>
+              </w:rPr>
+              <w:t>5000.0</w:t>
+            </w:r>
+          </w:p>
+        </w:tc>
+        <w:tc>
+          <w:tcPr>
+            <w:tcW w:type="dxa" w:w="1234"/>
+          </w:tcPr>
+          <w:p>
+            <w:r>
+              <w:rPr>
+                <w:rFonts w:ascii="Ebrima" w:hAnsi="Ebrima"/>
+              </w:rPr>
+              <w:t>0.0</w:t>
             </w:r>
           </w:p>
         </w:tc>
@@ -6996,7 +7017,7 @@
               <w:rPr>
                 <w:rFonts w:ascii="Ebrima" w:hAnsi="Ebrima"/>
               </w:rPr>
-              <w:t>3.2.4</w:t>
+              <w:t>3.2.1</w:t>
             </w:r>
           </w:p>
         </w:tc>
@@ -7089,7 +7110,7 @@
               <w:rPr>
                 <w:rFonts w:ascii="Ebrima" w:hAnsi="Ebrima"/>
               </w:rPr>
-              <w:t>3.2.4</w:t>
+              <w:t>3.2.2</w:t>
             </w:r>
           </w:p>
         </w:tc>
@@ -7128,33 +7149,33 @@
               <w:rPr>
                 <w:rFonts w:ascii="Ebrima" w:hAnsi="Ebrima"/>
               </w:rPr>
-              <w:t xml:space="preserve">25000.0 </w:t>
-            </w:r>
-          </w:p>
-        </w:tc>
-        <w:tc>
-          <w:tcPr>
-            <w:tcW w:type="dxa" w:w="1234"/>
-          </w:tcPr>
-          <w:p>
-            <w:r>
-              <w:rPr>
-                <w:rFonts w:ascii="Ebrima" w:hAnsi="Ebrima"/>
-              </w:rPr>
-              <w:t xml:space="preserve">25000.0 </w:t>
-            </w:r>
-          </w:p>
-        </w:tc>
-        <w:tc>
-          <w:tcPr>
-            <w:tcW w:type="dxa" w:w="1234"/>
-          </w:tcPr>
-          <w:p>
-            <w:r>
-              <w:rPr>
-                <w:rFonts w:ascii="Ebrima" w:hAnsi="Ebrima"/>
-              </w:rPr>
-              <w:t xml:space="preserve">0.0 </w:t>
+              <w:t>25000.0</w:t>
+            </w:r>
+          </w:p>
+        </w:tc>
+        <w:tc>
+          <w:tcPr>
+            <w:tcW w:type="dxa" w:w="1234"/>
+          </w:tcPr>
+          <w:p>
+            <w:r>
+              <w:rPr>
+                <w:rFonts w:ascii="Ebrima" w:hAnsi="Ebrima"/>
+              </w:rPr>
+              <w:t>25000.0</w:t>
+            </w:r>
+          </w:p>
+        </w:tc>
+        <w:tc>
+          <w:tcPr>
+            <w:tcW w:type="dxa" w:w="1234"/>
+          </w:tcPr>
+          <w:p>
+            <w:r>
+              <w:rPr>
+                <w:rFonts w:ascii="Ebrima" w:hAnsi="Ebrima"/>
+              </w:rPr>
+              <w:t>0.0</w:t>
             </w:r>
           </w:p>
         </w:tc>
@@ -7182,7 +7203,7 @@
               <w:rPr>
                 <w:rFonts w:ascii="Ebrima" w:hAnsi="Ebrima"/>
               </w:rPr>
-              <w:t>3.2.4</w:t>
+              <w:t>3.2.3</w:t>
             </w:r>
           </w:p>
         </w:tc>
@@ -7221,33 +7242,33 @@
               <w:rPr>
                 <w:rFonts w:ascii="Ebrima" w:hAnsi="Ebrima"/>
               </w:rPr>
-              <w:t xml:space="preserve">48000.0 </w:t>
-            </w:r>
-          </w:p>
-        </w:tc>
-        <w:tc>
-          <w:tcPr>
-            <w:tcW w:type="dxa" w:w="1234"/>
-          </w:tcPr>
-          <w:p>
-            <w:r>
-              <w:rPr>
-                <w:rFonts w:ascii="Ebrima" w:hAnsi="Ebrima"/>
-              </w:rPr>
-              <w:t xml:space="preserve">70000.0 </w:t>
-            </w:r>
-          </w:p>
-        </w:tc>
-        <w:tc>
-          <w:tcPr>
-            <w:tcW w:type="dxa" w:w="1234"/>
-          </w:tcPr>
-          <w:p>
-            <w:r>
-              <w:rPr>
-                <w:rFonts w:ascii="Ebrima" w:hAnsi="Ebrima"/>
-              </w:rPr>
-              <w:t xml:space="preserve">0.0 </w:t>
+              <w:t>48000.0</w:t>
+            </w:r>
+          </w:p>
+        </w:tc>
+        <w:tc>
+          <w:tcPr>
+            <w:tcW w:type="dxa" w:w="1234"/>
+          </w:tcPr>
+          <w:p>
+            <w:r>
+              <w:rPr>
+                <w:rFonts w:ascii="Ebrima" w:hAnsi="Ebrima"/>
+              </w:rPr>
+              <w:t>70000.0</w:t>
+            </w:r>
+          </w:p>
+        </w:tc>
+        <w:tc>
+          <w:tcPr>
+            <w:tcW w:type="dxa" w:w="1234"/>
+          </w:tcPr>
+          <w:p>
+            <w:r>
+              <w:rPr>
+                <w:rFonts w:ascii="Ebrima" w:hAnsi="Ebrima"/>
+              </w:rPr>
+              <w:t>0.0</w:t>
             </w:r>
           </w:p>
         </w:tc>
@@ -7314,33 +7335,33 @@
               <w:rPr>
                 <w:rFonts w:ascii="Ebrima" w:hAnsi="Ebrima"/>
               </w:rPr>
-              <w:t xml:space="preserve">5000.0 </w:t>
-            </w:r>
-          </w:p>
-        </w:tc>
-        <w:tc>
-          <w:tcPr>
-            <w:tcW w:type="dxa" w:w="1234"/>
-          </w:tcPr>
-          <w:p>
-            <w:r>
-              <w:rPr>
-                <w:rFonts w:ascii="Ebrima" w:hAnsi="Ebrima"/>
-              </w:rPr>
-              <w:t xml:space="preserve">5000.0 </w:t>
-            </w:r>
-          </w:p>
-        </w:tc>
-        <w:tc>
-          <w:tcPr>
-            <w:tcW w:type="dxa" w:w="1234"/>
-          </w:tcPr>
-          <w:p>
-            <w:r>
-              <w:rPr>
-                <w:rFonts w:ascii="Ebrima" w:hAnsi="Ebrima"/>
-              </w:rPr>
-              <w:t xml:space="preserve">0.0 </w:t>
+              <w:t>5000.0</w:t>
+            </w:r>
+          </w:p>
+        </w:tc>
+        <w:tc>
+          <w:tcPr>
+            <w:tcW w:type="dxa" w:w="1234"/>
+          </w:tcPr>
+          <w:p>
+            <w:r>
+              <w:rPr>
+                <w:rFonts w:ascii="Ebrima" w:hAnsi="Ebrima"/>
+              </w:rPr>
+              <w:t>5000.0</w:t>
+            </w:r>
+          </w:p>
+        </w:tc>
+        <w:tc>
+          <w:tcPr>
+            <w:tcW w:type="dxa" w:w="1234"/>
+          </w:tcPr>
+          <w:p>
+            <w:r>
+              <w:rPr>
+                <w:rFonts w:ascii="Ebrima" w:hAnsi="Ebrima"/>
+              </w:rPr>
+              <w:t>0.0</w:t>
             </w:r>
           </w:p>
         </w:tc>
@@ -7368,7 +7389,7 @@
               <w:rPr>
                 <w:rFonts w:ascii="Ebrima" w:hAnsi="Ebrima"/>
               </w:rPr>
-              <w:t>3.2.4</w:t>
+              <w:t>3.2.5</w:t>
             </w:r>
           </w:p>
         </w:tc>
@@ -7407,33 +7428,33 @@
               <w:rPr>
                 <w:rFonts w:ascii="Ebrima" w:hAnsi="Ebrima"/>
               </w:rPr>
-              <w:t xml:space="preserve">10.0 </w:t>
-            </w:r>
-          </w:p>
-        </w:tc>
-        <w:tc>
-          <w:tcPr>
-            <w:tcW w:type="dxa" w:w="1234"/>
-          </w:tcPr>
-          <w:p>
-            <w:r>
-              <w:rPr>
-                <w:rFonts w:ascii="Ebrima" w:hAnsi="Ebrima"/>
-              </w:rPr>
-              <w:t xml:space="preserve">3.0 </w:t>
-            </w:r>
-          </w:p>
-        </w:tc>
-        <w:tc>
-          <w:tcPr>
-            <w:tcW w:type="dxa" w:w="1234"/>
-          </w:tcPr>
-          <w:p>
-            <w:r>
-              <w:rPr>
-                <w:rFonts w:ascii="Ebrima" w:hAnsi="Ebrima"/>
-              </w:rPr>
-              <w:t xml:space="preserve">0.0 </w:t>
+              <w:t>10.0</w:t>
+            </w:r>
+          </w:p>
+        </w:tc>
+        <w:tc>
+          <w:tcPr>
+            <w:tcW w:type="dxa" w:w="1234"/>
+          </w:tcPr>
+          <w:p>
+            <w:r>
+              <w:rPr>
+                <w:rFonts w:ascii="Ebrima" w:hAnsi="Ebrima"/>
+              </w:rPr>
+              <w:t>3.0</w:t>
+            </w:r>
+          </w:p>
+        </w:tc>
+        <w:tc>
+          <w:tcPr>
+            <w:tcW w:type="dxa" w:w="1234"/>
+          </w:tcPr>
+          <w:p>
+            <w:r>
+              <w:rPr>
+                <w:rFonts w:ascii="Ebrima" w:hAnsi="Ebrima"/>
+              </w:rPr>
+              <w:t>0.0</w:t>
             </w:r>
           </w:p>
         </w:tc>
@@ -7525,7 +7546,7 @@
               <w:rPr>
                 <w:rFonts w:ascii="Ebrima" w:hAnsi="Ebrima"/>
               </w:rPr>
-              <w:t>4.1.4</w:t>
+              <w:t>4.1.1</w:t>
             </w:r>
           </w:p>
         </w:tc>
@@ -7564,33 +7585,33 @@
               <w:rPr>
                 <w:rFonts w:ascii="Ebrima" w:hAnsi="Ebrima"/>
               </w:rPr>
-              <w:t xml:space="preserve">11.0 </w:t>
-            </w:r>
-          </w:p>
-        </w:tc>
-        <w:tc>
-          <w:tcPr>
-            <w:tcW w:type="dxa" w:w="1234"/>
-          </w:tcPr>
-          <w:p>
-            <w:r>
-              <w:rPr>
-                <w:rFonts w:ascii="Ebrima" w:hAnsi="Ebrima"/>
-              </w:rPr>
-              <w:t xml:space="preserve">3.0 </w:t>
-            </w:r>
-          </w:p>
-        </w:tc>
-        <w:tc>
-          <w:tcPr>
-            <w:tcW w:type="dxa" w:w="1234"/>
-          </w:tcPr>
-          <w:p>
-            <w:r>
-              <w:rPr>
-                <w:rFonts w:ascii="Ebrima" w:hAnsi="Ebrima"/>
-              </w:rPr>
-              <w:t xml:space="preserve">0.0 </w:t>
+              <w:t>11.0</w:t>
+            </w:r>
+          </w:p>
+        </w:tc>
+        <w:tc>
+          <w:tcPr>
+            <w:tcW w:type="dxa" w:w="1234"/>
+          </w:tcPr>
+          <w:p>
+            <w:r>
+              <w:rPr>
+                <w:rFonts w:ascii="Ebrima" w:hAnsi="Ebrima"/>
+              </w:rPr>
+              <w:t>3.0</w:t>
+            </w:r>
+          </w:p>
+        </w:tc>
+        <w:tc>
+          <w:tcPr>
+            <w:tcW w:type="dxa" w:w="1234"/>
+          </w:tcPr>
+          <w:p>
+            <w:r>
+              <w:rPr>
+                <w:rFonts w:ascii="Ebrima" w:hAnsi="Ebrima"/>
+              </w:rPr>
+              <w:t>0.0</w:t>
             </w:r>
           </w:p>
         </w:tc>
@@ -7618,7 +7639,7 @@
               <w:rPr>
                 <w:rFonts w:ascii="Ebrima" w:hAnsi="Ebrima"/>
               </w:rPr>
-              <w:t>4.1.4</w:t>
+              <w:t>4.1.2</w:t>
             </w:r>
           </w:p>
         </w:tc>
@@ -7657,33 +7678,33 @@
               <w:rPr>
                 <w:rFonts w:ascii="Ebrima" w:hAnsi="Ebrima"/>
               </w:rPr>
-              <w:t xml:space="preserve">8.0 </w:t>
-            </w:r>
-          </w:p>
-        </w:tc>
-        <w:tc>
-          <w:tcPr>
-            <w:tcW w:type="dxa" w:w="1234"/>
-          </w:tcPr>
-          <w:p>
-            <w:r>
-              <w:rPr>
-                <w:rFonts w:ascii="Ebrima" w:hAnsi="Ebrima"/>
-              </w:rPr>
-              <w:t xml:space="preserve">6.0 </w:t>
-            </w:r>
-          </w:p>
-        </w:tc>
-        <w:tc>
-          <w:tcPr>
-            <w:tcW w:type="dxa" w:w="1234"/>
-          </w:tcPr>
-          <w:p>
-            <w:r>
-              <w:rPr>
-                <w:rFonts w:ascii="Ebrima" w:hAnsi="Ebrima"/>
-              </w:rPr>
-              <w:t xml:space="preserve">0.0 </w:t>
+              <w:t>8.0</w:t>
+            </w:r>
+          </w:p>
+        </w:tc>
+        <w:tc>
+          <w:tcPr>
+            <w:tcW w:type="dxa" w:w="1234"/>
+          </w:tcPr>
+          <w:p>
+            <w:r>
+              <w:rPr>
+                <w:rFonts w:ascii="Ebrima" w:hAnsi="Ebrima"/>
+              </w:rPr>
+              <w:t>6.0</w:t>
+            </w:r>
+          </w:p>
+        </w:tc>
+        <w:tc>
+          <w:tcPr>
+            <w:tcW w:type="dxa" w:w="1234"/>
+          </w:tcPr>
+          <w:p>
+            <w:r>
+              <w:rPr>
+                <w:rFonts w:ascii="Ebrima" w:hAnsi="Ebrima"/>
+              </w:rPr>
+              <w:t>0.0</w:t>
             </w:r>
           </w:p>
         </w:tc>
@@ -7742,7 +7763,7 @@
               <w:rPr>
                 <w:rFonts w:ascii="Ebrima" w:hAnsi="Ebrima"/>
               </w:rPr>
-              <w:t>4.2.4</w:t>
+              <w:t>4.2.1</w:t>
             </w:r>
           </w:p>
         </w:tc>
@@ -7781,33 +7802,33 @@
               <w:rPr>
                 <w:rFonts w:ascii="Ebrima" w:hAnsi="Ebrima"/>
               </w:rPr>
-              <w:t xml:space="preserve">11.0 </w:t>
-            </w:r>
-          </w:p>
-        </w:tc>
-        <w:tc>
-          <w:tcPr>
-            <w:tcW w:type="dxa" w:w="1234"/>
-          </w:tcPr>
-          <w:p>
-            <w:r>
-              <w:rPr>
-                <w:rFonts w:ascii="Ebrima" w:hAnsi="Ebrima"/>
-              </w:rPr>
-              <w:t xml:space="preserve">3.0 </w:t>
-            </w:r>
-          </w:p>
-        </w:tc>
-        <w:tc>
-          <w:tcPr>
-            <w:tcW w:type="dxa" w:w="1234"/>
-          </w:tcPr>
-          <w:p>
-            <w:r>
-              <w:rPr>
-                <w:rFonts w:ascii="Ebrima" w:hAnsi="Ebrima"/>
-              </w:rPr>
-              <w:t xml:space="preserve">0.0 </w:t>
+              <w:t>11.0</w:t>
+            </w:r>
+          </w:p>
+        </w:tc>
+        <w:tc>
+          <w:tcPr>
+            <w:tcW w:type="dxa" w:w="1234"/>
+          </w:tcPr>
+          <w:p>
+            <w:r>
+              <w:rPr>
+                <w:rFonts w:ascii="Ebrima" w:hAnsi="Ebrima"/>
+              </w:rPr>
+              <w:t>3.0</w:t>
+            </w:r>
+          </w:p>
+        </w:tc>
+        <w:tc>
+          <w:tcPr>
+            <w:tcW w:type="dxa" w:w="1234"/>
+          </w:tcPr>
+          <w:p>
+            <w:r>
+              <w:rPr>
+                <w:rFonts w:ascii="Ebrima" w:hAnsi="Ebrima"/>
+              </w:rPr>
+              <w:t>0.0</w:t>
             </w:r>
           </w:p>
         </w:tc>
@@ -7835,7 +7856,7 @@
               <w:rPr>
                 <w:rFonts w:ascii="Ebrima" w:hAnsi="Ebrima"/>
               </w:rPr>
-              <w:t>4.2.4</w:t>
+              <w:t>4.2.2</w:t>
             </w:r>
           </w:p>
         </w:tc>
@@ -7874,33 +7895,33 @@
               <w:rPr>
                 <w:rFonts w:ascii="Ebrima" w:hAnsi="Ebrima"/>
               </w:rPr>
-              <w:t xml:space="preserve">6.0 </w:t>
-            </w:r>
-          </w:p>
-        </w:tc>
-        <w:tc>
-          <w:tcPr>
-            <w:tcW w:type="dxa" w:w="1234"/>
-          </w:tcPr>
-          <w:p>
-            <w:r>
-              <w:rPr>
-                <w:rFonts w:ascii="Ebrima" w:hAnsi="Ebrima"/>
-              </w:rPr>
-              <w:t xml:space="preserve">3.0 </w:t>
-            </w:r>
-          </w:p>
-        </w:tc>
-        <w:tc>
-          <w:tcPr>
-            <w:tcW w:type="dxa" w:w="1234"/>
-          </w:tcPr>
-          <w:p>
-            <w:r>
-              <w:rPr>
-                <w:rFonts w:ascii="Ebrima" w:hAnsi="Ebrima"/>
-              </w:rPr>
-              <w:t xml:space="preserve">0.0 </w:t>
+              <w:t>6.0</w:t>
+            </w:r>
+          </w:p>
+        </w:tc>
+        <w:tc>
+          <w:tcPr>
+            <w:tcW w:type="dxa" w:w="1234"/>
+          </w:tcPr>
+          <w:p>
+            <w:r>
+              <w:rPr>
+                <w:rFonts w:ascii="Ebrima" w:hAnsi="Ebrima"/>
+              </w:rPr>
+              <w:t>3.0</w:t>
+            </w:r>
+          </w:p>
+        </w:tc>
+        <w:tc>
+          <w:tcPr>
+            <w:tcW w:type="dxa" w:w="1234"/>
+          </w:tcPr>
+          <w:p>
+            <w:r>
+              <w:rPr>
+                <w:rFonts w:ascii="Ebrima" w:hAnsi="Ebrima"/>
+              </w:rPr>
+              <w:t>0.0</w:t>
             </w:r>
           </w:p>
         </w:tc>

</xml_diff>

<commit_message>
Revert "Merge remote-tracking branch 'origin/hot-fix/summmary-filter-and-reportgeneration-order' into ci-cd-setup"
This reverts commit 646912b026d6deb245dc5b8573f0c13c457b5dac, reversing
changes made to 56849e2b956ef25d963d13ec6da8f5394a9d0156.
</commit_message>
<xml_diff>
--- a/backend/media/documents/2018_year_ኢትዮጵያ_አርቴፊሻል_ኢንተለጀንስ_ኢንስቲትዩት_report.docx
+++ b/backend/media/documents/2018_year_ኢትዮጵያ_አርቴፊሻል_ኢንተለጀንስ_ኢንስቲትዩት_report.docx
@@ -9,7 +9,7 @@
       <w:r>
         <w:drawing>
           <wp:inline xmlns:a="http://schemas.openxmlformats.org/drawingml/2006/main" xmlns:pic="http://schemas.openxmlformats.org/drawingml/2006/picture">
-            <wp:extent cx="1828800" cy="1129792"/>
+            <wp:extent cx="1828800" cy="2438400"/>
             <wp:docPr id="1" name="Picture 1"/>
             <wp:cNvGraphicFramePr>
               <a:graphicFrameLocks noChangeAspect="1"/>
@@ -18,7 +18,7 @@
               <a:graphicData uri="http://schemas.openxmlformats.org/drawingml/2006/picture">
                 <pic:pic>
                   <pic:nvPicPr>
-                    <pic:cNvPr id="0" name="download.jpeg"/>
+                    <pic:cNvPr id="0" name="b9a1242ebddb4c3804a6e4fd7396317b0c585057_lyYtGwa.png"/>
                     <pic:cNvPicPr/>
                   </pic:nvPicPr>
                   <pic:blipFill>
@@ -30,7 +30,7 @@
                   <pic:spPr>
                     <a:xfrm>
                       <a:off x="0" y="0"/>
-                      <a:ext cx="1828800" cy="1129792"/>
+                      <a:ext cx="1828800" cy="2438400"/>
                     </a:xfrm>
                     <a:prstGeom prst="rect"/>
                   </pic:spPr>
@@ -52,26 +52,7 @@
           <w:b/>
           <w:sz w:val="28"/>
         </w:rPr>
-        <w:t>ኢትዮጵያ አርቴፊሻል ኢንተለጀንስ ኢንስቲትዩት  የ 2018 በጀት ዓመት ዓመታዊ አፈፃፀም ሪፖርት</w:t>
-      </w:r>
-    </w:p>
-    <w:p>
-      <w:r>
-        <w:br w:type="page"/>
-      </w:r>
-    </w:p>
-    <w:p>
-      <w:pPr>
-        <w:spacing w:lineRule="auto" w:line="276" w:after="240" w:before="0"/>
-        <w:jc w:val="left"/>
-      </w:pPr>
-      <w:r>
-        <w:rPr>
-          <w:rFonts w:ascii="Ebrima" w:hAnsi="Ebrima" w:eastAsia="Ebrima" w:cs="Ebrima"/>
-          <w:b/>
-          <w:sz w:val="28"/>
-        </w:rPr>
-        <w:t>የስራ አፈፃፀም መግለጫዎች</w:t>
+        <w:t>ኢትዮጵያ አርቴፊሻል ኢንተለጀንስ ኢንስቲትዩት የ 2018 በጀት ዓመት ዓመታዊ የልማት ዕቅድ አፈፃፀም ሪፖርት</w:t>
       </w:r>
     </w:p>
     <w:p>
@@ -84,7 +65,7 @@
         <w:jc w:val="center"/>
       </w:pPr>
       <w:r>
-        <w:t>የ 2018 በጀት ዓመት ዓመታዊ የ ኢትዮጵያ አርቴፊሻል ኢንተለጀንስ ኢንስቲትዩት  የስራ አፈፃፀም</w:t>
+        <w:t xml:space="preserve"> የ 2018 በጀት ዓመት   የ አ ር ቴ ፊ ሻ ል   ኢ ን ተ ል ጀ ን ስ   ኢ ን ስ ቲ ት ዩ ት  የዋና ዋና ግቦች አፈጻጸም </w:t>
       </w:r>
     </w:p>
     <w:tbl>
@@ -118,7 +99,7 @@
                 <w:b/>
                 <w:color w:val="FFBC14"/>
               </w:rPr>
-              <w:t>ተ.ቁ</w:t>
+              <w:t xml:space="preserve">ተ.ቁ </w:t>
             </w:r>
           </w:p>
         </w:tc>
@@ -136,7 +117,7 @@
                 <w:b/>
                 <w:color w:val="FFBC14"/>
               </w:rPr>
-              <w:t>ስትራተጂክ ፍጣች፣ ስራ ስራ ተግባራት እና ውጤት ሑለት የአፈፃፀም አመልካቶች</w:t>
+              <w:t xml:space="preserve">ስትራቴጂክ ግቦች፣ ዋና ዋና ተግባራት እና ዝርዝር ቁልፍ የአፈፃፀም አመልካቾች </w:t>
             </w:r>
           </w:p>
         </w:tc>
@@ -154,15 +135,13 @@
                 <w:b/>
                 <w:color w:val="FFBC14"/>
               </w:rPr>
-              <w:t>መለኪያ</w:t>
-            </w:r>
-          </w:p>
-        </w:tc>
-        <w:tc>
-          <w:tcPr>
-            <w:tcW w:type="dxa" w:w="1234"/>
-            <w:vMerge w:val="restart"/>
-            <w:shd w:fill="110d7c"/>
+              <w:t>መለክያ</w:t>
+            </w:r>
+          </w:p>
+        </w:tc>
+        <w:tc>
+          <w:tcPr>
+            <w:tcW w:type="dxa" w:w="1234"/>
             <w:shd w:fill="110d7c"/>
           </w:tcPr>
           <w:p>
@@ -172,7 +151,7 @@
                 <w:b/>
                 <w:color w:val="FFBC14"/>
               </w:rPr>
-              <w:t>እስከ 2017 አፈፃፀም መንሻ</w:t>
+              <w:t xml:space="preserve">እስከ 2017 አፈጻጸም መነሻ </w:t>
             </w:r>
           </w:p>
         </w:tc>
@@ -191,7 +170,7 @@
                 <w:b/>
                 <w:color w:val="FFBC14"/>
               </w:rPr>
-              <w:t>የ 2018 በጀት ዓመት ዓመታዊ የስራ  አፈፃፀም</w:t>
+              <w:t xml:space="preserve"> የ 2018 በጀት ዓመት   የዋና ዋና ግቦች አፈጻጸም </w:t>
             </w:r>
           </w:p>
         </w:tc>
@@ -221,7 +200,7 @@
         <w:tc>
           <w:tcPr>
             <w:tcW w:type="dxa" w:w="1234"/>
-            <w:vMerge/>
+            <w:shd w:fill="110d7c"/>
           </w:tcPr>
           <w:p/>
         </w:tc>
@@ -237,7 +216,7 @@
                 <w:b/>
                 <w:color w:val="FFBC14"/>
               </w:rPr>
-              <w:t>ፈፅብ</w:t>
+              <w:t xml:space="preserve">ግብ </w:t>
             </w:r>
           </w:p>
         </w:tc>
@@ -253,7 +232,7 @@
                 <w:b/>
                 <w:color w:val="FFBC14"/>
               </w:rPr>
-              <w:t>አፈፃፀም</w:t>
+              <w:t>አፈጻጸም</w:t>
             </w:r>
           </w:p>
         </w:tc>
@@ -269,7 +248,7 @@
                 <w:b/>
                 <w:color w:val="FFBC14"/>
               </w:rPr>
-              <w:t>አፈፃፀም በመቶኛ</w:t>
+              <w:t>አፈጻጸም በመቶኛ</w:t>
             </w:r>
           </w:p>
         </w:tc>
@@ -348,7 +327,7 @@
               <w:rPr>
                 <w:rFonts w:ascii="Ebrima" w:hAnsi="Ebrima"/>
               </w:rPr>
-              <w:t>1.1.1</w:t>
+              <w:t>1.1.4</w:t>
             </w:r>
           </w:p>
         </w:tc>
@@ -387,33 +366,33 @@
               <w:rPr>
                 <w:rFonts w:ascii="Ebrima" w:hAnsi="Ebrima"/>
               </w:rPr>
-              <w:t>6.0</w:t>
-            </w:r>
-          </w:p>
-        </w:tc>
-        <w:tc>
-          <w:tcPr>
-            <w:tcW w:type="dxa" w:w="1234"/>
-          </w:tcPr>
-          <w:p>
-            <w:r>
-              <w:rPr>
-                <w:rFonts w:ascii="Ebrima" w:hAnsi="Ebrima"/>
-              </w:rPr>
-              <w:t>1.0</w:t>
-            </w:r>
-          </w:p>
-        </w:tc>
-        <w:tc>
-          <w:tcPr>
-            <w:tcW w:type="dxa" w:w="1234"/>
-          </w:tcPr>
-          <w:p>
-            <w:r>
-              <w:rPr>
-                <w:rFonts w:ascii="Ebrima" w:hAnsi="Ebrima"/>
-              </w:rPr>
-              <w:t>7.0</w:t>
+              <w:t xml:space="preserve">6.0 </w:t>
+            </w:r>
+          </w:p>
+        </w:tc>
+        <w:tc>
+          <w:tcPr>
+            <w:tcW w:type="dxa" w:w="1234"/>
+          </w:tcPr>
+          <w:p>
+            <w:r>
+              <w:rPr>
+                <w:rFonts w:ascii="Ebrima" w:hAnsi="Ebrima"/>
+              </w:rPr>
+              <w:t xml:space="preserve">1.0 </w:t>
+            </w:r>
+          </w:p>
+        </w:tc>
+        <w:tc>
+          <w:tcPr>
+            <w:tcW w:type="dxa" w:w="1234"/>
+          </w:tcPr>
+          <w:p>
+            <w:r>
+              <w:rPr>
+                <w:rFonts w:ascii="Ebrima" w:hAnsi="Ebrima"/>
+              </w:rPr>
+              <w:t xml:space="preserve">7.0 </w:t>
             </w:r>
           </w:p>
         </w:tc>
@@ -441,7 +420,7 @@
               <w:rPr>
                 <w:rFonts w:ascii="Ebrima" w:hAnsi="Ebrima"/>
               </w:rPr>
-              <w:t>1.1.2</w:t>
+              <w:t>1.1.4</w:t>
             </w:r>
           </w:p>
         </w:tc>
@@ -480,33 +459,33 @@
               <w:rPr>
                 <w:rFonts w:ascii="Ebrima" w:hAnsi="Ebrima"/>
               </w:rPr>
-              <w:t>46.0</w:t>
-            </w:r>
-          </w:p>
-        </w:tc>
-        <w:tc>
-          <w:tcPr>
-            <w:tcW w:type="dxa" w:w="1234"/>
-          </w:tcPr>
-          <w:p>
-            <w:r>
-              <w:rPr>
-                <w:rFonts w:ascii="Ebrima" w:hAnsi="Ebrima"/>
-              </w:rPr>
-              <w:t>10.0</w:t>
-            </w:r>
-          </w:p>
-        </w:tc>
-        <w:tc>
-          <w:tcPr>
-            <w:tcW w:type="dxa" w:w="1234"/>
-          </w:tcPr>
-          <w:p>
-            <w:r>
-              <w:rPr>
-                <w:rFonts w:ascii="Ebrima" w:hAnsi="Ebrima"/>
-              </w:rPr>
-              <w:t>22.0</w:t>
+              <w:t xml:space="preserve">46.0 </w:t>
+            </w:r>
+          </w:p>
+        </w:tc>
+        <w:tc>
+          <w:tcPr>
+            <w:tcW w:type="dxa" w:w="1234"/>
+          </w:tcPr>
+          <w:p>
+            <w:r>
+              <w:rPr>
+                <w:rFonts w:ascii="Ebrima" w:hAnsi="Ebrima"/>
+              </w:rPr>
+              <w:t xml:space="preserve">10.0 </w:t>
+            </w:r>
+          </w:p>
+        </w:tc>
+        <w:tc>
+          <w:tcPr>
+            <w:tcW w:type="dxa" w:w="1234"/>
+          </w:tcPr>
+          <w:p>
+            <w:r>
+              <w:rPr>
+                <w:rFonts w:ascii="Ebrima" w:hAnsi="Ebrima"/>
+              </w:rPr>
+              <w:t xml:space="preserve">22.0 </w:t>
             </w:r>
           </w:p>
         </w:tc>
@@ -534,7 +513,7 @@
               <w:rPr>
                 <w:rFonts w:ascii="Ebrima" w:hAnsi="Ebrima"/>
               </w:rPr>
-              <w:t>1.1.3</w:t>
+              <w:t>1.1.4</w:t>
             </w:r>
           </w:p>
         </w:tc>
@@ -573,33 +552,33 @@
               <w:rPr>
                 <w:rFonts w:ascii="Ebrima" w:hAnsi="Ebrima"/>
               </w:rPr>
-              <w:t>46.0</w:t>
-            </w:r>
-          </w:p>
-        </w:tc>
-        <w:tc>
-          <w:tcPr>
-            <w:tcW w:type="dxa" w:w="1234"/>
-          </w:tcPr>
-          <w:p>
-            <w:r>
-              <w:rPr>
-                <w:rFonts w:ascii="Ebrima" w:hAnsi="Ebrima"/>
-              </w:rPr>
-              <w:t>10.0</w:t>
-            </w:r>
-          </w:p>
-        </w:tc>
-        <w:tc>
-          <w:tcPr>
-            <w:tcW w:type="dxa" w:w="1234"/>
-          </w:tcPr>
-          <w:p>
-            <w:r>
-              <w:rPr>
-                <w:rFonts w:ascii="Ebrima" w:hAnsi="Ebrima"/>
-              </w:rPr>
-              <w:t>0.0</w:t>
+              <w:t xml:space="preserve">46.0 </w:t>
+            </w:r>
+          </w:p>
+        </w:tc>
+        <w:tc>
+          <w:tcPr>
+            <w:tcW w:type="dxa" w:w="1234"/>
+          </w:tcPr>
+          <w:p>
+            <w:r>
+              <w:rPr>
+                <w:rFonts w:ascii="Ebrima" w:hAnsi="Ebrima"/>
+              </w:rPr>
+              <w:t xml:space="preserve">10.0 </w:t>
+            </w:r>
+          </w:p>
+        </w:tc>
+        <w:tc>
+          <w:tcPr>
+            <w:tcW w:type="dxa" w:w="1234"/>
+          </w:tcPr>
+          <w:p>
+            <w:r>
+              <w:rPr>
+                <w:rFonts w:ascii="Ebrima" w:hAnsi="Ebrima"/>
+              </w:rPr>
+              <w:t xml:space="preserve">0.0 </w:t>
             </w:r>
           </w:p>
         </w:tc>
@@ -666,33 +645,33 @@
               <w:rPr>
                 <w:rFonts w:ascii="Ebrima" w:hAnsi="Ebrima"/>
               </w:rPr>
-              <w:t>46.0</w:t>
-            </w:r>
-          </w:p>
-        </w:tc>
-        <w:tc>
-          <w:tcPr>
-            <w:tcW w:type="dxa" w:w="1234"/>
-          </w:tcPr>
-          <w:p>
-            <w:r>
-              <w:rPr>
-                <w:rFonts w:ascii="Ebrima" w:hAnsi="Ebrima"/>
-              </w:rPr>
-              <w:t>10.0</w:t>
-            </w:r>
-          </w:p>
-        </w:tc>
-        <w:tc>
-          <w:tcPr>
-            <w:tcW w:type="dxa" w:w="1234"/>
-          </w:tcPr>
-          <w:p>
-            <w:r>
-              <w:rPr>
-                <w:rFonts w:ascii="Ebrima" w:hAnsi="Ebrima"/>
-              </w:rPr>
-              <w:t>0.0</w:t>
+              <w:t xml:space="preserve">46.0 </w:t>
+            </w:r>
+          </w:p>
+        </w:tc>
+        <w:tc>
+          <w:tcPr>
+            <w:tcW w:type="dxa" w:w="1234"/>
+          </w:tcPr>
+          <w:p>
+            <w:r>
+              <w:rPr>
+                <w:rFonts w:ascii="Ebrima" w:hAnsi="Ebrima"/>
+              </w:rPr>
+              <w:t xml:space="preserve">10.0 </w:t>
+            </w:r>
+          </w:p>
+        </w:tc>
+        <w:tc>
+          <w:tcPr>
+            <w:tcW w:type="dxa" w:w="1234"/>
+          </w:tcPr>
+          <w:p>
+            <w:r>
+              <w:rPr>
+                <w:rFonts w:ascii="Ebrima" w:hAnsi="Ebrima"/>
+              </w:rPr>
+              <w:t xml:space="preserve">0.0 </w:t>
             </w:r>
           </w:p>
         </w:tc>
@@ -720,7 +699,7 @@
               <w:rPr>
                 <w:rFonts w:ascii="Ebrima" w:hAnsi="Ebrima"/>
               </w:rPr>
-              <w:t>1.1.5</w:t>
+              <w:t>1.1.4</w:t>
             </w:r>
           </w:p>
         </w:tc>
@@ -813,7 +792,7 @@
               <w:rPr>
                 <w:rFonts w:ascii="Ebrima" w:hAnsi="Ebrima"/>
               </w:rPr>
-              <w:t>1.1.6</w:t>
+              <w:t>1.1.4</w:t>
             </w:r>
           </w:p>
         </w:tc>
@@ -852,33 +831,33 @@
               <w:rPr>
                 <w:rFonts w:ascii="Ebrima" w:hAnsi="Ebrima"/>
               </w:rPr>
-              <w:t>14.0</w:t>
-            </w:r>
-          </w:p>
-        </w:tc>
-        <w:tc>
-          <w:tcPr>
-            <w:tcW w:type="dxa" w:w="1234"/>
-          </w:tcPr>
-          <w:p>
-            <w:r>
-              <w:rPr>
-                <w:rFonts w:ascii="Ebrima" w:hAnsi="Ebrima"/>
-              </w:rPr>
-              <w:t>8.0</w:t>
-            </w:r>
-          </w:p>
-        </w:tc>
-        <w:tc>
-          <w:tcPr>
-            <w:tcW w:type="dxa" w:w="1234"/>
-          </w:tcPr>
-          <w:p>
-            <w:r>
-              <w:rPr>
-                <w:rFonts w:ascii="Ebrima" w:hAnsi="Ebrima"/>
-              </w:rPr>
-              <w:t>0.0</w:t>
+              <w:t xml:space="preserve">14.0 </w:t>
+            </w:r>
+          </w:p>
+        </w:tc>
+        <w:tc>
+          <w:tcPr>
+            <w:tcW w:type="dxa" w:w="1234"/>
+          </w:tcPr>
+          <w:p>
+            <w:r>
+              <w:rPr>
+                <w:rFonts w:ascii="Ebrima" w:hAnsi="Ebrima"/>
+              </w:rPr>
+              <w:t xml:space="preserve">8.0 </w:t>
+            </w:r>
+          </w:p>
+        </w:tc>
+        <w:tc>
+          <w:tcPr>
+            <w:tcW w:type="dxa" w:w="1234"/>
+          </w:tcPr>
+          <w:p>
+            <w:r>
+              <w:rPr>
+                <w:rFonts w:ascii="Ebrima" w:hAnsi="Ebrima"/>
+              </w:rPr>
+              <w:t xml:space="preserve">0.0 </w:t>
             </w:r>
           </w:p>
         </w:tc>
@@ -906,7 +885,7 @@
               <w:rPr>
                 <w:rFonts w:ascii="Ebrima" w:hAnsi="Ebrima"/>
               </w:rPr>
-              <w:t>1.1.7</w:t>
+              <w:t>1.1.4</w:t>
             </w:r>
           </w:p>
         </w:tc>
@@ -945,33 +924,33 @@
               <w:rPr>
                 <w:rFonts w:ascii="Ebrima" w:hAnsi="Ebrima"/>
               </w:rPr>
-              <w:t>2.0</w:t>
-            </w:r>
-          </w:p>
-        </w:tc>
-        <w:tc>
-          <w:tcPr>
-            <w:tcW w:type="dxa" w:w="1234"/>
-          </w:tcPr>
-          <w:p>
-            <w:r>
-              <w:rPr>
-                <w:rFonts w:ascii="Ebrima" w:hAnsi="Ebrima"/>
-              </w:rPr>
-              <w:t>4.0</w:t>
-            </w:r>
-          </w:p>
-        </w:tc>
-        <w:tc>
-          <w:tcPr>
-            <w:tcW w:type="dxa" w:w="1234"/>
-          </w:tcPr>
-          <w:p>
-            <w:r>
-              <w:rPr>
-                <w:rFonts w:ascii="Ebrima" w:hAnsi="Ebrima"/>
-              </w:rPr>
-              <w:t>0.0</w:t>
+              <w:t xml:space="preserve">2.0 </w:t>
+            </w:r>
+          </w:p>
+        </w:tc>
+        <w:tc>
+          <w:tcPr>
+            <w:tcW w:type="dxa" w:w="1234"/>
+          </w:tcPr>
+          <w:p>
+            <w:r>
+              <w:rPr>
+                <w:rFonts w:ascii="Ebrima" w:hAnsi="Ebrima"/>
+              </w:rPr>
+              <w:t xml:space="preserve">4.0 </w:t>
+            </w:r>
+          </w:p>
+        </w:tc>
+        <w:tc>
+          <w:tcPr>
+            <w:tcW w:type="dxa" w:w="1234"/>
+          </w:tcPr>
+          <w:p>
+            <w:r>
+              <w:rPr>
+                <w:rFonts w:ascii="Ebrima" w:hAnsi="Ebrima"/>
+              </w:rPr>
+              <w:t xml:space="preserve">0.0 </w:t>
             </w:r>
           </w:p>
         </w:tc>
@@ -1030,7 +1009,7 @@
               <w:rPr>
                 <w:rFonts w:ascii="Ebrima" w:hAnsi="Ebrima"/>
               </w:rPr>
-              <w:t>1.2.1</w:t>
+              <w:t>1.2.4</w:t>
             </w:r>
           </w:p>
         </w:tc>
@@ -1069,33 +1048,33 @@
               <w:rPr>
                 <w:rFonts w:ascii="Ebrima" w:hAnsi="Ebrima"/>
               </w:rPr>
-              <w:t>4.0</w:t>
-            </w:r>
-          </w:p>
-        </w:tc>
-        <w:tc>
-          <w:tcPr>
-            <w:tcW w:type="dxa" w:w="1234"/>
-          </w:tcPr>
-          <w:p>
-            <w:r>
-              <w:rPr>
-                <w:rFonts w:ascii="Ebrima" w:hAnsi="Ebrima"/>
-              </w:rPr>
-              <w:t>4.0</w:t>
-            </w:r>
-          </w:p>
-        </w:tc>
-        <w:tc>
-          <w:tcPr>
-            <w:tcW w:type="dxa" w:w="1234"/>
-          </w:tcPr>
-          <w:p>
-            <w:r>
-              <w:rPr>
-                <w:rFonts w:ascii="Ebrima" w:hAnsi="Ebrima"/>
-              </w:rPr>
-              <w:t>0.0</w:t>
+              <w:t xml:space="preserve">4.0 </w:t>
+            </w:r>
+          </w:p>
+        </w:tc>
+        <w:tc>
+          <w:tcPr>
+            <w:tcW w:type="dxa" w:w="1234"/>
+          </w:tcPr>
+          <w:p>
+            <w:r>
+              <w:rPr>
+                <w:rFonts w:ascii="Ebrima" w:hAnsi="Ebrima"/>
+              </w:rPr>
+              <w:t xml:space="preserve">4.0 </w:t>
+            </w:r>
+          </w:p>
+        </w:tc>
+        <w:tc>
+          <w:tcPr>
+            <w:tcW w:type="dxa" w:w="1234"/>
+          </w:tcPr>
+          <w:p>
+            <w:r>
+              <w:rPr>
+                <w:rFonts w:ascii="Ebrima" w:hAnsi="Ebrima"/>
+              </w:rPr>
+              <w:t xml:space="preserve">0.0 </w:t>
             </w:r>
           </w:p>
         </w:tc>
@@ -1123,7 +1102,7 @@
               <w:rPr>
                 <w:rFonts w:ascii="Ebrima" w:hAnsi="Ebrima"/>
               </w:rPr>
-              <w:t>1.2.2</w:t>
+              <w:t>1.2.4</w:t>
             </w:r>
           </w:p>
         </w:tc>
@@ -1162,33 +1141,33 @@
               <w:rPr>
                 <w:rFonts w:ascii="Ebrima" w:hAnsi="Ebrima"/>
               </w:rPr>
-              <w:t>4.0</w:t>
-            </w:r>
-          </w:p>
-        </w:tc>
-        <w:tc>
-          <w:tcPr>
-            <w:tcW w:type="dxa" w:w="1234"/>
-          </w:tcPr>
-          <w:p>
-            <w:r>
-              <w:rPr>
-                <w:rFonts w:ascii="Ebrima" w:hAnsi="Ebrima"/>
-              </w:rPr>
-              <w:t>4.0</w:t>
-            </w:r>
-          </w:p>
-        </w:tc>
-        <w:tc>
-          <w:tcPr>
-            <w:tcW w:type="dxa" w:w="1234"/>
-          </w:tcPr>
-          <w:p>
-            <w:r>
-              <w:rPr>
-                <w:rFonts w:ascii="Ebrima" w:hAnsi="Ebrima"/>
-              </w:rPr>
-              <w:t>0.0</w:t>
+              <w:t xml:space="preserve">4.0 </w:t>
+            </w:r>
+          </w:p>
+        </w:tc>
+        <w:tc>
+          <w:tcPr>
+            <w:tcW w:type="dxa" w:w="1234"/>
+          </w:tcPr>
+          <w:p>
+            <w:r>
+              <w:rPr>
+                <w:rFonts w:ascii="Ebrima" w:hAnsi="Ebrima"/>
+              </w:rPr>
+              <w:t xml:space="preserve">4.0 </w:t>
+            </w:r>
+          </w:p>
+        </w:tc>
+        <w:tc>
+          <w:tcPr>
+            <w:tcW w:type="dxa" w:w="1234"/>
+          </w:tcPr>
+          <w:p>
+            <w:r>
+              <w:rPr>
+                <w:rFonts w:ascii="Ebrima" w:hAnsi="Ebrima"/>
+              </w:rPr>
+              <w:t xml:space="preserve">0.0 </w:t>
             </w:r>
           </w:p>
         </w:tc>
@@ -1247,7 +1226,7 @@
               <w:rPr>
                 <w:rFonts w:ascii="Ebrima" w:hAnsi="Ebrima"/>
               </w:rPr>
-              <w:t>1.3.1</w:t>
+              <w:t>1.3.4</w:t>
             </w:r>
           </w:p>
         </w:tc>
@@ -1286,33 +1265,33 @@
               <w:rPr>
                 <w:rFonts w:ascii="Ebrima" w:hAnsi="Ebrima"/>
               </w:rPr>
-              <w:t>0.0</w:t>
-            </w:r>
-          </w:p>
-        </w:tc>
-        <w:tc>
-          <w:tcPr>
-            <w:tcW w:type="dxa" w:w="1234"/>
-          </w:tcPr>
-          <w:p>
-            <w:r>
-              <w:rPr>
-                <w:rFonts w:ascii="Ebrima" w:hAnsi="Ebrima"/>
-              </w:rPr>
-              <w:t>1.0</w:t>
-            </w:r>
-          </w:p>
-        </w:tc>
-        <w:tc>
-          <w:tcPr>
-            <w:tcW w:type="dxa" w:w="1234"/>
-          </w:tcPr>
-          <w:p>
-            <w:r>
-              <w:rPr>
-                <w:rFonts w:ascii="Ebrima" w:hAnsi="Ebrima"/>
-              </w:rPr>
-              <w:t>0.0</w:t>
+              <w:t xml:space="preserve">0.0 </w:t>
+            </w:r>
+          </w:p>
+        </w:tc>
+        <w:tc>
+          <w:tcPr>
+            <w:tcW w:type="dxa" w:w="1234"/>
+          </w:tcPr>
+          <w:p>
+            <w:r>
+              <w:rPr>
+                <w:rFonts w:ascii="Ebrima" w:hAnsi="Ebrima"/>
+              </w:rPr>
+              <w:t xml:space="preserve">1.0 </w:t>
+            </w:r>
+          </w:p>
+        </w:tc>
+        <w:tc>
+          <w:tcPr>
+            <w:tcW w:type="dxa" w:w="1234"/>
+          </w:tcPr>
+          <w:p>
+            <w:r>
+              <w:rPr>
+                <w:rFonts w:ascii="Ebrima" w:hAnsi="Ebrima"/>
+              </w:rPr>
+              <w:t xml:space="preserve">0.0 </w:t>
             </w:r>
           </w:p>
         </w:tc>
@@ -1340,7 +1319,7 @@
               <w:rPr>
                 <w:rFonts w:ascii="Ebrima" w:hAnsi="Ebrima"/>
               </w:rPr>
-              <w:t>1.3.2</w:t>
+              <w:t>1.3.4</w:t>
             </w:r>
           </w:p>
         </w:tc>
@@ -1379,33 +1358,33 @@
               <w:rPr>
                 <w:rFonts w:ascii="Ebrima" w:hAnsi="Ebrima"/>
               </w:rPr>
-              <w:t>0.0</w:t>
-            </w:r>
-          </w:p>
-        </w:tc>
-        <w:tc>
-          <w:tcPr>
-            <w:tcW w:type="dxa" w:w="1234"/>
-          </w:tcPr>
-          <w:p>
-            <w:r>
-              <w:rPr>
-                <w:rFonts w:ascii="Ebrima" w:hAnsi="Ebrima"/>
-              </w:rPr>
-              <w:t>1.0</w:t>
-            </w:r>
-          </w:p>
-        </w:tc>
-        <w:tc>
-          <w:tcPr>
-            <w:tcW w:type="dxa" w:w="1234"/>
-          </w:tcPr>
-          <w:p>
-            <w:r>
-              <w:rPr>
-                <w:rFonts w:ascii="Ebrima" w:hAnsi="Ebrima"/>
-              </w:rPr>
-              <w:t>0.0</w:t>
+              <w:t xml:space="preserve">0.0 </w:t>
+            </w:r>
+          </w:p>
+        </w:tc>
+        <w:tc>
+          <w:tcPr>
+            <w:tcW w:type="dxa" w:w="1234"/>
+          </w:tcPr>
+          <w:p>
+            <w:r>
+              <w:rPr>
+                <w:rFonts w:ascii="Ebrima" w:hAnsi="Ebrima"/>
+              </w:rPr>
+              <w:t xml:space="preserve">1.0 </w:t>
+            </w:r>
+          </w:p>
+        </w:tc>
+        <w:tc>
+          <w:tcPr>
+            <w:tcW w:type="dxa" w:w="1234"/>
+          </w:tcPr>
+          <w:p>
+            <w:r>
+              <w:rPr>
+                <w:rFonts w:ascii="Ebrima" w:hAnsi="Ebrima"/>
+              </w:rPr>
+              <w:t xml:space="preserve">0.0 </w:t>
             </w:r>
           </w:p>
         </w:tc>
@@ -1433,7 +1412,7 @@
               <w:rPr>
                 <w:rFonts w:ascii="Ebrima" w:hAnsi="Ebrima"/>
               </w:rPr>
-              <w:t>1.3.3</w:t>
+              <w:t>1.3.4</w:t>
             </w:r>
           </w:p>
         </w:tc>
@@ -1472,33 +1451,33 @@
               <w:rPr>
                 <w:rFonts w:ascii="Ebrima" w:hAnsi="Ebrima"/>
               </w:rPr>
-              <w:t>0.0</w:t>
-            </w:r>
-          </w:p>
-        </w:tc>
-        <w:tc>
-          <w:tcPr>
-            <w:tcW w:type="dxa" w:w="1234"/>
-          </w:tcPr>
-          <w:p>
-            <w:r>
-              <w:rPr>
-                <w:rFonts w:ascii="Ebrima" w:hAnsi="Ebrima"/>
-              </w:rPr>
-              <w:t>1.0</w:t>
-            </w:r>
-          </w:p>
-        </w:tc>
-        <w:tc>
-          <w:tcPr>
-            <w:tcW w:type="dxa" w:w="1234"/>
-          </w:tcPr>
-          <w:p>
-            <w:r>
-              <w:rPr>
-                <w:rFonts w:ascii="Ebrima" w:hAnsi="Ebrima"/>
-              </w:rPr>
-              <w:t>0.0</w:t>
+              <w:t xml:space="preserve">0.0 </w:t>
+            </w:r>
+          </w:p>
+        </w:tc>
+        <w:tc>
+          <w:tcPr>
+            <w:tcW w:type="dxa" w:w="1234"/>
+          </w:tcPr>
+          <w:p>
+            <w:r>
+              <w:rPr>
+                <w:rFonts w:ascii="Ebrima" w:hAnsi="Ebrima"/>
+              </w:rPr>
+              <w:t xml:space="preserve">1.0 </w:t>
+            </w:r>
+          </w:p>
+        </w:tc>
+        <w:tc>
+          <w:tcPr>
+            <w:tcW w:type="dxa" w:w="1234"/>
+          </w:tcPr>
+          <w:p>
+            <w:r>
+              <w:rPr>
+                <w:rFonts w:ascii="Ebrima" w:hAnsi="Ebrima"/>
+              </w:rPr>
+              <w:t xml:space="preserve">0.0 </w:t>
             </w:r>
           </w:p>
         </w:tc>
@@ -1565,33 +1544,33 @@
               <w:rPr>
                 <w:rFonts w:ascii="Ebrima" w:hAnsi="Ebrima"/>
               </w:rPr>
-              <w:t>0.0</w:t>
-            </w:r>
-          </w:p>
-        </w:tc>
-        <w:tc>
-          <w:tcPr>
-            <w:tcW w:type="dxa" w:w="1234"/>
-          </w:tcPr>
-          <w:p>
-            <w:r>
-              <w:rPr>
-                <w:rFonts w:ascii="Ebrima" w:hAnsi="Ebrima"/>
-              </w:rPr>
-              <w:t>1.0</w:t>
-            </w:r>
-          </w:p>
-        </w:tc>
-        <w:tc>
-          <w:tcPr>
-            <w:tcW w:type="dxa" w:w="1234"/>
-          </w:tcPr>
-          <w:p>
-            <w:r>
-              <w:rPr>
-                <w:rFonts w:ascii="Ebrima" w:hAnsi="Ebrima"/>
-              </w:rPr>
-              <w:t>0.0</w:t>
+              <w:t xml:space="preserve">0.0 </w:t>
+            </w:r>
+          </w:p>
+        </w:tc>
+        <w:tc>
+          <w:tcPr>
+            <w:tcW w:type="dxa" w:w="1234"/>
+          </w:tcPr>
+          <w:p>
+            <w:r>
+              <w:rPr>
+                <w:rFonts w:ascii="Ebrima" w:hAnsi="Ebrima"/>
+              </w:rPr>
+              <w:t xml:space="preserve">1.0 </w:t>
+            </w:r>
+          </w:p>
+        </w:tc>
+        <w:tc>
+          <w:tcPr>
+            <w:tcW w:type="dxa" w:w="1234"/>
+          </w:tcPr>
+          <w:p>
+            <w:r>
+              <w:rPr>
+                <w:rFonts w:ascii="Ebrima" w:hAnsi="Ebrima"/>
+              </w:rPr>
+              <w:t xml:space="preserve">0.0 </w:t>
             </w:r>
           </w:p>
         </w:tc>
@@ -1650,7 +1629,7 @@
               <w:rPr>
                 <w:rFonts w:ascii="Ebrima" w:hAnsi="Ebrima"/>
               </w:rPr>
-              <w:t>1.4.1</w:t>
+              <w:t>1.4.4</w:t>
             </w:r>
           </w:p>
         </w:tc>
@@ -1689,33 +1668,33 @@
               <w:rPr>
                 <w:rFonts w:ascii="Ebrima" w:hAnsi="Ebrima"/>
               </w:rPr>
-              <w:t>8.0</w:t>
-            </w:r>
-          </w:p>
-        </w:tc>
-        <w:tc>
-          <w:tcPr>
-            <w:tcW w:type="dxa" w:w="1234"/>
-          </w:tcPr>
-          <w:p>
-            <w:r>
-              <w:rPr>
-                <w:rFonts w:ascii="Ebrima" w:hAnsi="Ebrima"/>
-              </w:rPr>
-              <w:t>6.0</w:t>
-            </w:r>
-          </w:p>
-        </w:tc>
-        <w:tc>
-          <w:tcPr>
-            <w:tcW w:type="dxa" w:w="1234"/>
-          </w:tcPr>
-          <w:p>
-            <w:r>
-              <w:rPr>
-                <w:rFonts w:ascii="Ebrima" w:hAnsi="Ebrima"/>
-              </w:rPr>
-              <w:t>0.0</w:t>
+              <w:t xml:space="preserve">8.0 </w:t>
+            </w:r>
+          </w:p>
+        </w:tc>
+        <w:tc>
+          <w:tcPr>
+            <w:tcW w:type="dxa" w:w="1234"/>
+          </w:tcPr>
+          <w:p>
+            <w:r>
+              <w:rPr>
+                <w:rFonts w:ascii="Ebrima" w:hAnsi="Ebrima"/>
+              </w:rPr>
+              <w:t xml:space="preserve">6.0 </w:t>
+            </w:r>
+          </w:p>
+        </w:tc>
+        <w:tc>
+          <w:tcPr>
+            <w:tcW w:type="dxa" w:w="1234"/>
+          </w:tcPr>
+          <w:p>
+            <w:r>
+              <w:rPr>
+                <w:rFonts w:ascii="Ebrima" w:hAnsi="Ebrima"/>
+              </w:rPr>
+              <w:t xml:space="preserve">0.0 </w:t>
             </w:r>
           </w:p>
         </w:tc>
@@ -1743,7 +1722,7 @@
               <w:rPr>
                 <w:rFonts w:ascii="Ebrima" w:hAnsi="Ebrima"/>
               </w:rPr>
-              <w:t>1.4.2</w:t>
+              <w:t>1.4.4</w:t>
             </w:r>
           </w:p>
         </w:tc>
@@ -1782,33 +1761,33 @@
               <w:rPr>
                 <w:rFonts w:ascii="Ebrima" w:hAnsi="Ebrima"/>
               </w:rPr>
-              <w:t>7600.0</w:t>
-            </w:r>
-          </w:p>
-        </w:tc>
-        <w:tc>
-          <w:tcPr>
-            <w:tcW w:type="dxa" w:w="1234"/>
-          </w:tcPr>
-          <w:p>
-            <w:r>
-              <w:rPr>
-                <w:rFonts w:ascii="Ebrima" w:hAnsi="Ebrima"/>
-              </w:rPr>
-              <w:t>6200.0</w:t>
-            </w:r>
-          </w:p>
-        </w:tc>
-        <w:tc>
-          <w:tcPr>
-            <w:tcW w:type="dxa" w:w="1234"/>
-          </w:tcPr>
-          <w:p>
-            <w:r>
-              <w:rPr>
-                <w:rFonts w:ascii="Ebrima" w:hAnsi="Ebrima"/>
-              </w:rPr>
-              <w:t>0.0</w:t>
+              <w:t xml:space="preserve">7600.0 </w:t>
+            </w:r>
+          </w:p>
+        </w:tc>
+        <w:tc>
+          <w:tcPr>
+            <w:tcW w:type="dxa" w:w="1234"/>
+          </w:tcPr>
+          <w:p>
+            <w:r>
+              <w:rPr>
+                <w:rFonts w:ascii="Ebrima" w:hAnsi="Ebrima"/>
+              </w:rPr>
+              <w:t xml:space="preserve">6200.0 </w:t>
+            </w:r>
+          </w:p>
+        </w:tc>
+        <w:tc>
+          <w:tcPr>
+            <w:tcW w:type="dxa" w:w="1234"/>
+          </w:tcPr>
+          <w:p>
+            <w:r>
+              <w:rPr>
+                <w:rFonts w:ascii="Ebrima" w:hAnsi="Ebrima"/>
+              </w:rPr>
+              <w:t xml:space="preserve">0.0 </w:t>
             </w:r>
           </w:p>
         </w:tc>
@@ -1836,7 +1815,7 @@
               <w:rPr>
                 <w:rFonts w:ascii="Ebrima" w:hAnsi="Ebrima"/>
               </w:rPr>
-              <w:t>1.4.3</w:t>
+              <w:t>1.4.4</w:t>
             </w:r>
           </w:p>
         </w:tc>
@@ -1875,33 +1854,33 @@
               <w:rPr>
                 <w:rFonts w:ascii="Ebrima" w:hAnsi="Ebrima"/>
               </w:rPr>
-              <w:t>4.0</w:t>
-            </w:r>
-          </w:p>
-        </w:tc>
-        <w:tc>
-          <w:tcPr>
-            <w:tcW w:type="dxa" w:w="1234"/>
-          </w:tcPr>
-          <w:p>
-            <w:r>
-              <w:rPr>
-                <w:rFonts w:ascii="Ebrima" w:hAnsi="Ebrima"/>
-              </w:rPr>
-              <w:t>6.0</w:t>
-            </w:r>
-          </w:p>
-        </w:tc>
-        <w:tc>
-          <w:tcPr>
-            <w:tcW w:type="dxa" w:w="1234"/>
-          </w:tcPr>
-          <w:p>
-            <w:r>
-              <w:rPr>
-                <w:rFonts w:ascii="Ebrima" w:hAnsi="Ebrima"/>
-              </w:rPr>
-              <w:t>0.0</w:t>
+              <w:t xml:space="preserve">4.0 </w:t>
+            </w:r>
+          </w:p>
+        </w:tc>
+        <w:tc>
+          <w:tcPr>
+            <w:tcW w:type="dxa" w:w="1234"/>
+          </w:tcPr>
+          <w:p>
+            <w:r>
+              <w:rPr>
+                <w:rFonts w:ascii="Ebrima" w:hAnsi="Ebrima"/>
+              </w:rPr>
+              <w:t xml:space="preserve">6.0 </w:t>
+            </w:r>
+          </w:p>
+        </w:tc>
+        <w:tc>
+          <w:tcPr>
+            <w:tcW w:type="dxa" w:w="1234"/>
+          </w:tcPr>
+          <w:p>
+            <w:r>
+              <w:rPr>
+                <w:rFonts w:ascii="Ebrima" w:hAnsi="Ebrima"/>
+              </w:rPr>
+              <w:t xml:space="preserve">0.0 </w:t>
             </w:r>
           </w:p>
         </w:tc>
@@ -1968,33 +1947,33 @@
               <w:rPr>
                 <w:rFonts w:ascii="Ebrima" w:hAnsi="Ebrima"/>
               </w:rPr>
-              <w:t>4.0</w:t>
-            </w:r>
-          </w:p>
-        </w:tc>
-        <w:tc>
-          <w:tcPr>
-            <w:tcW w:type="dxa" w:w="1234"/>
-          </w:tcPr>
-          <w:p>
-            <w:r>
-              <w:rPr>
-                <w:rFonts w:ascii="Ebrima" w:hAnsi="Ebrima"/>
-              </w:rPr>
-              <w:t>2.0</w:t>
-            </w:r>
-          </w:p>
-        </w:tc>
-        <w:tc>
-          <w:tcPr>
-            <w:tcW w:type="dxa" w:w="1234"/>
-          </w:tcPr>
-          <w:p>
-            <w:r>
-              <w:rPr>
-                <w:rFonts w:ascii="Ebrima" w:hAnsi="Ebrima"/>
-              </w:rPr>
-              <w:t>0.0</w:t>
+              <w:t xml:space="preserve">4.0 </w:t>
+            </w:r>
+          </w:p>
+        </w:tc>
+        <w:tc>
+          <w:tcPr>
+            <w:tcW w:type="dxa" w:w="1234"/>
+          </w:tcPr>
+          <w:p>
+            <w:r>
+              <w:rPr>
+                <w:rFonts w:ascii="Ebrima" w:hAnsi="Ebrima"/>
+              </w:rPr>
+              <w:t xml:space="preserve">2.0 </w:t>
+            </w:r>
+          </w:p>
+        </w:tc>
+        <w:tc>
+          <w:tcPr>
+            <w:tcW w:type="dxa" w:w="1234"/>
+          </w:tcPr>
+          <w:p>
+            <w:r>
+              <w:rPr>
+                <w:rFonts w:ascii="Ebrima" w:hAnsi="Ebrima"/>
+              </w:rPr>
+              <w:t xml:space="preserve">0.0 </w:t>
             </w:r>
           </w:p>
         </w:tc>
@@ -2053,7 +2032,7 @@
               <w:rPr>
                 <w:rFonts w:ascii="Ebrima" w:hAnsi="Ebrima"/>
               </w:rPr>
-              <w:t>1.5.1</w:t>
+              <w:t>1.5.4</w:t>
             </w:r>
           </w:p>
         </w:tc>
@@ -2092,33 +2071,33 @@
               <w:rPr>
                 <w:rFonts w:ascii="Ebrima" w:hAnsi="Ebrima"/>
               </w:rPr>
-              <w:t>85.0</w:t>
-            </w:r>
-          </w:p>
-        </w:tc>
-        <w:tc>
-          <w:tcPr>
-            <w:tcW w:type="dxa" w:w="1234"/>
-          </w:tcPr>
-          <w:p>
-            <w:r>
-              <w:rPr>
-                <w:rFonts w:ascii="Ebrima" w:hAnsi="Ebrima"/>
-              </w:rPr>
-              <w:t>70.0</w:t>
-            </w:r>
-          </w:p>
-        </w:tc>
-        <w:tc>
-          <w:tcPr>
-            <w:tcW w:type="dxa" w:w="1234"/>
-          </w:tcPr>
-          <w:p>
-            <w:r>
-              <w:rPr>
-                <w:rFonts w:ascii="Ebrima" w:hAnsi="Ebrima"/>
-              </w:rPr>
-              <w:t>0.0</w:t>
+              <w:t xml:space="preserve">85.0 </w:t>
+            </w:r>
+          </w:p>
+        </w:tc>
+        <w:tc>
+          <w:tcPr>
+            <w:tcW w:type="dxa" w:w="1234"/>
+          </w:tcPr>
+          <w:p>
+            <w:r>
+              <w:rPr>
+                <w:rFonts w:ascii="Ebrima" w:hAnsi="Ebrima"/>
+              </w:rPr>
+              <w:t xml:space="preserve">70.0 </w:t>
+            </w:r>
+          </w:p>
+        </w:tc>
+        <w:tc>
+          <w:tcPr>
+            <w:tcW w:type="dxa" w:w="1234"/>
+          </w:tcPr>
+          <w:p>
+            <w:r>
+              <w:rPr>
+                <w:rFonts w:ascii="Ebrima" w:hAnsi="Ebrima"/>
+              </w:rPr>
+              <w:t xml:space="preserve">0.0 </w:t>
             </w:r>
           </w:p>
         </w:tc>
@@ -2146,7 +2125,7 @@
               <w:rPr>
                 <w:rFonts w:ascii="Ebrima" w:hAnsi="Ebrima"/>
               </w:rPr>
-              <w:t>1.5.2</w:t>
+              <w:t>1.5.4</w:t>
             </w:r>
           </w:p>
         </w:tc>
@@ -2185,33 +2164,33 @@
               <w:rPr>
                 <w:rFonts w:ascii="Ebrima" w:hAnsi="Ebrima"/>
               </w:rPr>
-              <w:t>7.0</w:t>
-            </w:r>
-          </w:p>
-        </w:tc>
-        <w:tc>
-          <w:tcPr>
-            <w:tcW w:type="dxa" w:w="1234"/>
-          </w:tcPr>
-          <w:p>
-            <w:r>
-              <w:rPr>
-                <w:rFonts w:ascii="Ebrima" w:hAnsi="Ebrima"/>
-              </w:rPr>
-              <w:t>5.0</w:t>
-            </w:r>
-          </w:p>
-        </w:tc>
-        <w:tc>
-          <w:tcPr>
-            <w:tcW w:type="dxa" w:w="1234"/>
-          </w:tcPr>
-          <w:p>
-            <w:r>
-              <w:rPr>
-                <w:rFonts w:ascii="Ebrima" w:hAnsi="Ebrima"/>
-              </w:rPr>
-              <w:t>0.0</w:t>
+              <w:t xml:space="preserve">7.0 </w:t>
+            </w:r>
+          </w:p>
+        </w:tc>
+        <w:tc>
+          <w:tcPr>
+            <w:tcW w:type="dxa" w:w="1234"/>
+          </w:tcPr>
+          <w:p>
+            <w:r>
+              <w:rPr>
+                <w:rFonts w:ascii="Ebrima" w:hAnsi="Ebrima"/>
+              </w:rPr>
+              <w:t xml:space="preserve">5.0 </w:t>
+            </w:r>
+          </w:p>
+        </w:tc>
+        <w:tc>
+          <w:tcPr>
+            <w:tcW w:type="dxa" w:w="1234"/>
+          </w:tcPr>
+          <w:p>
+            <w:r>
+              <w:rPr>
+                <w:rFonts w:ascii="Ebrima" w:hAnsi="Ebrima"/>
+              </w:rPr>
+              <w:t xml:space="preserve">0.0 </w:t>
             </w:r>
           </w:p>
         </w:tc>
@@ -2239,7 +2218,7 @@
               <w:rPr>
                 <w:rFonts w:ascii="Ebrima" w:hAnsi="Ebrima"/>
               </w:rPr>
-              <w:t>1.5.3</w:t>
+              <w:t>1.5.4</w:t>
             </w:r>
           </w:p>
         </w:tc>
@@ -2278,33 +2257,33 @@
               <w:rPr>
                 <w:rFonts w:ascii="Ebrima" w:hAnsi="Ebrima"/>
               </w:rPr>
-              <w:t>31.0</w:t>
-            </w:r>
-          </w:p>
-        </w:tc>
-        <w:tc>
-          <w:tcPr>
-            <w:tcW w:type="dxa" w:w="1234"/>
-          </w:tcPr>
-          <w:p>
-            <w:r>
-              <w:rPr>
-                <w:rFonts w:ascii="Ebrima" w:hAnsi="Ebrima"/>
-              </w:rPr>
-              <w:t>30.0</w:t>
-            </w:r>
-          </w:p>
-        </w:tc>
-        <w:tc>
-          <w:tcPr>
-            <w:tcW w:type="dxa" w:w="1234"/>
-          </w:tcPr>
-          <w:p>
-            <w:r>
-              <w:rPr>
-                <w:rFonts w:ascii="Ebrima" w:hAnsi="Ebrima"/>
-              </w:rPr>
-              <w:t>0.0</w:t>
+              <w:t xml:space="preserve">31.0 </w:t>
+            </w:r>
+          </w:p>
+        </w:tc>
+        <w:tc>
+          <w:tcPr>
+            <w:tcW w:type="dxa" w:w="1234"/>
+          </w:tcPr>
+          <w:p>
+            <w:r>
+              <w:rPr>
+                <w:rFonts w:ascii="Ebrima" w:hAnsi="Ebrima"/>
+              </w:rPr>
+              <w:t xml:space="preserve">30.0 </w:t>
+            </w:r>
+          </w:p>
+        </w:tc>
+        <w:tc>
+          <w:tcPr>
+            <w:tcW w:type="dxa" w:w="1234"/>
+          </w:tcPr>
+          <w:p>
+            <w:r>
+              <w:rPr>
+                <w:rFonts w:ascii="Ebrima" w:hAnsi="Ebrima"/>
+              </w:rPr>
+              <w:t xml:space="preserve">0.0 </w:t>
             </w:r>
           </w:p>
         </w:tc>
@@ -2371,33 +2350,33 @@
               <w:rPr>
                 <w:rFonts w:ascii="Ebrima" w:hAnsi="Ebrima"/>
               </w:rPr>
-              <w:t>0.0</w:t>
-            </w:r>
-          </w:p>
-        </w:tc>
-        <w:tc>
-          <w:tcPr>
-            <w:tcW w:type="dxa" w:w="1234"/>
-          </w:tcPr>
-          <w:p>
-            <w:r>
-              <w:rPr>
-                <w:rFonts w:ascii="Ebrima" w:hAnsi="Ebrima"/>
-              </w:rPr>
-              <w:t>1.0</w:t>
-            </w:r>
-          </w:p>
-        </w:tc>
-        <w:tc>
-          <w:tcPr>
-            <w:tcW w:type="dxa" w:w="1234"/>
-          </w:tcPr>
-          <w:p>
-            <w:r>
-              <w:rPr>
-                <w:rFonts w:ascii="Ebrima" w:hAnsi="Ebrima"/>
-              </w:rPr>
-              <w:t>0.0</w:t>
+              <w:t xml:space="preserve">0.0 </w:t>
+            </w:r>
+          </w:p>
+        </w:tc>
+        <w:tc>
+          <w:tcPr>
+            <w:tcW w:type="dxa" w:w="1234"/>
+          </w:tcPr>
+          <w:p>
+            <w:r>
+              <w:rPr>
+                <w:rFonts w:ascii="Ebrima" w:hAnsi="Ebrima"/>
+              </w:rPr>
+              <w:t xml:space="preserve">1.0 </w:t>
+            </w:r>
+          </w:p>
+        </w:tc>
+        <w:tc>
+          <w:tcPr>
+            <w:tcW w:type="dxa" w:w="1234"/>
+          </w:tcPr>
+          <w:p>
+            <w:r>
+              <w:rPr>
+                <w:rFonts w:ascii="Ebrima" w:hAnsi="Ebrima"/>
+              </w:rPr>
+              <w:t xml:space="preserve">0.0 </w:t>
             </w:r>
           </w:p>
         </w:tc>
@@ -2456,7 +2435,7 @@
               <w:rPr>
                 <w:rFonts w:ascii="Ebrima" w:hAnsi="Ebrima"/>
               </w:rPr>
-              <w:t>1.6.1</w:t>
+              <w:t>1.6.4</w:t>
             </w:r>
           </w:p>
         </w:tc>
@@ -2495,33 +2474,33 @@
               <w:rPr>
                 <w:rFonts w:ascii="Ebrima" w:hAnsi="Ebrima"/>
               </w:rPr>
-              <w:t>12.0</w:t>
-            </w:r>
-          </w:p>
-        </w:tc>
-        <w:tc>
-          <w:tcPr>
-            <w:tcW w:type="dxa" w:w="1234"/>
-          </w:tcPr>
-          <w:p>
-            <w:r>
-              <w:rPr>
-                <w:rFonts w:ascii="Ebrima" w:hAnsi="Ebrima"/>
-              </w:rPr>
-              <w:t>5.0</w:t>
-            </w:r>
-          </w:p>
-        </w:tc>
-        <w:tc>
-          <w:tcPr>
-            <w:tcW w:type="dxa" w:w="1234"/>
-          </w:tcPr>
-          <w:p>
-            <w:r>
-              <w:rPr>
-                <w:rFonts w:ascii="Ebrima" w:hAnsi="Ebrima"/>
-              </w:rPr>
-              <w:t>0.0</w:t>
+              <w:t xml:space="preserve">12.0 </w:t>
+            </w:r>
+          </w:p>
+        </w:tc>
+        <w:tc>
+          <w:tcPr>
+            <w:tcW w:type="dxa" w:w="1234"/>
+          </w:tcPr>
+          <w:p>
+            <w:r>
+              <w:rPr>
+                <w:rFonts w:ascii="Ebrima" w:hAnsi="Ebrima"/>
+              </w:rPr>
+              <w:t xml:space="preserve">5.0 </w:t>
+            </w:r>
+          </w:p>
+        </w:tc>
+        <w:tc>
+          <w:tcPr>
+            <w:tcW w:type="dxa" w:w="1234"/>
+          </w:tcPr>
+          <w:p>
+            <w:r>
+              <w:rPr>
+                <w:rFonts w:ascii="Ebrima" w:hAnsi="Ebrima"/>
+              </w:rPr>
+              <w:t xml:space="preserve">0.0 </w:t>
             </w:r>
           </w:p>
         </w:tc>
@@ -2549,7 +2528,7 @@
               <w:rPr>
                 <w:rFonts w:ascii="Ebrima" w:hAnsi="Ebrima"/>
               </w:rPr>
-              <w:t>1.6.2</w:t>
+              <w:t>1.6.4</w:t>
             </w:r>
           </w:p>
         </w:tc>
@@ -2588,33 +2567,33 @@
               <w:rPr>
                 <w:rFonts w:ascii="Ebrima" w:hAnsi="Ebrima"/>
               </w:rPr>
-              <w:t>0.0</w:t>
-            </w:r>
-          </w:p>
-        </w:tc>
-        <w:tc>
-          <w:tcPr>
-            <w:tcW w:type="dxa" w:w="1234"/>
-          </w:tcPr>
-          <w:p>
-            <w:r>
-              <w:rPr>
-                <w:rFonts w:ascii="Ebrima" w:hAnsi="Ebrima"/>
-              </w:rPr>
-              <w:t>5.0</w:t>
-            </w:r>
-          </w:p>
-        </w:tc>
-        <w:tc>
-          <w:tcPr>
-            <w:tcW w:type="dxa" w:w="1234"/>
-          </w:tcPr>
-          <w:p>
-            <w:r>
-              <w:rPr>
-                <w:rFonts w:ascii="Ebrima" w:hAnsi="Ebrima"/>
-              </w:rPr>
-              <w:t>0.0</w:t>
+              <w:t xml:space="preserve">0.0 </w:t>
+            </w:r>
+          </w:p>
+        </w:tc>
+        <w:tc>
+          <w:tcPr>
+            <w:tcW w:type="dxa" w:w="1234"/>
+          </w:tcPr>
+          <w:p>
+            <w:r>
+              <w:rPr>
+                <w:rFonts w:ascii="Ebrima" w:hAnsi="Ebrima"/>
+              </w:rPr>
+              <w:t xml:space="preserve">5.0 </w:t>
+            </w:r>
+          </w:p>
+        </w:tc>
+        <w:tc>
+          <w:tcPr>
+            <w:tcW w:type="dxa" w:w="1234"/>
+          </w:tcPr>
+          <w:p>
+            <w:r>
+              <w:rPr>
+                <w:rFonts w:ascii="Ebrima" w:hAnsi="Ebrima"/>
+              </w:rPr>
+              <w:t xml:space="preserve">0.0 </w:t>
             </w:r>
           </w:p>
         </w:tc>
@@ -2642,7 +2621,7 @@
               <w:rPr>
                 <w:rFonts w:ascii="Ebrima" w:hAnsi="Ebrima"/>
               </w:rPr>
-              <w:t>1.6.3</w:t>
+              <w:t>1.6.4</w:t>
             </w:r>
           </w:p>
         </w:tc>
@@ -2774,33 +2753,33 @@
               <w:rPr>
                 <w:rFonts w:ascii="Ebrima" w:hAnsi="Ebrima"/>
               </w:rPr>
-              <w:t>211.0</w:t>
-            </w:r>
-          </w:p>
-        </w:tc>
-        <w:tc>
-          <w:tcPr>
-            <w:tcW w:type="dxa" w:w="1234"/>
-          </w:tcPr>
-          <w:p>
-            <w:r>
-              <w:rPr>
-                <w:rFonts w:ascii="Ebrima" w:hAnsi="Ebrima"/>
-              </w:rPr>
-              <w:t>300.0</w:t>
-            </w:r>
-          </w:p>
-        </w:tc>
-        <w:tc>
-          <w:tcPr>
-            <w:tcW w:type="dxa" w:w="1234"/>
-          </w:tcPr>
-          <w:p>
-            <w:r>
-              <w:rPr>
-                <w:rFonts w:ascii="Ebrima" w:hAnsi="Ebrima"/>
-              </w:rPr>
-              <w:t>0.0</w:t>
+              <w:t xml:space="preserve">211.0 </w:t>
+            </w:r>
+          </w:p>
+        </w:tc>
+        <w:tc>
+          <w:tcPr>
+            <w:tcW w:type="dxa" w:w="1234"/>
+          </w:tcPr>
+          <w:p>
+            <w:r>
+              <w:rPr>
+                <w:rFonts w:ascii="Ebrima" w:hAnsi="Ebrima"/>
+              </w:rPr>
+              <w:t xml:space="preserve">300.0 </w:t>
+            </w:r>
+          </w:p>
+        </w:tc>
+        <w:tc>
+          <w:tcPr>
+            <w:tcW w:type="dxa" w:w="1234"/>
+          </w:tcPr>
+          <w:p>
+            <w:r>
+              <w:rPr>
+                <w:rFonts w:ascii="Ebrima" w:hAnsi="Ebrima"/>
+              </w:rPr>
+              <w:t xml:space="preserve">0.0 </w:t>
             </w:r>
           </w:p>
         </w:tc>
@@ -2892,7 +2871,7 @@
               <w:rPr>
                 <w:rFonts w:ascii="Ebrima" w:hAnsi="Ebrima"/>
               </w:rPr>
-              <w:t>2.1.1</w:t>
+              <w:t>2.1.4</w:t>
             </w:r>
           </w:p>
         </w:tc>
@@ -2931,33 +2910,33 @@
               <w:rPr>
                 <w:rFonts w:ascii="Ebrima" w:hAnsi="Ebrima"/>
               </w:rPr>
-              <w:t>9.0</w:t>
-            </w:r>
-          </w:p>
-        </w:tc>
-        <w:tc>
-          <w:tcPr>
-            <w:tcW w:type="dxa" w:w="1234"/>
-          </w:tcPr>
-          <w:p>
-            <w:r>
-              <w:rPr>
-                <w:rFonts w:ascii="Ebrima" w:hAnsi="Ebrima"/>
-              </w:rPr>
-              <w:t>11.0</w:t>
-            </w:r>
-          </w:p>
-        </w:tc>
-        <w:tc>
-          <w:tcPr>
-            <w:tcW w:type="dxa" w:w="1234"/>
-          </w:tcPr>
-          <w:p>
-            <w:r>
-              <w:rPr>
-                <w:rFonts w:ascii="Ebrima" w:hAnsi="Ebrima"/>
-              </w:rPr>
-              <w:t>4.0</w:t>
+              <w:t xml:space="preserve">9.0 </w:t>
+            </w:r>
+          </w:p>
+        </w:tc>
+        <w:tc>
+          <w:tcPr>
+            <w:tcW w:type="dxa" w:w="1234"/>
+          </w:tcPr>
+          <w:p>
+            <w:r>
+              <w:rPr>
+                <w:rFonts w:ascii="Ebrima" w:hAnsi="Ebrima"/>
+              </w:rPr>
+              <w:t xml:space="preserve">11.0 </w:t>
+            </w:r>
+          </w:p>
+        </w:tc>
+        <w:tc>
+          <w:tcPr>
+            <w:tcW w:type="dxa" w:w="1234"/>
+          </w:tcPr>
+          <w:p>
+            <w:r>
+              <w:rPr>
+                <w:rFonts w:ascii="Ebrima" w:hAnsi="Ebrima"/>
+              </w:rPr>
+              <w:t xml:space="preserve">4.0 </w:t>
             </w:r>
           </w:p>
         </w:tc>
@@ -2985,7 +2964,7 @@
               <w:rPr>
                 <w:rFonts w:ascii="Ebrima" w:hAnsi="Ebrima"/>
               </w:rPr>
-              <w:t>2.1.2</w:t>
+              <w:t>2.1.4</w:t>
             </w:r>
           </w:p>
         </w:tc>
@@ -3078,7 +3057,7 @@
               <w:rPr>
                 <w:rFonts w:ascii="Ebrima" w:hAnsi="Ebrima"/>
               </w:rPr>
-              <w:t>2.1.3</w:t>
+              <w:t>2.1.4</w:t>
             </w:r>
           </w:p>
         </w:tc>
@@ -3117,33 +3096,33 @@
               <w:rPr>
                 <w:rFonts w:ascii="Ebrima" w:hAnsi="Ebrima"/>
               </w:rPr>
-              <w:t>0.0</w:t>
-            </w:r>
-          </w:p>
-        </w:tc>
-        <w:tc>
-          <w:tcPr>
-            <w:tcW w:type="dxa" w:w="1234"/>
-          </w:tcPr>
-          <w:p>
-            <w:r>
-              <w:rPr>
-                <w:rFonts w:ascii="Ebrima" w:hAnsi="Ebrima"/>
-              </w:rPr>
-              <w:t>1.0</w:t>
-            </w:r>
-          </w:p>
-        </w:tc>
-        <w:tc>
-          <w:tcPr>
-            <w:tcW w:type="dxa" w:w="1234"/>
-          </w:tcPr>
-          <w:p>
-            <w:r>
-              <w:rPr>
-                <w:rFonts w:ascii="Ebrima" w:hAnsi="Ebrima"/>
-              </w:rPr>
-              <w:t>0.0</w:t>
+              <w:t xml:space="preserve">0.0 </w:t>
+            </w:r>
+          </w:p>
+        </w:tc>
+        <w:tc>
+          <w:tcPr>
+            <w:tcW w:type="dxa" w:w="1234"/>
+          </w:tcPr>
+          <w:p>
+            <w:r>
+              <w:rPr>
+                <w:rFonts w:ascii="Ebrima" w:hAnsi="Ebrima"/>
+              </w:rPr>
+              <w:t xml:space="preserve">1.0 </w:t>
+            </w:r>
+          </w:p>
+        </w:tc>
+        <w:tc>
+          <w:tcPr>
+            <w:tcW w:type="dxa" w:w="1234"/>
+          </w:tcPr>
+          <w:p>
+            <w:r>
+              <w:rPr>
+                <w:rFonts w:ascii="Ebrima" w:hAnsi="Ebrima"/>
+              </w:rPr>
+              <w:t xml:space="preserve">0.0 </w:t>
             </w:r>
           </w:p>
         </w:tc>
@@ -3202,7 +3181,7 @@
               <w:rPr>
                 <w:rFonts w:ascii="Ebrima" w:hAnsi="Ebrima"/>
               </w:rPr>
-              <w:t>2.2.1</w:t>
+              <w:t>2.2.4</w:t>
             </w:r>
           </w:p>
         </w:tc>
@@ -3295,7 +3274,7 @@
               <w:rPr>
                 <w:rFonts w:ascii="Ebrima" w:hAnsi="Ebrima"/>
               </w:rPr>
-              <w:t>2.2.2</w:t>
+              <w:t>2.2.4</w:t>
             </w:r>
           </w:p>
         </w:tc>
@@ -3388,7 +3367,7 @@
               <w:rPr>
                 <w:rFonts w:ascii="Ebrima" w:hAnsi="Ebrima"/>
               </w:rPr>
-              <w:t>2.2.3</w:t>
+              <w:t>2.2.4</w:t>
             </w:r>
           </w:p>
         </w:tc>
@@ -3574,7 +3553,7 @@
               <w:rPr>
                 <w:rFonts w:ascii="Ebrima" w:hAnsi="Ebrima"/>
               </w:rPr>
-              <w:t>2.2.5</w:t>
+              <w:t>2.2.4</w:t>
             </w:r>
           </w:p>
         </w:tc>
@@ -3667,7 +3646,7 @@
               <w:rPr>
                 <w:rFonts w:ascii="Ebrima" w:hAnsi="Ebrima"/>
               </w:rPr>
-              <w:t>2.2.6</w:t>
+              <w:t>2.2.4</w:t>
             </w:r>
           </w:p>
         </w:tc>
@@ -3791,7 +3770,7 @@
               <w:rPr>
                 <w:rFonts w:ascii="Ebrima" w:hAnsi="Ebrima"/>
               </w:rPr>
-              <w:t>2.3.1</w:t>
+              <w:t>2.3.4</w:t>
             </w:r>
           </w:p>
         </w:tc>
@@ -3884,7 +3863,7 @@
               <w:rPr>
                 <w:rFonts w:ascii="Ebrima" w:hAnsi="Ebrima"/>
               </w:rPr>
-              <w:t>2.3.2</w:t>
+              <w:t>2.3.4</w:t>
             </w:r>
           </w:p>
         </w:tc>
@@ -3923,33 +3902,33 @@
               <w:rPr>
                 <w:rFonts w:ascii="Ebrima" w:hAnsi="Ebrima"/>
               </w:rPr>
-              <w:t>1.0</w:t>
-            </w:r>
-          </w:p>
-        </w:tc>
-        <w:tc>
-          <w:tcPr>
-            <w:tcW w:type="dxa" w:w="1234"/>
-          </w:tcPr>
-          <w:p>
-            <w:r>
-              <w:rPr>
-                <w:rFonts w:ascii="Ebrima" w:hAnsi="Ebrima"/>
-              </w:rPr>
-              <w:t>1.0</w:t>
-            </w:r>
-          </w:p>
-        </w:tc>
-        <w:tc>
-          <w:tcPr>
-            <w:tcW w:type="dxa" w:w="1234"/>
-          </w:tcPr>
-          <w:p>
-            <w:r>
-              <w:rPr>
-                <w:rFonts w:ascii="Ebrima" w:hAnsi="Ebrima"/>
-              </w:rPr>
-              <w:t>0.0</w:t>
+              <w:t xml:space="preserve">1.0 </w:t>
+            </w:r>
+          </w:p>
+        </w:tc>
+        <w:tc>
+          <w:tcPr>
+            <w:tcW w:type="dxa" w:w="1234"/>
+          </w:tcPr>
+          <w:p>
+            <w:r>
+              <w:rPr>
+                <w:rFonts w:ascii="Ebrima" w:hAnsi="Ebrima"/>
+              </w:rPr>
+              <w:t xml:space="preserve">1.0 </w:t>
+            </w:r>
+          </w:p>
+        </w:tc>
+        <w:tc>
+          <w:tcPr>
+            <w:tcW w:type="dxa" w:w="1234"/>
+          </w:tcPr>
+          <w:p>
+            <w:r>
+              <w:rPr>
+                <w:rFonts w:ascii="Ebrima" w:hAnsi="Ebrima"/>
+              </w:rPr>
+              <w:t xml:space="preserve">0.0 </w:t>
             </w:r>
           </w:p>
         </w:tc>
@@ -3977,7 +3956,7 @@
               <w:rPr>
                 <w:rFonts w:ascii="Ebrima" w:hAnsi="Ebrima"/>
               </w:rPr>
-              <w:t>2.3.3</w:t>
+              <w:t>2.3.4</w:t>
             </w:r>
           </w:p>
         </w:tc>
@@ -4109,33 +4088,33 @@
               <w:rPr>
                 <w:rFonts w:ascii="Ebrima" w:hAnsi="Ebrima"/>
               </w:rPr>
-              <w:t>85.0</w:t>
-            </w:r>
-          </w:p>
-        </w:tc>
-        <w:tc>
-          <w:tcPr>
-            <w:tcW w:type="dxa" w:w="1234"/>
-          </w:tcPr>
-          <w:p>
-            <w:r>
-              <w:rPr>
-                <w:rFonts w:ascii="Ebrima" w:hAnsi="Ebrima"/>
-              </w:rPr>
-              <w:t>40.0</w:t>
-            </w:r>
-          </w:p>
-        </w:tc>
-        <w:tc>
-          <w:tcPr>
-            <w:tcW w:type="dxa" w:w="1234"/>
-          </w:tcPr>
-          <w:p>
-            <w:r>
-              <w:rPr>
-                <w:rFonts w:ascii="Ebrima" w:hAnsi="Ebrima"/>
-              </w:rPr>
-              <w:t>0.0</w:t>
+              <w:t xml:space="preserve">85.0 </w:t>
+            </w:r>
+          </w:p>
+        </w:tc>
+        <w:tc>
+          <w:tcPr>
+            <w:tcW w:type="dxa" w:w="1234"/>
+          </w:tcPr>
+          <w:p>
+            <w:r>
+              <w:rPr>
+                <w:rFonts w:ascii="Ebrima" w:hAnsi="Ebrima"/>
+              </w:rPr>
+              <w:t xml:space="preserve">40.0 </w:t>
+            </w:r>
+          </w:p>
+        </w:tc>
+        <w:tc>
+          <w:tcPr>
+            <w:tcW w:type="dxa" w:w="1234"/>
+          </w:tcPr>
+          <w:p>
+            <w:r>
+              <w:rPr>
+                <w:rFonts w:ascii="Ebrima" w:hAnsi="Ebrima"/>
+              </w:rPr>
+              <w:t xml:space="preserve">0.0 </w:t>
             </w:r>
           </w:p>
         </w:tc>
@@ -4194,7 +4173,7 @@
               <w:rPr>
                 <w:rFonts w:ascii="Ebrima" w:hAnsi="Ebrima"/>
               </w:rPr>
-              <w:t>2.4.1</w:t>
+              <w:t>2.4.4</w:t>
             </w:r>
           </w:p>
         </w:tc>
@@ -4287,7 +4266,7 @@
               <w:rPr>
                 <w:rFonts w:ascii="Ebrima" w:hAnsi="Ebrima"/>
               </w:rPr>
-              <w:t>2.4.2</w:t>
+              <w:t>2.4.4</w:t>
             </w:r>
           </w:p>
         </w:tc>
@@ -4380,7 +4359,7 @@
               <w:rPr>
                 <w:rFonts w:ascii="Ebrima" w:hAnsi="Ebrima"/>
               </w:rPr>
-              <w:t>2.4.3</w:t>
+              <w:t>2.4.4</w:t>
             </w:r>
           </w:p>
         </w:tc>
@@ -4597,7 +4576,7 @@
               <w:rPr>
                 <w:rFonts w:ascii="Ebrima" w:hAnsi="Ebrima"/>
               </w:rPr>
-              <w:t>2.5.1</w:t>
+              <w:t>2.5.4</w:t>
             </w:r>
           </w:p>
         </w:tc>
@@ -4690,7 +4669,7 @@
               <w:rPr>
                 <w:rFonts w:ascii="Ebrima" w:hAnsi="Ebrima"/>
               </w:rPr>
-              <w:t>2.5.2</w:t>
+              <w:t>2.5.4</w:t>
             </w:r>
           </w:p>
         </w:tc>
@@ -4783,7 +4762,7 @@
               <w:rPr>
                 <w:rFonts w:ascii="Ebrima" w:hAnsi="Ebrima"/>
               </w:rPr>
-              <w:t>2.5.3</w:t>
+              <w:t>2.5.4</w:t>
             </w:r>
           </w:p>
         </w:tc>
@@ -4907,7 +4886,7 @@
               <w:rPr>
                 <w:rFonts w:ascii="Ebrima" w:hAnsi="Ebrima"/>
               </w:rPr>
-              <w:t>2.6.1</w:t>
+              <w:t>2.6.4</w:t>
             </w:r>
           </w:p>
         </w:tc>
@@ -5000,7 +4979,7 @@
               <w:rPr>
                 <w:rFonts w:ascii="Ebrima" w:hAnsi="Ebrima"/>
               </w:rPr>
-              <w:t>2.6.2</w:t>
+              <w:t>2.6.4</w:t>
             </w:r>
           </w:p>
         </w:tc>
@@ -5039,33 +5018,33 @@
               <w:rPr>
                 <w:rFonts w:ascii="Ebrima" w:hAnsi="Ebrima"/>
               </w:rPr>
-              <w:t>4.0</w:t>
-            </w:r>
-          </w:p>
-        </w:tc>
-        <w:tc>
-          <w:tcPr>
-            <w:tcW w:type="dxa" w:w="1234"/>
-          </w:tcPr>
-          <w:p>
-            <w:r>
-              <w:rPr>
-                <w:rFonts w:ascii="Ebrima" w:hAnsi="Ebrima"/>
-              </w:rPr>
-              <w:t>4.0</w:t>
-            </w:r>
-          </w:p>
-        </w:tc>
-        <w:tc>
-          <w:tcPr>
-            <w:tcW w:type="dxa" w:w="1234"/>
-          </w:tcPr>
-          <w:p>
-            <w:r>
-              <w:rPr>
-                <w:rFonts w:ascii="Ebrima" w:hAnsi="Ebrima"/>
-              </w:rPr>
-              <w:t>0.0</w:t>
+              <w:t xml:space="preserve">4.0 </w:t>
+            </w:r>
+          </w:p>
+        </w:tc>
+        <w:tc>
+          <w:tcPr>
+            <w:tcW w:type="dxa" w:w="1234"/>
+          </w:tcPr>
+          <w:p>
+            <w:r>
+              <w:rPr>
+                <w:rFonts w:ascii="Ebrima" w:hAnsi="Ebrima"/>
+              </w:rPr>
+              <w:t xml:space="preserve">4.0 </w:t>
+            </w:r>
+          </w:p>
+        </w:tc>
+        <w:tc>
+          <w:tcPr>
+            <w:tcW w:type="dxa" w:w="1234"/>
+          </w:tcPr>
+          <w:p>
+            <w:r>
+              <w:rPr>
+                <w:rFonts w:ascii="Ebrima" w:hAnsi="Ebrima"/>
+              </w:rPr>
+              <w:t xml:space="preserve">0.0 </w:t>
             </w:r>
           </w:p>
         </w:tc>
@@ -5093,7 +5072,7 @@
               <w:rPr>
                 <w:rFonts w:ascii="Ebrima" w:hAnsi="Ebrima"/>
               </w:rPr>
-              <w:t>2.6.3</w:t>
+              <w:t>2.6.4</w:t>
             </w:r>
           </w:p>
         </w:tc>
@@ -5217,7 +5196,7 @@
               <w:rPr>
                 <w:rFonts w:ascii="Ebrima" w:hAnsi="Ebrima"/>
               </w:rPr>
-              <w:t>2.7.1</w:t>
+              <w:t>2.7.4</w:t>
             </w:r>
           </w:p>
         </w:tc>
@@ -5256,33 +5235,33 @@
               <w:rPr>
                 <w:rFonts w:ascii="Ebrima" w:hAnsi="Ebrima"/>
               </w:rPr>
-              <w:t>60.0</w:t>
-            </w:r>
-          </w:p>
-        </w:tc>
-        <w:tc>
-          <w:tcPr>
-            <w:tcW w:type="dxa" w:w="1234"/>
-          </w:tcPr>
-          <w:p>
-            <w:r>
-              <w:rPr>
-                <w:rFonts w:ascii="Ebrima" w:hAnsi="Ebrima"/>
-              </w:rPr>
-              <w:t>65.0</w:t>
-            </w:r>
-          </w:p>
-        </w:tc>
-        <w:tc>
-          <w:tcPr>
-            <w:tcW w:type="dxa" w:w="1234"/>
-          </w:tcPr>
-          <w:p>
-            <w:r>
-              <w:rPr>
-                <w:rFonts w:ascii="Ebrima" w:hAnsi="Ebrima"/>
-              </w:rPr>
-              <w:t>0.0</w:t>
+              <w:t xml:space="preserve">60.0 </w:t>
+            </w:r>
+          </w:p>
+        </w:tc>
+        <w:tc>
+          <w:tcPr>
+            <w:tcW w:type="dxa" w:w="1234"/>
+          </w:tcPr>
+          <w:p>
+            <w:r>
+              <w:rPr>
+                <w:rFonts w:ascii="Ebrima" w:hAnsi="Ebrima"/>
+              </w:rPr>
+              <w:t xml:space="preserve">65.0 </w:t>
+            </w:r>
+          </w:p>
+        </w:tc>
+        <w:tc>
+          <w:tcPr>
+            <w:tcW w:type="dxa" w:w="1234"/>
+          </w:tcPr>
+          <w:p>
+            <w:r>
+              <w:rPr>
+                <w:rFonts w:ascii="Ebrima" w:hAnsi="Ebrima"/>
+              </w:rPr>
+              <w:t xml:space="preserve">0.0 </w:t>
             </w:r>
           </w:p>
         </w:tc>
@@ -5310,7 +5289,7 @@
               <w:rPr>
                 <w:rFonts w:ascii="Ebrima" w:hAnsi="Ebrima"/>
               </w:rPr>
-              <w:t>2.7.2</w:t>
+              <w:t>2.7.4</w:t>
             </w:r>
           </w:p>
         </w:tc>
@@ -5349,33 +5328,33 @@
               <w:rPr>
                 <w:rFonts w:ascii="Ebrima" w:hAnsi="Ebrima"/>
               </w:rPr>
-              <w:t>200.0</w:t>
-            </w:r>
-          </w:p>
-        </w:tc>
-        <w:tc>
-          <w:tcPr>
-            <w:tcW w:type="dxa" w:w="1234"/>
-          </w:tcPr>
-          <w:p>
-            <w:r>
-              <w:rPr>
-                <w:rFonts w:ascii="Ebrima" w:hAnsi="Ebrima"/>
-              </w:rPr>
-              <w:t>208.0</w:t>
-            </w:r>
-          </w:p>
-        </w:tc>
-        <w:tc>
-          <w:tcPr>
-            <w:tcW w:type="dxa" w:w="1234"/>
-          </w:tcPr>
-          <w:p>
-            <w:r>
-              <w:rPr>
-                <w:rFonts w:ascii="Ebrima" w:hAnsi="Ebrima"/>
-              </w:rPr>
-              <w:t>0.0</w:t>
+              <w:t xml:space="preserve">200.0 </w:t>
+            </w:r>
+          </w:p>
+        </w:tc>
+        <w:tc>
+          <w:tcPr>
+            <w:tcW w:type="dxa" w:w="1234"/>
+          </w:tcPr>
+          <w:p>
+            <w:r>
+              <w:rPr>
+                <w:rFonts w:ascii="Ebrima" w:hAnsi="Ebrima"/>
+              </w:rPr>
+              <w:t xml:space="preserve">208.0 </w:t>
+            </w:r>
+          </w:p>
+        </w:tc>
+        <w:tc>
+          <w:tcPr>
+            <w:tcW w:type="dxa" w:w="1234"/>
+          </w:tcPr>
+          <w:p>
+            <w:r>
+              <w:rPr>
+                <w:rFonts w:ascii="Ebrima" w:hAnsi="Ebrima"/>
+              </w:rPr>
+              <w:t xml:space="preserve">0.0 </w:t>
             </w:r>
           </w:p>
         </w:tc>
@@ -5403,7 +5382,7 @@
               <w:rPr>
                 <w:rFonts w:ascii="Ebrima" w:hAnsi="Ebrima"/>
               </w:rPr>
-              <w:t>2.7.3</w:t>
+              <w:t>2.7.4</w:t>
             </w:r>
           </w:p>
         </w:tc>
@@ -5442,33 +5421,33 @@
               <w:rPr>
                 <w:rFonts w:ascii="Ebrima" w:hAnsi="Ebrima"/>
               </w:rPr>
-              <w:t>40.0</w:t>
-            </w:r>
-          </w:p>
-        </w:tc>
-        <w:tc>
-          <w:tcPr>
-            <w:tcW w:type="dxa" w:w="1234"/>
-          </w:tcPr>
-          <w:p>
-            <w:r>
-              <w:rPr>
-                <w:rFonts w:ascii="Ebrima" w:hAnsi="Ebrima"/>
-              </w:rPr>
-              <w:t>50.0</w:t>
-            </w:r>
-          </w:p>
-        </w:tc>
-        <w:tc>
-          <w:tcPr>
-            <w:tcW w:type="dxa" w:w="1234"/>
-          </w:tcPr>
-          <w:p>
-            <w:r>
-              <w:rPr>
-                <w:rFonts w:ascii="Ebrima" w:hAnsi="Ebrima"/>
-              </w:rPr>
-              <w:t>0.0</w:t>
+              <w:t xml:space="preserve">40.0 </w:t>
+            </w:r>
+          </w:p>
+        </w:tc>
+        <w:tc>
+          <w:tcPr>
+            <w:tcW w:type="dxa" w:w="1234"/>
+          </w:tcPr>
+          <w:p>
+            <w:r>
+              <w:rPr>
+                <w:rFonts w:ascii="Ebrima" w:hAnsi="Ebrima"/>
+              </w:rPr>
+              <w:t xml:space="preserve">50.0 </w:t>
+            </w:r>
+          </w:p>
+        </w:tc>
+        <w:tc>
+          <w:tcPr>
+            <w:tcW w:type="dxa" w:w="1234"/>
+          </w:tcPr>
+          <w:p>
+            <w:r>
+              <w:rPr>
+                <w:rFonts w:ascii="Ebrima" w:hAnsi="Ebrima"/>
+              </w:rPr>
+              <w:t xml:space="preserve">0.0 </w:t>
             </w:r>
           </w:p>
         </w:tc>
@@ -5535,33 +5514,33 @@
               <w:rPr>
                 <w:rFonts w:ascii="Ebrima" w:hAnsi="Ebrima"/>
               </w:rPr>
-              <w:t>25.0</w:t>
-            </w:r>
-          </w:p>
-        </w:tc>
-        <w:tc>
-          <w:tcPr>
-            <w:tcW w:type="dxa" w:w="1234"/>
-          </w:tcPr>
-          <w:p>
-            <w:r>
-              <w:rPr>
-                <w:rFonts w:ascii="Ebrima" w:hAnsi="Ebrima"/>
-              </w:rPr>
-              <w:t>25.0</w:t>
-            </w:r>
-          </w:p>
-        </w:tc>
-        <w:tc>
-          <w:tcPr>
-            <w:tcW w:type="dxa" w:w="1234"/>
-          </w:tcPr>
-          <w:p>
-            <w:r>
-              <w:rPr>
-                <w:rFonts w:ascii="Ebrima" w:hAnsi="Ebrima"/>
-              </w:rPr>
-              <w:t>0.0</w:t>
+              <w:t xml:space="preserve">25.0 </w:t>
+            </w:r>
+          </w:p>
+        </w:tc>
+        <w:tc>
+          <w:tcPr>
+            <w:tcW w:type="dxa" w:w="1234"/>
+          </w:tcPr>
+          <w:p>
+            <w:r>
+              <w:rPr>
+                <w:rFonts w:ascii="Ebrima" w:hAnsi="Ebrima"/>
+              </w:rPr>
+              <w:t xml:space="preserve">25.0 </w:t>
+            </w:r>
+          </w:p>
+        </w:tc>
+        <w:tc>
+          <w:tcPr>
+            <w:tcW w:type="dxa" w:w="1234"/>
+          </w:tcPr>
+          <w:p>
+            <w:r>
+              <w:rPr>
+                <w:rFonts w:ascii="Ebrima" w:hAnsi="Ebrima"/>
+              </w:rPr>
+              <w:t xml:space="preserve">0.0 </w:t>
             </w:r>
           </w:p>
         </w:tc>
@@ -5620,7 +5599,7 @@
               <w:rPr>
                 <w:rFonts w:ascii="Ebrima" w:hAnsi="Ebrima"/>
               </w:rPr>
-              <w:t>2.8.1</w:t>
+              <w:t>2.8.4</w:t>
             </w:r>
           </w:p>
         </w:tc>
@@ -5659,33 +5638,33 @@
               <w:rPr>
                 <w:rFonts w:ascii="Ebrima" w:hAnsi="Ebrima"/>
               </w:rPr>
-              <w:t>6000.0</w:t>
-            </w:r>
-          </w:p>
-        </w:tc>
-        <w:tc>
-          <w:tcPr>
-            <w:tcW w:type="dxa" w:w="1234"/>
-          </w:tcPr>
-          <w:p>
-            <w:r>
-              <w:rPr>
-                <w:rFonts w:ascii="Ebrima" w:hAnsi="Ebrima"/>
-              </w:rPr>
-              <w:t>6000.0</w:t>
-            </w:r>
-          </w:p>
-        </w:tc>
-        <w:tc>
-          <w:tcPr>
-            <w:tcW w:type="dxa" w:w="1234"/>
-          </w:tcPr>
-          <w:p>
-            <w:r>
-              <w:rPr>
-                <w:rFonts w:ascii="Ebrima" w:hAnsi="Ebrima"/>
-              </w:rPr>
-              <w:t>0.0</w:t>
+              <w:t xml:space="preserve">6000.0 </w:t>
+            </w:r>
+          </w:p>
+        </w:tc>
+        <w:tc>
+          <w:tcPr>
+            <w:tcW w:type="dxa" w:w="1234"/>
+          </w:tcPr>
+          <w:p>
+            <w:r>
+              <w:rPr>
+                <w:rFonts w:ascii="Ebrima" w:hAnsi="Ebrima"/>
+              </w:rPr>
+              <w:t xml:space="preserve">6000.0 </w:t>
+            </w:r>
+          </w:p>
+        </w:tc>
+        <w:tc>
+          <w:tcPr>
+            <w:tcW w:type="dxa" w:w="1234"/>
+          </w:tcPr>
+          <w:p>
+            <w:r>
+              <w:rPr>
+                <w:rFonts w:ascii="Ebrima" w:hAnsi="Ebrima"/>
+              </w:rPr>
+              <w:t xml:space="preserve">0.0 </w:t>
             </w:r>
           </w:p>
         </w:tc>
@@ -5713,7 +5692,7 @@
               <w:rPr>
                 <w:rFonts w:ascii="Ebrima" w:hAnsi="Ebrima"/>
               </w:rPr>
-              <w:t>2.8.2</w:t>
+              <w:t>2.8.4</w:t>
             </w:r>
           </w:p>
         </w:tc>
@@ -5752,33 +5731,33 @@
               <w:rPr>
                 <w:rFonts w:ascii="Ebrima" w:hAnsi="Ebrima"/>
               </w:rPr>
-              <w:t>10.0</w:t>
-            </w:r>
-          </w:p>
-        </w:tc>
-        <w:tc>
-          <w:tcPr>
-            <w:tcW w:type="dxa" w:w="1234"/>
-          </w:tcPr>
-          <w:p>
-            <w:r>
-              <w:rPr>
-                <w:rFonts w:ascii="Ebrima" w:hAnsi="Ebrima"/>
-              </w:rPr>
-              <w:t>10.0</w:t>
-            </w:r>
-          </w:p>
-        </w:tc>
-        <w:tc>
-          <w:tcPr>
-            <w:tcW w:type="dxa" w:w="1234"/>
-          </w:tcPr>
-          <w:p>
-            <w:r>
-              <w:rPr>
-                <w:rFonts w:ascii="Ebrima" w:hAnsi="Ebrima"/>
-              </w:rPr>
-              <w:t>0.0</w:t>
+              <w:t xml:space="preserve">10.0 </w:t>
+            </w:r>
+          </w:p>
+        </w:tc>
+        <w:tc>
+          <w:tcPr>
+            <w:tcW w:type="dxa" w:w="1234"/>
+          </w:tcPr>
+          <w:p>
+            <w:r>
+              <w:rPr>
+                <w:rFonts w:ascii="Ebrima" w:hAnsi="Ebrima"/>
+              </w:rPr>
+              <w:t xml:space="preserve">10.0 </w:t>
+            </w:r>
+          </w:p>
+        </w:tc>
+        <w:tc>
+          <w:tcPr>
+            <w:tcW w:type="dxa" w:w="1234"/>
+          </w:tcPr>
+          <w:p>
+            <w:r>
+              <w:rPr>
+                <w:rFonts w:ascii="Ebrima" w:hAnsi="Ebrima"/>
+              </w:rPr>
+              <w:t xml:space="preserve">0.0 </w:t>
             </w:r>
           </w:p>
         </w:tc>
@@ -5806,7 +5785,7 @@
               <w:rPr>
                 <w:rFonts w:ascii="Ebrima" w:hAnsi="Ebrima"/>
               </w:rPr>
-              <w:t>2.8.3</w:t>
+              <w:t>2.8.4</w:t>
             </w:r>
           </w:p>
         </w:tc>
@@ -5938,33 +5917,33 @@
               <w:rPr>
                 <w:rFonts w:ascii="Ebrima" w:hAnsi="Ebrima"/>
               </w:rPr>
-              <w:t>62.0</w:t>
-            </w:r>
-          </w:p>
-        </w:tc>
-        <w:tc>
-          <w:tcPr>
-            <w:tcW w:type="dxa" w:w="1234"/>
-          </w:tcPr>
-          <w:p>
-            <w:r>
-              <w:rPr>
-                <w:rFonts w:ascii="Ebrima" w:hAnsi="Ebrima"/>
-              </w:rPr>
-              <w:t>100.0</w:t>
-            </w:r>
-          </w:p>
-        </w:tc>
-        <w:tc>
-          <w:tcPr>
-            <w:tcW w:type="dxa" w:w="1234"/>
-          </w:tcPr>
-          <w:p>
-            <w:r>
-              <w:rPr>
-                <w:rFonts w:ascii="Ebrima" w:hAnsi="Ebrima"/>
-              </w:rPr>
-              <w:t>0.0</w:t>
+              <w:t xml:space="preserve">62.0 </w:t>
+            </w:r>
+          </w:p>
+        </w:tc>
+        <w:tc>
+          <w:tcPr>
+            <w:tcW w:type="dxa" w:w="1234"/>
+          </w:tcPr>
+          <w:p>
+            <w:r>
+              <w:rPr>
+                <w:rFonts w:ascii="Ebrima" w:hAnsi="Ebrima"/>
+              </w:rPr>
+              <w:t xml:space="preserve">100.0 </w:t>
+            </w:r>
+          </w:p>
+        </w:tc>
+        <w:tc>
+          <w:tcPr>
+            <w:tcW w:type="dxa" w:w="1234"/>
+          </w:tcPr>
+          <w:p>
+            <w:r>
+              <w:rPr>
+                <w:rFonts w:ascii="Ebrima" w:hAnsi="Ebrima"/>
+              </w:rPr>
+              <w:t xml:space="preserve">0.0 </w:t>
             </w:r>
           </w:p>
         </w:tc>
@@ -5992,7 +5971,7 @@
               <w:rPr>
                 <w:rFonts w:ascii="Ebrima" w:hAnsi="Ebrima"/>
               </w:rPr>
-              <w:t>2.8.5</w:t>
+              <w:t>2.8.4</w:t>
             </w:r>
           </w:p>
         </w:tc>
@@ -6085,7 +6064,7 @@
               <w:rPr>
                 <w:rFonts w:ascii="Ebrima" w:hAnsi="Ebrima"/>
               </w:rPr>
-              <w:t>2.8.6</w:t>
+              <w:t>2.8.4</w:t>
             </w:r>
           </w:p>
         </w:tc>
@@ -6124,33 +6103,33 @@
               <w:rPr>
                 <w:rFonts w:ascii="Ebrima" w:hAnsi="Ebrima"/>
               </w:rPr>
-              <w:t>1286.0</w:t>
-            </w:r>
-          </w:p>
-        </w:tc>
-        <w:tc>
-          <w:tcPr>
-            <w:tcW w:type="dxa" w:w="1234"/>
-          </w:tcPr>
-          <w:p>
-            <w:r>
-              <w:rPr>
-                <w:rFonts w:ascii="Ebrima" w:hAnsi="Ebrima"/>
-              </w:rPr>
-              <w:t>1600.0</w:t>
-            </w:r>
-          </w:p>
-        </w:tc>
-        <w:tc>
-          <w:tcPr>
-            <w:tcW w:type="dxa" w:w="1234"/>
-          </w:tcPr>
-          <w:p>
-            <w:r>
-              <w:rPr>
-                <w:rFonts w:ascii="Ebrima" w:hAnsi="Ebrima"/>
-              </w:rPr>
-              <w:t>0.0</w:t>
+              <w:t xml:space="preserve">1286.0 </w:t>
+            </w:r>
+          </w:p>
+        </w:tc>
+        <w:tc>
+          <w:tcPr>
+            <w:tcW w:type="dxa" w:w="1234"/>
+          </w:tcPr>
+          <w:p>
+            <w:r>
+              <w:rPr>
+                <w:rFonts w:ascii="Ebrima" w:hAnsi="Ebrima"/>
+              </w:rPr>
+              <w:t xml:space="preserve">1600.0 </w:t>
+            </w:r>
+          </w:p>
+        </w:tc>
+        <w:tc>
+          <w:tcPr>
+            <w:tcW w:type="dxa" w:w="1234"/>
+          </w:tcPr>
+          <w:p>
+            <w:r>
+              <w:rPr>
+                <w:rFonts w:ascii="Ebrima" w:hAnsi="Ebrima"/>
+              </w:rPr>
+              <w:t xml:space="preserve">0.0 </w:t>
             </w:r>
           </w:p>
         </w:tc>
@@ -6178,7 +6157,7 @@
               <w:rPr>
                 <w:rFonts w:ascii="Ebrima" w:hAnsi="Ebrima"/>
               </w:rPr>
-              <w:t>2.8.7</w:t>
+              <w:t>2.8.4</w:t>
             </w:r>
           </w:p>
         </w:tc>
@@ -6271,7 +6250,7 @@
               <w:rPr>
                 <w:rFonts w:ascii="Ebrima" w:hAnsi="Ebrima"/>
               </w:rPr>
-              <w:t>2.8.8</w:t>
+              <w:t>2.8.4</w:t>
             </w:r>
           </w:p>
         </w:tc>
@@ -6310,33 +6289,33 @@
               <w:rPr>
                 <w:rFonts w:ascii="Ebrima" w:hAnsi="Ebrima"/>
               </w:rPr>
-              <w:t>100.0</w:t>
-            </w:r>
-          </w:p>
-        </w:tc>
-        <w:tc>
-          <w:tcPr>
-            <w:tcW w:type="dxa" w:w="1234"/>
-          </w:tcPr>
-          <w:p>
-            <w:r>
-              <w:rPr>
-                <w:rFonts w:ascii="Ebrima" w:hAnsi="Ebrima"/>
-              </w:rPr>
-              <w:t>100.0</w:t>
-            </w:r>
-          </w:p>
-        </w:tc>
-        <w:tc>
-          <w:tcPr>
-            <w:tcW w:type="dxa" w:w="1234"/>
-          </w:tcPr>
-          <w:p>
-            <w:r>
-              <w:rPr>
-                <w:rFonts w:ascii="Ebrima" w:hAnsi="Ebrima"/>
-              </w:rPr>
-              <w:t>0.0</w:t>
+              <w:t xml:space="preserve">100.0 </w:t>
+            </w:r>
+          </w:p>
+        </w:tc>
+        <w:tc>
+          <w:tcPr>
+            <w:tcW w:type="dxa" w:w="1234"/>
+          </w:tcPr>
+          <w:p>
+            <w:r>
+              <w:rPr>
+                <w:rFonts w:ascii="Ebrima" w:hAnsi="Ebrima"/>
+              </w:rPr>
+              <w:t xml:space="preserve">100.0 </w:t>
+            </w:r>
+          </w:p>
+        </w:tc>
+        <w:tc>
+          <w:tcPr>
+            <w:tcW w:type="dxa" w:w="1234"/>
+          </w:tcPr>
+          <w:p>
+            <w:r>
+              <w:rPr>
+                <w:rFonts w:ascii="Ebrima" w:hAnsi="Ebrima"/>
+              </w:rPr>
+              <w:t xml:space="preserve">0.0 </w:t>
             </w:r>
           </w:p>
         </w:tc>
@@ -6364,7 +6343,7 @@
               <w:rPr>
                 <w:rFonts w:ascii="Ebrima" w:hAnsi="Ebrima"/>
               </w:rPr>
-              <w:t>2.8.9</w:t>
+              <w:t>2.8.4</w:t>
             </w:r>
           </w:p>
         </w:tc>
@@ -6457,7 +6436,7 @@
               <w:rPr>
                 <w:rFonts w:ascii="Ebrima" w:hAnsi="Ebrima"/>
               </w:rPr>
-              <w:t>2.8.10</w:t>
+              <w:t>2.8.4</w:t>
             </w:r>
           </w:p>
         </w:tc>
@@ -6614,7 +6593,7 @@
               <w:rPr>
                 <w:rFonts w:ascii="Ebrima" w:hAnsi="Ebrima"/>
               </w:rPr>
-              <w:t>3.1.1</w:t>
+              <w:t>3.1.4</w:t>
             </w:r>
           </w:p>
         </w:tc>
@@ -6707,7 +6686,7 @@
               <w:rPr>
                 <w:rFonts w:ascii="Ebrima" w:hAnsi="Ebrima"/>
               </w:rPr>
-              <w:t>3.1.2</w:t>
+              <w:t>3.1.4</w:t>
             </w:r>
           </w:p>
         </w:tc>
@@ -6746,33 +6725,33 @@
               <w:rPr>
                 <w:rFonts w:ascii="Ebrima" w:hAnsi="Ebrima"/>
               </w:rPr>
-              <w:t>25500.0</w:t>
-            </w:r>
-          </w:p>
-        </w:tc>
-        <w:tc>
-          <w:tcPr>
-            <w:tcW w:type="dxa" w:w="1234"/>
-          </w:tcPr>
-          <w:p>
-            <w:r>
-              <w:rPr>
-                <w:rFonts w:ascii="Ebrima" w:hAnsi="Ebrima"/>
-              </w:rPr>
-              <w:t>25500.0</w:t>
-            </w:r>
-          </w:p>
-        </w:tc>
-        <w:tc>
-          <w:tcPr>
-            <w:tcW w:type="dxa" w:w="1234"/>
-          </w:tcPr>
-          <w:p>
-            <w:r>
-              <w:rPr>
-                <w:rFonts w:ascii="Ebrima" w:hAnsi="Ebrima"/>
-              </w:rPr>
-              <w:t>0.0</w:t>
+              <w:t xml:space="preserve">25500.0 </w:t>
+            </w:r>
+          </w:p>
+        </w:tc>
+        <w:tc>
+          <w:tcPr>
+            <w:tcW w:type="dxa" w:w="1234"/>
+          </w:tcPr>
+          <w:p>
+            <w:r>
+              <w:rPr>
+                <w:rFonts w:ascii="Ebrima" w:hAnsi="Ebrima"/>
+              </w:rPr>
+              <w:t xml:space="preserve">25500.0 </w:t>
+            </w:r>
+          </w:p>
+        </w:tc>
+        <w:tc>
+          <w:tcPr>
+            <w:tcW w:type="dxa" w:w="1234"/>
+          </w:tcPr>
+          <w:p>
+            <w:r>
+              <w:rPr>
+                <w:rFonts w:ascii="Ebrima" w:hAnsi="Ebrima"/>
+              </w:rPr>
+              <w:t xml:space="preserve">0.0 </w:t>
             </w:r>
           </w:p>
         </w:tc>
@@ -6800,7 +6779,7 @@
               <w:rPr>
                 <w:rFonts w:ascii="Ebrima" w:hAnsi="Ebrima"/>
               </w:rPr>
-              <w:t>3.1.3</w:t>
+              <w:t>3.1.4</w:t>
             </w:r>
           </w:p>
         </w:tc>
@@ -6839,33 +6818,33 @@
               <w:rPr>
                 <w:rFonts w:ascii="Ebrima" w:hAnsi="Ebrima"/>
               </w:rPr>
-              <w:t>48000.0</w:t>
-            </w:r>
-          </w:p>
-        </w:tc>
-        <w:tc>
-          <w:tcPr>
-            <w:tcW w:type="dxa" w:w="1234"/>
-          </w:tcPr>
-          <w:p>
-            <w:r>
-              <w:rPr>
-                <w:rFonts w:ascii="Ebrima" w:hAnsi="Ebrima"/>
-              </w:rPr>
-              <w:t>70000.0</w:t>
-            </w:r>
-          </w:p>
-        </w:tc>
-        <w:tc>
-          <w:tcPr>
-            <w:tcW w:type="dxa" w:w="1234"/>
-          </w:tcPr>
-          <w:p>
-            <w:r>
-              <w:rPr>
-                <w:rFonts w:ascii="Ebrima" w:hAnsi="Ebrima"/>
-              </w:rPr>
-              <w:t>0.0</w:t>
+              <w:t xml:space="preserve">48000.0 </w:t>
+            </w:r>
+          </w:p>
+        </w:tc>
+        <w:tc>
+          <w:tcPr>
+            <w:tcW w:type="dxa" w:w="1234"/>
+          </w:tcPr>
+          <w:p>
+            <w:r>
+              <w:rPr>
+                <w:rFonts w:ascii="Ebrima" w:hAnsi="Ebrima"/>
+              </w:rPr>
+              <w:t xml:space="preserve">70000.0 </w:t>
+            </w:r>
+          </w:p>
+        </w:tc>
+        <w:tc>
+          <w:tcPr>
+            <w:tcW w:type="dxa" w:w="1234"/>
+          </w:tcPr>
+          <w:p>
+            <w:r>
+              <w:rPr>
+                <w:rFonts w:ascii="Ebrima" w:hAnsi="Ebrima"/>
+              </w:rPr>
+              <w:t xml:space="preserve">0.0 </w:t>
             </w:r>
           </w:p>
         </w:tc>
@@ -6932,33 +6911,33 @@
               <w:rPr>
                 <w:rFonts w:ascii="Ebrima" w:hAnsi="Ebrima"/>
               </w:rPr>
-              <w:t>5000.0</w:t>
-            </w:r>
-          </w:p>
-        </w:tc>
-        <w:tc>
-          <w:tcPr>
-            <w:tcW w:type="dxa" w:w="1234"/>
-          </w:tcPr>
-          <w:p>
-            <w:r>
-              <w:rPr>
-                <w:rFonts w:ascii="Ebrima" w:hAnsi="Ebrima"/>
-              </w:rPr>
-              <w:t>5000.0</w:t>
-            </w:r>
-          </w:p>
-        </w:tc>
-        <w:tc>
-          <w:tcPr>
-            <w:tcW w:type="dxa" w:w="1234"/>
-          </w:tcPr>
-          <w:p>
-            <w:r>
-              <w:rPr>
-                <w:rFonts w:ascii="Ebrima" w:hAnsi="Ebrima"/>
-              </w:rPr>
-              <w:t>0.0</w:t>
+              <w:t xml:space="preserve">5000.0 </w:t>
+            </w:r>
+          </w:p>
+        </w:tc>
+        <w:tc>
+          <w:tcPr>
+            <w:tcW w:type="dxa" w:w="1234"/>
+          </w:tcPr>
+          <w:p>
+            <w:r>
+              <w:rPr>
+                <w:rFonts w:ascii="Ebrima" w:hAnsi="Ebrima"/>
+              </w:rPr>
+              <w:t xml:space="preserve">5000.0 </w:t>
+            </w:r>
+          </w:p>
+        </w:tc>
+        <w:tc>
+          <w:tcPr>
+            <w:tcW w:type="dxa" w:w="1234"/>
+          </w:tcPr>
+          <w:p>
+            <w:r>
+              <w:rPr>
+                <w:rFonts w:ascii="Ebrima" w:hAnsi="Ebrima"/>
+              </w:rPr>
+              <w:t xml:space="preserve">0.0 </w:t>
             </w:r>
           </w:p>
         </w:tc>
@@ -7017,7 +6996,7 @@
               <w:rPr>
                 <w:rFonts w:ascii="Ebrima" w:hAnsi="Ebrima"/>
               </w:rPr>
-              <w:t>3.2.1</w:t>
+              <w:t>3.2.4</w:t>
             </w:r>
           </w:p>
         </w:tc>
@@ -7110,7 +7089,7 @@
               <w:rPr>
                 <w:rFonts w:ascii="Ebrima" w:hAnsi="Ebrima"/>
               </w:rPr>
-              <w:t>3.2.2</w:t>
+              <w:t>3.2.4</w:t>
             </w:r>
           </w:p>
         </w:tc>
@@ -7149,33 +7128,33 @@
               <w:rPr>
                 <w:rFonts w:ascii="Ebrima" w:hAnsi="Ebrima"/>
               </w:rPr>
-              <w:t>25000.0</w:t>
-            </w:r>
-          </w:p>
-        </w:tc>
-        <w:tc>
-          <w:tcPr>
-            <w:tcW w:type="dxa" w:w="1234"/>
-          </w:tcPr>
-          <w:p>
-            <w:r>
-              <w:rPr>
-                <w:rFonts w:ascii="Ebrima" w:hAnsi="Ebrima"/>
-              </w:rPr>
-              <w:t>25000.0</w:t>
-            </w:r>
-          </w:p>
-        </w:tc>
-        <w:tc>
-          <w:tcPr>
-            <w:tcW w:type="dxa" w:w="1234"/>
-          </w:tcPr>
-          <w:p>
-            <w:r>
-              <w:rPr>
-                <w:rFonts w:ascii="Ebrima" w:hAnsi="Ebrima"/>
-              </w:rPr>
-              <w:t>0.0</w:t>
+              <w:t xml:space="preserve">25000.0 </w:t>
+            </w:r>
+          </w:p>
+        </w:tc>
+        <w:tc>
+          <w:tcPr>
+            <w:tcW w:type="dxa" w:w="1234"/>
+          </w:tcPr>
+          <w:p>
+            <w:r>
+              <w:rPr>
+                <w:rFonts w:ascii="Ebrima" w:hAnsi="Ebrima"/>
+              </w:rPr>
+              <w:t xml:space="preserve">25000.0 </w:t>
+            </w:r>
+          </w:p>
+        </w:tc>
+        <w:tc>
+          <w:tcPr>
+            <w:tcW w:type="dxa" w:w="1234"/>
+          </w:tcPr>
+          <w:p>
+            <w:r>
+              <w:rPr>
+                <w:rFonts w:ascii="Ebrima" w:hAnsi="Ebrima"/>
+              </w:rPr>
+              <w:t xml:space="preserve">0.0 </w:t>
             </w:r>
           </w:p>
         </w:tc>
@@ -7203,7 +7182,7 @@
               <w:rPr>
                 <w:rFonts w:ascii="Ebrima" w:hAnsi="Ebrima"/>
               </w:rPr>
-              <w:t>3.2.3</w:t>
+              <w:t>3.2.4</w:t>
             </w:r>
           </w:p>
         </w:tc>
@@ -7242,33 +7221,33 @@
               <w:rPr>
                 <w:rFonts w:ascii="Ebrima" w:hAnsi="Ebrima"/>
               </w:rPr>
-              <w:t>48000.0</w:t>
-            </w:r>
-          </w:p>
-        </w:tc>
-        <w:tc>
-          <w:tcPr>
-            <w:tcW w:type="dxa" w:w="1234"/>
-          </w:tcPr>
-          <w:p>
-            <w:r>
-              <w:rPr>
-                <w:rFonts w:ascii="Ebrima" w:hAnsi="Ebrima"/>
-              </w:rPr>
-              <w:t>70000.0</w:t>
-            </w:r>
-          </w:p>
-        </w:tc>
-        <w:tc>
-          <w:tcPr>
-            <w:tcW w:type="dxa" w:w="1234"/>
-          </w:tcPr>
-          <w:p>
-            <w:r>
-              <w:rPr>
-                <w:rFonts w:ascii="Ebrima" w:hAnsi="Ebrima"/>
-              </w:rPr>
-              <w:t>0.0</w:t>
+              <w:t xml:space="preserve">48000.0 </w:t>
+            </w:r>
+          </w:p>
+        </w:tc>
+        <w:tc>
+          <w:tcPr>
+            <w:tcW w:type="dxa" w:w="1234"/>
+          </w:tcPr>
+          <w:p>
+            <w:r>
+              <w:rPr>
+                <w:rFonts w:ascii="Ebrima" w:hAnsi="Ebrima"/>
+              </w:rPr>
+              <w:t xml:space="preserve">70000.0 </w:t>
+            </w:r>
+          </w:p>
+        </w:tc>
+        <w:tc>
+          <w:tcPr>
+            <w:tcW w:type="dxa" w:w="1234"/>
+          </w:tcPr>
+          <w:p>
+            <w:r>
+              <w:rPr>
+                <w:rFonts w:ascii="Ebrima" w:hAnsi="Ebrima"/>
+              </w:rPr>
+              <w:t xml:space="preserve">0.0 </w:t>
             </w:r>
           </w:p>
         </w:tc>
@@ -7335,33 +7314,33 @@
               <w:rPr>
                 <w:rFonts w:ascii="Ebrima" w:hAnsi="Ebrima"/>
               </w:rPr>
-              <w:t>5000.0</w:t>
-            </w:r>
-          </w:p>
-        </w:tc>
-        <w:tc>
-          <w:tcPr>
-            <w:tcW w:type="dxa" w:w="1234"/>
-          </w:tcPr>
-          <w:p>
-            <w:r>
-              <w:rPr>
-                <w:rFonts w:ascii="Ebrima" w:hAnsi="Ebrima"/>
-              </w:rPr>
-              <w:t>5000.0</w:t>
-            </w:r>
-          </w:p>
-        </w:tc>
-        <w:tc>
-          <w:tcPr>
-            <w:tcW w:type="dxa" w:w="1234"/>
-          </w:tcPr>
-          <w:p>
-            <w:r>
-              <w:rPr>
-                <w:rFonts w:ascii="Ebrima" w:hAnsi="Ebrima"/>
-              </w:rPr>
-              <w:t>0.0</w:t>
+              <w:t xml:space="preserve">5000.0 </w:t>
+            </w:r>
+          </w:p>
+        </w:tc>
+        <w:tc>
+          <w:tcPr>
+            <w:tcW w:type="dxa" w:w="1234"/>
+          </w:tcPr>
+          <w:p>
+            <w:r>
+              <w:rPr>
+                <w:rFonts w:ascii="Ebrima" w:hAnsi="Ebrima"/>
+              </w:rPr>
+              <w:t xml:space="preserve">5000.0 </w:t>
+            </w:r>
+          </w:p>
+        </w:tc>
+        <w:tc>
+          <w:tcPr>
+            <w:tcW w:type="dxa" w:w="1234"/>
+          </w:tcPr>
+          <w:p>
+            <w:r>
+              <w:rPr>
+                <w:rFonts w:ascii="Ebrima" w:hAnsi="Ebrima"/>
+              </w:rPr>
+              <w:t xml:space="preserve">0.0 </w:t>
             </w:r>
           </w:p>
         </w:tc>
@@ -7389,7 +7368,7 @@
               <w:rPr>
                 <w:rFonts w:ascii="Ebrima" w:hAnsi="Ebrima"/>
               </w:rPr>
-              <w:t>3.2.5</w:t>
+              <w:t>3.2.4</w:t>
             </w:r>
           </w:p>
         </w:tc>
@@ -7428,33 +7407,33 @@
               <w:rPr>
                 <w:rFonts w:ascii="Ebrima" w:hAnsi="Ebrima"/>
               </w:rPr>
-              <w:t>10.0</w:t>
-            </w:r>
-          </w:p>
-        </w:tc>
-        <w:tc>
-          <w:tcPr>
-            <w:tcW w:type="dxa" w:w="1234"/>
-          </w:tcPr>
-          <w:p>
-            <w:r>
-              <w:rPr>
-                <w:rFonts w:ascii="Ebrima" w:hAnsi="Ebrima"/>
-              </w:rPr>
-              <w:t>3.0</w:t>
-            </w:r>
-          </w:p>
-        </w:tc>
-        <w:tc>
-          <w:tcPr>
-            <w:tcW w:type="dxa" w:w="1234"/>
-          </w:tcPr>
-          <w:p>
-            <w:r>
-              <w:rPr>
-                <w:rFonts w:ascii="Ebrima" w:hAnsi="Ebrima"/>
-              </w:rPr>
-              <w:t>0.0</w:t>
+              <w:t xml:space="preserve">10.0 </w:t>
+            </w:r>
+          </w:p>
+        </w:tc>
+        <w:tc>
+          <w:tcPr>
+            <w:tcW w:type="dxa" w:w="1234"/>
+          </w:tcPr>
+          <w:p>
+            <w:r>
+              <w:rPr>
+                <w:rFonts w:ascii="Ebrima" w:hAnsi="Ebrima"/>
+              </w:rPr>
+              <w:t xml:space="preserve">3.0 </w:t>
+            </w:r>
+          </w:p>
+        </w:tc>
+        <w:tc>
+          <w:tcPr>
+            <w:tcW w:type="dxa" w:w="1234"/>
+          </w:tcPr>
+          <w:p>
+            <w:r>
+              <w:rPr>
+                <w:rFonts w:ascii="Ebrima" w:hAnsi="Ebrima"/>
+              </w:rPr>
+              <w:t xml:space="preserve">0.0 </w:t>
             </w:r>
           </w:p>
         </w:tc>
@@ -7546,7 +7525,7 @@
               <w:rPr>
                 <w:rFonts w:ascii="Ebrima" w:hAnsi="Ebrima"/>
               </w:rPr>
-              <w:t>4.1.1</w:t>
+              <w:t>4.1.4</w:t>
             </w:r>
           </w:p>
         </w:tc>
@@ -7585,33 +7564,33 @@
               <w:rPr>
                 <w:rFonts w:ascii="Ebrima" w:hAnsi="Ebrima"/>
               </w:rPr>
-              <w:t>11.0</w:t>
-            </w:r>
-          </w:p>
-        </w:tc>
-        <w:tc>
-          <w:tcPr>
-            <w:tcW w:type="dxa" w:w="1234"/>
-          </w:tcPr>
-          <w:p>
-            <w:r>
-              <w:rPr>
-                <w:rFonts w:ascii="Ebrima" w:hAnsi="Ebrima"/>
-              </w:rPr>
-              <w:t>3.0</w:t>
-            </w:r>
-          </w:p>
-        </w:tc>
-        <w:tc>
-          <w:tcPr>
-            <w:tcW w:type="dxa" w:w="1234"/>
-          </w:tcPr>
-          <w:p>
-            <w:r>
-              <w:rPr>
-                <w:rFonts w:ascii="Ebrima" w:hAnsi="Ebrima"/>
-              </w:rPr>
-              <w:t>0.0</w:t>
+              <w:t xml:space="preserve">11.0 </w:t>
+            </w:r>
+          </w:p>
+        </w:tc>
+        <w:tc>
+          <w:tcPr>
+            <w:tcW w:type="dxa" w:w="1234"/>
+          </w:tcPr>
+          <w:p>
+            <w:r>
+              <w:rPr>
+                <w:rFonts w:ascii="Ebrima" w:hAnsi="Ebrima"/>
+              </w:rPr>
+              <w:t xml:space="preserve">3.0 </w:t>
+            </w:r>
+          </w:p>
+        </w:tc>
+        <w:tc>
+          <w:tcPr>
+            <w:tcW w:type="dxa" w:w="1234"/>
+          </w:tcPr>
+          <w:p>
+            <w:r>
+              <w:rPr>
+                <w:rFonts w:ascii="Ebrima" w:hAnsi="Ebrima"/>
+              </w:rPr>
+              <w:t xml:space="preserve">0.0 </w:t>
             </w:r>
           </w:p>
         </w:tc>
@@ -7639,7 +7618,7 @@
               <w:rPr>
                 <w:rFonts w:ascii="Ebrima" w:hAnsi="Ebrima"/>
               </w:rPr>
-              <w:t>4.1.2</w:t>
+              <w:t>4.1.4</w:t>
             </w:r>
           </w:p>
         </w:tc>
@@ -7678,33 +7657,33 @@
               <w:rPr>
                 <w:rFonts w:ascii="Ebrima" w:hAnsi="Ebrima"/>
               </w:rPr>
-              <w:t>8.0</w:t>
-            </w:r>
-          </w:p>
-        </w:tc>
-        <w:tc>
-          <w:tcPr>
-            <w:tcW w:type="dxa" w:w="1234"/>
-          </w:tcPr>
-          <w:p>
-            <w:r>
-              <w:rPr>
-                <w:rFonts w:ascii="Ebrima" w:hAnsi="Ebrima"/>
-              </w:rPr>
-              <w:t>6.0</w:t>
-            </w:r>
-          </w:p>
-        </w:tc>
-        <w:tc>
-          <w:tcPr>
-            <w:tcW w:type="dxa" w:w="1234"/>
-          </w:tcPr>
-          <w:p>
-            <w:r>
-              <w:rPr>
-                <w:rFonts w:ascii="Ebrima" w:hAnsi="Ebrima"/>
-              </w:rPr>
-              <w:t>0.0</w:t>
+              <w:t xml:space="preserve">8.0 </w:t>
+            </w:r>
+          </w:p>
+        </w:tc>
+        <w:tc>
+          <w:tcPr>
+            <w:tcW w:type="dxa" w:w="1234"/>
+          </w:tcPr>
+          <w:p>
+            <w:r>
+              <w:rPr>
+                <w:rFonts w:ascii="Ebrima" w:hAnsi="Ebrima"/>
+              </w:rPr>
+              <w:t xml:space="preserve">6.0 </w:t>
+            </w:r>
+          </w:p>
+        </w:tc>
+        <w:tc>
+          <w:tcPr>
+            <w:tcW w:type="dxa" w:w="1234"/>
+          </w:tcPr>
+          <w:p>
+            <w:r>
+              <w:rPr>
+                <w:rFonts w:ascii="Ebrima" w:hAnsi="Ebrima"/>
+              </w:rPr>
+              <w:t xml:space="preserve">0.0 </w:t>
             </w:r>
           </w:p>
         </w:tc>
@@ -7763,7 +7742,7 @@
               <w:rPr>
                 <w:rFonts w:ascii="Ebrima" w:hAnsi="Ebrima"/>
               </w:rPr>
-              <w:t>4.2.1</w:t>
+              <w:t>4.2.4</w:t>
             </w:r>
           </w:p>
         </w:tc>
@@ -7802,33 +7781,33 @@
               <w:rPr>
                 <w:rFonts w:ascii="Ebrima" w:hAnsi="Ebrima"/>
               </w:rPr>
-              <w:t>11.0</w:t>
-            </w:r>
-          </w:p>
-        </w:tc>
-        <w:tc>
-          <w:tcPr>
-            <w:tcW w:type="dxa" w:w="1234"/>
-          </w:tcPr>
-          <w:p>
-            <w:r>
-              <w:rPr>
-                <w:rFonts w:ascii="Ebrima" w:hAnsi="Ebrima"/>
-              </w:rPr>
-              <w:t>3.0</w:t>
-            </w:r>
-          </w:p>
-        </w:tc>
-        <w:tc>
-          <w:tcPr>
-            <w:tcW w:type="dxa" w:w="1234"/>
-          </w:tcPr>
-          <w:p>
-            <w:r>
-              <w:rPr>
-                <w:rFonts w:ascii="Ebrima" w:hAnsi="Ebrima"/>
-              </w:rPr>
-              <w:t>0.0</w:t>
+              <w:t xml:space="preserve">11.0 </w:t>
+            </w:r>
+          </w:p>
+        </w:tc>
+        <w:tc>
+          <w:tcPr>
+            <w:tcW w:type="dxa" w:w="1234"/>
+          </w:tcPr>
+          <w:p>
+            <w:r>
+              <w:rPr>
+                <w:rFonts w:ascii="Ebrima" w:hAnsi="Ebrima"/>
+              </w:rPr>
+              <w:t xml:space="preserve">3.0 </w:t>
+            </w:r>
+          </w:p>
+        </w:tc>
+        <w:tc>
+          <w:tcPr>
+            <w:tcW w:type="dxa" w:w="1234"/>
+          </w:tcPr>
+          <w:p>
+            <w:r>
+              <w:rPr>
+                <w:rFonts w:ascii="Ebrima" w:hAnsi="Ebrima"/>
+              </w:rPr>
+              <w:t xml:space="preserve">0.0 </w:t>
             </w:r>
           </w:p>
         </w:tc>
@@ -7856,7 +7835,7 @@
               <w:rPr>
                 <w:rFonts w:ascii="Ebrima" w:hAnsi="Ebrima"/>
               </w:rPr>
-              <w:t>4.2.2</w:t>
+              <w:t>4.2.4</w:t>
             </w:r>
           </w:p>
         </w:tc>
@@ -7895,33 +7874,33 @@
               <w:rPr>
                 <w:rFonts w:ascii="Ebrima" w:hAnsi="Ebrima"/>
               </w:rPr>
-              <w:t>6.0</w:t>
-            </w:r>
-          </w:p>
-        </w:tc>
-        <w:tc>
-          <w:tcPr>
-            <w:tcW w:type="dxa" w:w="1234"/>
-          </w:tcPr>
-          <w:p>
-            <w:r>
-              <w:rPr>
-                <w:rFonts w:ascii="Ebrima" w:hAnsi="Ebrima"/>
-              </w:rPr>
-              <w:t>3.0</w:t>
-            </w:r>
-          </w:p>
-        </w:tc>
-        <w:tc>
-          <w:tcPr>
-            <w:tcW w:type="dxa" w:w="1234"/>
-          </w:tcPr>
-          <w:p>
-            <w:r>
-              <w:rPr>
-                <w:rFonts w:ascii="Ebrima" w:hAnsi="Ebrima"/>
-              </w:rPr>
-              <w:t>0.0</w:t>
+              <w:t xml:space="preserve">6.0 </w:t>
+            </w:r>
+          </w:p>
+        </w:tc>
+        <w:tc>
+          <w:tcPr>
+            <w:tcW w:type="dxa" w:w="1234"/>
+          </w:tcPr>
+          <w:p>
+            <w:r>
+              <w:rPr>
+                <w:rFonts w:ascii="Ebrima" w:hAnsi="Ebrima"/>
+              </w:rPr>
+              <w:t xml:space="preserve">3.0 </w:t>
+            </w:r>
+          </w:p>
+        </w:tc>
+        <w:tc>
+          <w:tcPr>
+            <w:tcW w:type="dxa" w:w="1234"/>
+          </w:tcPr>
+          <w:p>
+            <w:r>
+              <w:rPr>
+                <w:rFonts w:ascii="Ebrima" w:hAnsi="Ebrima"/>
+              </w:rPr>
+              <w:t xml:space="preserve">0.0 </w:t>
             </w:r>
           </w:p>
         </w:tc>

</xml_diff>